<commit_message>
Actualiza informe Sumativa 1
</commit_message>
<xml_diff>
--- a/MCDI504/docs/MCDI504_S1_1_GRUPO5.docx
+++ b/MCDI504/docs/MCDI504_S1_1_GRUPO5.docx
@@ -1,6 +1,6 @@
 
 <file path=word/document.xml><?xml version="1.0" encoding="utf-8"?>
-<w:document xmlns:wpc="http://schemas.microsoft.com/office/word/2010/wordprocessingCanvas" xmlns:cx="http://schemas.microsoft.com/office/drawing/2014/chartex" xmlns:cx1="http://schemas.microsoft.com/office/drawing/2015/9/8/chartex" xmlns:cx2="http://schemas.microsoft.com/office/drawing/2015/10/21/chartex" xmlns:cx3="http://schemas.microsoft.com/office/drawing/2016/5/9/chartex" xmlns:cx4="http://schemas.microsoft.com/office/drawing/2016/5/10/chartex" xmlns:cx5="http://schemas.microsoft.com/office/drawing/2016/5/11/chartex" xmlns:cx6="http://schemas.microsoft.com/office/drawing/2016/5/12/chartex" xmlns:cx7="http://schemas.microsoft.com/office/drawing/2016/5/13/chartex" xmlns:cx8="http://schemas.microsoft.com/office/drawing/2016/5/14/chartex" xmlns:mc="http://schemas.openxmlformats.org/markup-compatibility/2006" xmlns:m="http://schemas.openxmlformats.org/officeDocument/2006/math" xmlns:aink="http://schemas.microsoft.com/office/drawing/2016/ink" xmlns:am3d="http://schemas.microsoft.com/office/drawing/2017/model3d" xmlns:oel="http://schemas.microsoft.com/office/2019/extlst" xmlns:r="http://schemas.openxmlformats.org/officeDocument/2006/relationships" xmlns:wp14="http://schemas.microsoft.com/office/word/2010/wordprocessingDrawing" xmlns:wp="http://schemas.openxmlformats.org/drawingml/2006/wordprocessingDrawing" xmlns:wpg="http://schemas.microsoft.com/office/word/2010/wordprocessingGroup" xmlns:wpi="http://schemas.microsoft.com/office/word/2010/wordprocessingInk" xmlns:wps="http://schemas.microsoft.com/office/word/2010/wordprocessingShape" xmlns:o="urn:schemas-microsoft-com:office:office" xmlns:v="urn:schemas-microsoft-com:vml" xmlns:w10="urn:schemas-microsoft-com:office:word" xmlns:w="http://schemas.openxmlformats.org/wordprocessingml/2006/main" xmlns:w14="http://schemas.microsoft.com/office/word/2010/wordml" xmlns:w15="http://schemas.microsoft.com/office/word/2012/wordml" xmlns:w16cei="http://schemas.microsoft.com/office/word/2026/wordml/cei" xmlns:w16cex="http://schemas.microsoft.com/office/word/2018/wordml/cex" xmlns:w16cid="http://schemas.microsoft.com/office/word/2016/wordml/cid" xmlns:w16="http://schemas.microsoft.com/office/word/2018/wordml" xmlns:w16sdtdh="http://schemas.microsoft.com/office/word/2020/wordml/sdtdatahash" xmlns:w16sdtfl="http://schemas.microsoft.com/office/word/2024/wordml/sdtformatlock" xmlns:w16se="http://schemas.microsoft.com/office/word/2015/wordml/symex" xmlns:w16du="http://schemas.microsoft.com/office/word/2023/wordml/word16du" xmlns:wne="http://schemas.microsoft.com/office/word/2006/wordml" mc:Ignorable="w14 w15 w16se w16cid w16 w16cex w16sdtdh w16sdtfl w16du wp14">
+<w:document xmlns:wpc="http://schemas.microsoft.com/office/word/2010/wordprocessingCanvas" xmlns:cx="http://schemas.microsoft.com/office/drawing/2014/chartex" xmlns:cx1="http://schemas.microsoft.com/office/drawing/2015/9/8/chartex" xmlns:cx2="http://schemas.microsoft.com/office/drawing/2015/10/21/chartex" xmlns:cx3="http://schemas.microsoft.com/office/drawing/2016/5/9/chartex" xmlns:cx4="http://schemas.microsoft.com/office/drawing/2016/5/10/chartex" xmlns:cx5="http://schemas.microsoft.com/office/drawing/2016/5/11/chartex" xmlns:cx6="http://schemas.microsoft.com/office/drawing/2016/5/12/chartex" xmlns:cx7="http://schemas.microsoft.com/office/drawing/2016/5/13/chartex" xmlns:cx8="http://schemas.microsoft.com/office/drawing/2016/5/14/chartex" xmlns:mc="http://schemas.openxmlformats.org/markup-compatibility/2006" xmlns:aink="http://schemas.microsoft.com/office/drawing/2016/ink" xmlns:am3d="http://schemas.microsoft.com/office/drawing/2017/model3d" xmlns:o="urn:schemas-microsoft-com:office:office" xmlns:oel="http://schemas.microsoft.com/office/2019/extlst" xmlns:r="http://schemas.openxmlformats.org/officeDocument/2006/relationships" xmlns:m="http://schemas.openxmlformats.org/officeDocument/2006/math" xmlns:v="urn:schemas-microsoft-com:vml" xmlns:wp14="http://schemas.microsoft.com/office/word/2010/wordprocessingDrawing" xmlns:wp="http://schemas.openxmlformats.org/drawingml/2006/wordprocessingDrawing" xmlns:w10="urn:schemas-microsoft-com:office:word" xmlns:w="http://schemas.openxmlformats.org/wordprocessingml/2006/main" xmlns:w14="http://schemas.microsoft.com/office/word/2010/wordml" xmlns:w15="http://schemas.microsoft.com/office/word/2012/wordml" xmlns:w16cei="http://schemas.microsoft.com/office/word/2026/wordml/cei" xmlns:w16cex="http://schemas.microsoft.com/office/word/2018/wordml/cex" xmlns:w16cid="http://schemas.microsoft.com/office/word/2016/wordml/cid" xmlns:w16="http://schemas.microsoft.com/office/word/2018/wordml" xmlns:w16du="http://schemas.microsoft.com/office/word/2023/wordml/word16du" xmlns:w16sdtdh="http://schemas.microsoft.com/office/word/2020/wordml/sdtdatahash" xmlns:w16sdtfl="http://schemas.microsoft.com/office/word/2024/wordml/sdtformatlock" xmlns:w16se="http://schemas.microsoft.com/office/word/2015/wordml/symex" xmlns:wpg="http://schemas.microsoft.com/office/word/2010/wordprocessingGroup" xmlns:wpi="http://schemas.microsoft.com/office/word/2010/wordprocessingInk" xmlns:wne="http://schemas.microsoft.com/office/word/2006/wordml" xmlns:wps="http://schemas.microsoft.com/office/word/2010/wordprocessingShape" mc:Ignorable="w14 w15 w16se w16cid w16 w16cex w16sdtdh w16sdtfl w16du wp14">
   <w:body>
     <w:p>
       <w:r>
@@ -107,19 +107,11 @@
       <w:pPr>
         <w:jc w:val="both"/>
       </w:pPr>
-      <w:proofErr w:type="spellStart"/>
       <w:r>
         <w:rPr>
           <w:b/>
         </w:rPr>
-        <w:t>Docente</w:t>
-      </w:r>
-      <w:proofErr w:type="spellEnd"/>
-      <w:r>
-        <w:rPr>
-          <w:b/>
-        </w:rPr>
-        <w:t>:</w:t>
+        <w:t>Docente:</w:t>
       </w:r>
       <w:r>
         <w:t xml:space="preserve"> D</w:t>
@@ -149,33 +141,11 @@
       <w:pPr>
         <w:jc w:val="both"/>
       </w:pPr>
-      <w:proofErr w:type="spellStart"/>
       <w:r>
         <w:rPr>
           <w:b/>
         </w:rPr>
-        <w:t>Fecha</w:t>
-      </w:r>
-      <w:proofErr w:type="spellEnd"/>
-      <w:r>
-        <w:rPr>
-          <w:b/>
-        </w:rPr>
-        <w:t xml:space="preserve"> de </w:t>
-      </w:r>
-      <w:proofErr w:type="spellStart"/>
-      <w:r>
-        <w:rPr>
-          <w:b/>
-        </w:rPr>
-        <w:t>entrega</w:t>
-      </w:r>
-      <w:proofErr w:type="spellEnd"/>
-      <w:r>
-        <w:rPr>
-          <w:b/>
-        </w:rPr>
-        <w:t>:</w:t>
+        <w:t>Fecha de entrega:</w:t>
       </w:r>
       <w:r>
         <w:t xml:space="preserve"> </w:t>
@@ -184,15 +154,7 @@
         <w:t>9</w:t>
       </w:r>
       <w:r>
-        <w:t xml:space="preserve"> de </w:t>
-      </w:r>
-      <w:proofErr w:type="spellStart"/>
-      <w:r>
-        <w:t>agosto</w:t>
-      </w:r>
-      <w:proofErr w:type="spellEnd"/>
-      <w:r>
-        <w:t xml:space="preserve"> de 2026</w:t>
+        <w:t xml:space="preserve"> de agosto de 2026</w:t>
       </w:r>
     </w:p>
     <w:p/>
@@ -348,7 +310,7 @@
     </w:p>
     <w:tbl>
       <w:tblPr>
-        <w:tblStyle w:val="TableGrid"/>
+        <w:tblStyle w:val="Tablaconcuadrcula"/>
         <w:tblW w:w="0" w:type="auto"/>
         <w:jc w:val="center"/>
         <w:tblLook w:val="04A0" w:firstRow="1" w:lastRow="0" w:firstColumn="1" w:lastColumn="0" w:noHBand="0" w:noVBand="1"/>
@@ -484,14 +446,7 @@
               <w:rPr>
                 <w:sz w:val="20"/>
               </w:rPr>
-              <w:t xml:space="preserve">Dataset AI Impact on Jobs 2030, con 3.000 observaciones, 20 cargos, variables sociolaborales, un perfil de 10 habilidades y la </w:t>
-            </w:r>
-            <w:r>
-              <w:rPr>
-                <w:sz w:val="20"/>
-              </w:rPr>
-              <w:lastRenderedPageBreak/>
-              <w:t>variable Risk_Category con tres clases.</w:t>
+              <w:t>Dataset AI Impact on Jobs 2030, con 3.000 observaciones, 20 cargos, variables sociolaborales, un perfil de 10 habilidades y la variable Risk_Category con tres clases.</w:t>
             </w:r>
           </w:p>
         </w:tc>
@@ -672,7 +627,7 @@
     </w:p>
     <w:p>
       <w:pPr>
-        <w:pStyle w:val="ListBullet"/>
+        <w:pStyle w:val="Listaconvietas"/>
         <w:spacing w:after="80"/>
       </w:pPr>
       <w:r>
@@ -681,7 +636,7 @@
     </w:p>
     <w:p>
       <w:pPr>
-        <w:pStyle w:val="ListBullet"/>
+        <w:pStyle w:val="Listaconvietas"/>
         <w:spacing w:after="80"/>
       </w:pPr>
       <w:r>
@@ -690,7 +645,7 @@
     </w:p>
     <w:p>
       <w:pPr>
-        <w:pStyle w:val="ListBullet"/>
+        <w:pStyle w:val="Listaconvietas"/>
         <w:spacing w:after="80"/>
       </w:pPr>
       <w:r>
@@ -699,7 +654,7 @@
     </w:p>
     <w:p>
       <w:pPr>
-        <w:pStyle w:val="ListBullet"/>
+        <w:pStyle w:val="Listaconvietas"/>
         <w:spacing w:after="80"/>
       </w:pPr>
       <w:r>
@@ -708,7 +663,7 @@
     </w:p>
     <w:p>
       <w:pPr>
-        <w:pStyle w:val="ListBullet"/>
+        <w:pStyle w:val="Listaconvietas"/>
         <w:spacing w:after="80"/>
       </w:pPr>
       <w:r>
@@ -717,7 +672,7 @@
     </w:p>
     <w:p>
       <w:pPr>
-        <w:pStyle w:val="ListBullet"/>
+        <w:pStyle w:val="Listaconvietas"/>
         <w:spacing w:after="80"/>
       </w:pPr>
       <w:r>
@@ -726,7 +681,7 @@
     </w:p>
     <w:p>
       <w:pPr>
-        <w:pStyle w:val="ListBullet"/>
+        <w:pStyle w:val="Listaconvietas"/>
         <w:spacing w:after="80"/>
       </w:pPr>
       <w:r>
@@ -749,7 +704,7 @@
     </w:p>
     <w:tbl>
       <w:tblPr>
-        <w:tblStyle w:val="TableGrid"/>
+        <w:tblStyle w:val="Tablaconcuadrcula"/>
         <w:tblW w:w="0" w:type="auto"/>
         <w:jc w:val="center"/>
         <w:tblLook w:val="04A0" w:firstRow="1" w:lastRow="0" w:firstColumn="1" w:lastColumn="0" w:noHBand="0" w:noVBand="1"/>
@@ -1073,7 +1028,7 @@
     </w:p>
     <w:tbl>
       <w:tblPr>
-        <w:tblStyle w:val="TableGrid"/>
+        <w:tblStyle w:val="Tablaconcuadrcula"/>
         <w:tblW w:w="0" w:type="auto"/>
         <w:jc w:val="center"/>
         <w:tblLook w:val="04A0" w:firstRow="1" w:lastRow="0" w:firstColumn="1" w:lastColumn="0" w:noHBand="0" w:noVBand="1"/>
@@ -1383,7 +1338,7 @@
     </w:p>
     <w:tbl>
       <w:tblPr>
-        <w:tblStyle w:val="TableGrid"/>
+        <w:tblStyle w:val="Tablaconcuadrcula"/>
         <w:tblW w:w="0" w:type="auto"/>
         <w:jc w:val="center"/>
         <w:tblLook w:val="04A0" w:firstRow="1" w:lastRow="0" w:firstColumn="1" w:lastColumn="0" w:noHBand="0" w:noVBand="1"/>
@@ -1534,7 +1489,6 @@
               <w:rPr>
                 <w:sz w:val="18"/>
               </w:rPr>
-              <w:lastRenderedPageBreak/>
               <w:t>No supervisado</w:t>
             </w:r>
           </w:p>
@@ -1595,6 +1549,7 @@
               <w:rPr>
                 <w:sz w:val="18"/>
               </w:rPr>
+              <w:lastRenderedPageBreak/>
               <w:t>Por refuerzo</w:t>
             </w:r>
           </w:p>
@@ -1754,7 +1709,7 @@
     </w:p>
     <w:tbl>
       <w:tblPr>
-        <w:tblStyle w:val="TableGrid"/>
+        <w:tblStyle w:val="Tablaconcuadrcula"/>
         <w:tblW w:w="0" w:type="auto"/>
         <w:jc w:val="center"/>
         <w:tblLook w:val="04A0" w:firstRow="1" w:lastRow="0" w:firstColumn="1" w:lastColumn="0" w:noHBand="0" w:noVBand="1"/>
@@ -1830,21 +1785,27 @@
               <w:rPr>
                 <w:sz w:val="18"/>
               </w:rPr>
+              <w:t>Selección de datos</w:t>
+            </w:r>
+          </w:p>
+        </w:tc>
+        <w:tc>
+          <w:tcPr>
+            <w:tcW w:w="3402" w:type="dxa"/>
+          </w:tcPr>
+          <w:p>
+            <w:r>
+              <w:rPr>
+                <w:sz w:val="18"/>
+              </w:rPr>
+              <w:t xml:space="preserve">Identificar el dataset pertinente para representar el problema de estimación </w:t>
+            </w:r>
+            <w:r>
+              <w:rPr>
+                <w:sz w:val="18"/>
+              </w:rPr>
               <w:lastRenderedPageBreak/>
-              <w:t>Selección de datos</w:t>
-            </w:r>
-          </w:p>
-        </w:tc>
-        <w:tc>
-          <w:tcPr>
-            <w:tcW w:w="3402" w:type="dxa"/>
-          </w:tcPr>
-          <w:p>
-            <w:r>
-              <w:rPr>
-                <w:sz w:val="18"/>
-              </w:rPr>
-              <w:t>Identificar el dataset pertinente para representar el problema de estimación de riesgo de automatización.</w:t>
+              <w:t>de riesgo de automatización.</w:t>
             </w:r>
           </w:p>
         </w:tc>
@@ -1857,7 +1818,15 @@
               <w:rPr>
                 <w:sz w:val="18"/>
               </w:rPr>
-              <w:t>Carga de AI_Impact_on_Jobs_2030.csv y creación de bbdd1 con 3.000 filas y 18 columnas.</w:t>
+              <w:lastRenderedPageBreak/>
+              <w:t xml:space="preserve">Carga de AI_Impact_on_Jobs_2030.csv y </w:t>
+            </w:r>
+            <w:r>
+              <w:rPr>
+                <w:sz w:val="18"/>
+              </w:rPr>
+              <w:lastRenderedPageBreak/>
+              <w:t>creación de bbdd1 con 3.000 filas y 18 columnas.</w:t>
             </w:r>
           </w:p>
         </w:tc>
@@ -1876,6 +1845,7 @@
               <w:rPr>
                 <w:sz w:val="18"/>
               </w:rPr>
+              <w:lastRenderedPageBreak/>
               <w:t>Preprocesamiento</w:t>
             </w:r>
           </w:p>
@@ -2096,12 +2066,12 @@
           <w:color w:val="1F3864"/>
           <w:sz w:val="26"/>
         </w:rPr>
-        <w:t>6.1 Estructura sugerida del notebook</w:t>
+        <w:t>6.1 Estructura del notebook</w:t>
       </w:r>
     </w:p>
     <w:tbl>
       <w:tblPr>
-        <w:tblStyle w:val="TableGrid"/>
+        <w:tblStyle w:val="Tablaconcuadrcula"/>
         <w:tblW w:w="0" w:type="auto"/>
         <w:jc w:val="center"/>
         <w:tblLook w:val="04A0" w:firstRow="1" w:lastRow="0" w:firstColumn="1" w:lastColumn="0" w:noHBand="0" w:noVBand="1"/>
@@ -2113,6 +2083,7 @@
       </w:tblGrid>
       <w:tr>
         <w:trPr>
+          <w:tblHeader/>
           <w:jc w:val="center"/>
         </w:trPr>
         <w:tc>
@@ -2121,11 +2092,20 @@
             <w:shd w:val="clear" w:color="auto" w:fill="1F3864"/>
           </w:tcPr>
           <w:p>
+            <w:pPr>
+              <w:rPr>
+                <w:sz w:val="18"/>
+                <w:szCs w:val="18"/>
+                <w:lang w:val="es-CL"/>
+              </w:rPr>
+            </w:pPr>
             <w:r>
               <w:rPr>
                 <w:b/>
                 <w:color w:val="FFFFFF"/>
-                <w:sz w:val="19"/>
+                <w:sz w:val="18"/>
+                <w:szCs w:val="18"/>
+                <w:lang w:val="es-CL"/>
               </w:rPr>
               <w:t>Celda / bloque</w:t>
             </w:r>
@@ -2137,11 +2117,20 @@
             <w:shd w:val="clear" w:color="auto" w:fill="1F3864"/>
           </w:tcPr>
           <w:p>
+            <w:pPr>
+              <w:rPr>
+                <w:sz w:val="18"/>
+                <w:szCs w:val="18"/>
+                <w:lang w:val="es-CL"/>
+              </w:rPr>
+            </w:pPr>
             <w:r>
               <w:rPr>
                 <w:b/>
                 <w:color w:val="FFFFFF"/>
-                <w:sz w:val="19"/>
+                <w:sz w:val="18"/>
+                <w:szCs w:val="18"/>
+                <w:lang w:val="es-CL"/>
               </w:rPr>
               <w:t>Propósito</w:t>
             </w:r>
@@ -2153,11 +2142,20 @@
             <w:shd w:val="clear" w:color="auto" w:fill="1F3864"/>
           </w:tcPr>
           <w:p>
+            <w:pPr>
+              <w:rPr>
+                <w:sz w:val="18"/>
+                <w:szCs w:val="18"/>
+                <w:lang w:val="es-CL"/>
+              </w:rPr>
+            </w:pPr>
             <w:r>
               <w:rPr>
                 <w:b/>
                 <w:color w:val="FFFFFF"/>
-                <w:sz w:val="19"/>
+                <w:sz w:val="18"/>
+                <w:szCs w:val="18"/>
+                <w:lang w:val="es-CL"/>
               </w:rPr>
               <w:t>Resultado esperado</w:t>
             </w:r>
@@ -2173,11 +2171,20 @@
             <w:tcW w:w="2268" w:type="dxa"/>
           </w:tcPr>
           <w:p>
-            <w:r>
-              <w:rPr>
-                <w:sz w:val="18"/>
-              </w:rPr>
-              <w:t>1. Portada y contexto</w:t>
+            <w:pPr>
+              <w:rPr>
+                <w:sz w:val="18"/>
+                <w:szCs w:val="18"/>
+                <w:lang w:val="es-CL"/>
+              </w:rPr>
+            </w:pPr>
+            <w:r>
+              <w:rPr>
+                <w:sz w:val="18"/>
+                <w:szCs w:val="18"/>
+                <w:lang w:val="es-CL"/>
+              </w:rPr>
+              <w:t>1. Contexto y definición del problema</w:t>
             </w:r>
           </w:p>
         </w:tc>
@@ -2186,11 +2193,20 @@
             <w:tcW w:w="3175" w:type="dxa"/>
           </w:tcPr>
           <w:p>
-            <w:r>
-              <w:rPr>
-                <w:sz w:val="18"/>
-              </w:rPr>
-              <w:t>Describir el problema NextWork Advisory y el objetivo exploratorio.</w:t>
+            <w:pPr>
+              <w:rPr>
+                <w:sz w:val="18"/>
+                <w:szCs w:val="18"/>
+                <w:lang w:val="es-CL"/>
+              </w:rPr>
+            </w:pPr>
+            <w:r>
+              <w:rPr>
+                <w:sz w:val="18"/>
+                <w:szCs w:val="18"/>
+                <w:lang w:val="es-CL"/>
+              </w:rPr>
+              <w:t>Documentar el caso NextWork Advisory, la situación de análisis y el objetivo del proyecto.</w:t>
             </w:r>
           </w:p>
         </w:tc>
@@ -2199,11 +2215,20 @@
             <w:tcW w:w="3061" w:type="dxa"/>
           </w:tcPr>
           <w:p>
-            <w:r>
-              <w:rPr>
-                <w:sz w:val="18"/>
-              </w:rPr>
-              <w:t>Notebook documentado con narrativa inicial e identificación del equipo.</w:t>
+            <w:pPr>
+              <w:rPr>
+                <w:sz w:val="18"/>
+                <w:szCs w:val="18"/>
+                <w:lang w:val="es-CL"/>
+              </w:rPr>
+            </w:pPr>
+            <w:r>
+              <w:rPr>
+                <w:sz w:val="18"/>
+                <w:szCs w:val="18"/>
+                <w:lang w:val="es-CL"/>
+              </w:rPr>
+              <w:t>Narrativa inicial e identificación del equipo.</w:t>
             </w:r>
           </w:p>
         </w:tc>
@@ -2218,9 +2243,18 @@
             <w:shd w:val="clear" w:color="auto" w:fill="EEF1F7"/>
           </w:tcPr>
           <w:p>
-            <w:r>
-              <w:rPr>
-                <w:sz w:val="18"/>
+            <w:pPr>
+              <w:rPr>
+                <w:sz w:val="18"/>
+                <w:szCs w:val="18"/>
+                <w:lang w:val="es-CL"/>
+              </w:rPr>
+            </w:pPr>
+            <w:r>
+              <w:rPr>
+                <w:sz w:val="18"/>
+                <w:szCs w:val="18"/>
+                <w:lang w:val="es-CL"/>
               </w:rPr>
               <w:t>2. Librerías necesarias</w:t>
             </w:r>
@@ -2232,11 +2266,20 @@
             <w:shd w:val="clear" w:color="auto" w:fill="EEF1F7"/>
           </w:tcPr>
           <w:p>
-            <w:r>
-              <w:rPr>
-                <w:sz w:val="18"/>
-              </w:rPr>
-              <w:t>Asegurar disponibilidad de librerías.</w:t>
+            <w:pPr>
+              <w:rPr>
+                <w:sz w:val="18"/>
+                <w:szCs w:val="18"/>
+                <w:lang w:val="es-CL"/>
+              </w:rPr>
+            </w:pPr>
+            <w:r>
+              <w:rPr>
+                <w:sz w:val="18"/>
+                <w:szCs w:val="18"/>
+                <w:lang w:val="es-CL"/>
+              </w:rPr>
+              <w:t>Importar pandas, numpy, seaborn, matplotlib, MinMaxScaler y pearsonr.</w:t>
             </w:r>
           </w:p>
         </w:tc>
@@ -2246,11 +2289,20 @@
             <w:shd w:val="clear" w:color="auto" w:fill="EEF1F7"/>
           </w:tcPr>
           <w:p>
-            <w:r>
-              <w:rPr>
-                <w:sz w:val="18"/>
-              </w:rPr>
-              <w:t>Entorno con pandas, numpy, matplotlib, seaborn, scikit-learn y scipy.</w:t>
+            <w:pPr>
+              <w:rPr>
+                <w:sz w:val="18"/>
+                <w:szCs w:val="18"/>
+                <w:lang w:val="es-CL"/>
+              </w:rPr>
+            </w:pPr>
+            <w:r>
+              <w:rPr>
+                <w:sz w:val="18"/>
+                <w:szCs w:val="18"/>
+                <w:lang w:val="es-CL"/>
+              </w:rPr>
+              <w:t>Entorno cargado, sin salida en pantalla.</w:t>
             </w:r>
           </w:p>
         </w:tc>
@@ -2264,11 +2316,20 @@
             <w:tcW w:w="2268" w:type="dxa"/>
           </w:tcPr>
           <w:p>
-            <w:r>
-              <w:rPr>
-                <w:sz w:val="18"/>
-              </w:rPr>
-              <w:t>3. Carga de datos</w:t>
+            <w:pPr>
+              <w:rPr>
+                <w:sz w:val="18"/>
+                <w:szCs w:val="18"/>
+                <w:lang w:val="es-CL"/>
+              </w:rPr>
+            </w:pPr>
+            <w:r>
+              <w:rPr>
+                <w:sz w:val="18"/>
+                <w:szCs w:val="18"/>
+                <w:lang w:val="es-CL"/>
+              </w:rPr>
+              <w:t>3. Carga de la base de datos</w:t>
             </w:r>
           </w:p>
         </w:tc>
@@ -2277,11 +2338,20 @@
             <w:tcW w:w="3175" w:type="dxa"/>
           </w:tcPr>
           <w:p>
-            <w:r>
-              <w:rPr>
-                <w:sz w:val="18"/>
-              </w:rPr>
-              <w:t>Construir bbdd1 desde el archivo CSV.</w:t>
+            <w:pPr>
+              <w:rPr>
+                <w:sz w:val="18"/>
+                <w:szCs w:val="18"/>
+                <w:lang w:val="es-CL"/>
+              </w:rPr>
+            </w:pPr>
+            <w:r>
+              <w:rPr>
+                <w:sz w:val="18"/>
+                <w:szCs w:val="18"/>
+                <w:lang w:val="es-CL"/>
+              </w:rPr>
+              <w:t>Construir bbdd1 desde AI_Impact_on_Jobs_2030.csv.</w:t>
             </w:r>
           </w:p>
         </w:tc>
@@ -2290,11 +2360,20 @@
             <w:tcW w:w="3061" w:type="dxa"/>
           </w:tcPr>
           <w:p>
-            <w:r>
-              <w:rPr>
-                <w:sz w:val="18"/>
-              </w:rPr>
-              <w:t>DataFrame con 3.000 filas y 18 columnas.</w:t>
+            <w:pPr>
+              <w:rPr>
+                <w:sz w:val="18"/>
+                <w:szCs w:val="18"/>
+                <w:lang w:val="es-CL"/>
+              </w:rPr>
+            </w:pPr>
+            <w:r>
+              <w:rPr>
+                <w:sz w:val="18"/>
+                <w:szCs w:val="18"/>
+                <w:lang w:val="es-CL"/>
+              </w:rPr>
+              <w:t>DataFrame de 3.000 filas y 18 columnas.</w:t>
             </w:r>
           </w:p>
         </w:tc>
@@ -2309,11 +2388,20 @@
             <w:shd w:val="clear" w:color="auto" w:fill="EEF1F7"/>
           </w:tcPr>
           <w:p>
-            <w:r>
-              <w:rPr>
-                <w:sz w:val="18"/>
-              </w:rPr>
-              <w:t>4. Estadística descriptiva</w:t>
+            <w:pPr>
+              <w:rPr>
+                <w:sz w:val="18"/>
+                <w:szCs w:val="18"/>
+                <w:lang w:val="es-CL"/>
+              </w:rPr>
+            </w:pPr>
+            <w:r>
+              <w:rPr>
+                <w:sz w:val="18"/>
+                <w:szCs w:val="18"/>
+                <w:lang w:val="es-CL"/>
+              </w:rPr>
+              <w:t>4. Análisis descriptivo inicial</w:t>
             </w:r>
           </w:p>
         </w:tc>
@@ -2323,11 +2411,20 @@
             <w:shd w:val="clear" w:color="auto" w:fill="EEF1F7"/>
           </w:tcPr>
           <w:p>
-            <w:r>
-              <w:rPr>
-                <w:sz w:val="18"/>
-              </w:rPr>
-              <w:t>Revisar estructura, tipos de datos y medidas resumen.</w:t>
+            <w:pPr>
+              <w:rPr>
+                <w:sz w:val="18"/>
+                <w:szCs w:val="18"/>
+                <w:lang w:val="es-CL"/>
+              </w:rPr>
+            </w:pPr>
+            <w:r>
+              <w:rPr>
+                <w:sz w:val="18"/>
+                <w:szCs w:val="18"/>
+                <w:lang w:val="es-CL"/>
+              </w:rPr>
+              <w:t>Revisar estructura, tipos y medidas resumen; frecuencias de Job_Title, Education_Level y Risk_Category; conteo de nulos.</w:t>
             </w:r>
           </w:p>
         </w:tc>
@@ -2337,11 +2434,20 @@
             <w:shd w:val="clear" w:color="auto" w:fill="EEF1F7"/>
           </w:tcPr>
           <w:p>
-            <w:r>
-              <w:rPr>
-                <w:sz w:val="18"/>
-              </w:rPr>
-              <w:t>Resumen estadístico y verificación de datos completos.</w:t>
+            <w:pPr>
+              <w:rPr>
+                <w:sz w:val="18"/>
+                <w:szCs w:val="18"/>
+                <w:lang w:val="es-CL"/>
+              </w:rPr>
+            </w:pPr>
+            <w:r>
+              <w:rPr>
+                <w:sz w:val="18"/>
+                <w:szCs w:val="18"/>
+                <w:lang w:val="es-CL"/>
+              </w:rPr>
+              <w:t>Salidas de describe(), info() y value_counts(); cero valores nulos.</w:t>
             </w:r>
           </w:p>
         </w:tc>
@@ -2355,11 +2461,20 @@
             <w:tcW w:w="2268" w:type="dxa"/>
           </w:tcPr>
           <w:p>
-            <w:r>
-              <w:rPr>
-                <w:sz w:val="18"/>
-              </w:rPr>
-              <w:t>5. Visualización inicial</w:t>
+            <w:pPr>
+              <w:rPr>
+                <w:sz w:val="18"/>
+                <w:szCs w:val="18"/>
+                <w:lang w:val="es-CL"/>
+              </w:rPr>
+            </w:pPr>
+            <w:r>
+              <w:rPr>
+                <w:sz w:val="18"/>
+                <w:szCs w:val="18"/>
+                <w:lang w:val="es-CL"/>
+              </w:rPr>
+              <w:t>5. Visualización de la distribución con boxplot</w:t>
             </w:r>
           </w:p>
         </w:tc>
@@ -2368,11 +2483,20 @@
             <w:tcW w:w="3175" w:type="dxa"/>
           </w:tcPr>
           <w:p>
-            <w:r>
-              <w:rPr>
-                <w:sz w:val="18"/>
-              </w:rPr>
-              <w:t>Analizar distribución y posibles valores atípicos.</w:t>
+            <w:pPr>
+              <w:rPr>
+                <w:sz w:val="18"/>
+                <w:szCs w:val="18"/>
+                <w:lang w:val="es-CL"/>
+              </w:rPr>
+            </w:pPr>
+            <w:r>
+              <w:rPr>
+                <w:sz w:val="18"/>
+                <w:szCs w:val="18"/>
+                <w:lang w:val="es-CL"/>
+              </w:rPr>
+              <w:t>Analizar distribución y posibles valores atípicos, separando las variables por escala.</w:t>
             </w:r>
           </w:p>
         </w:tc>
@@ -2381,11 +2505,20 @@
             <w:tcW w:w="3061" w:type="dxa"/>
           </w:tcPr>
           <w:p>
-            <w:r>
-              <w:rPr>
-                <w:sz w:val="18"/>
-              </w:rPr>
-              <w:t>Boxplots de variables en escala original y de índices/habilidades.</w:t>
+            <w:pPr>
+              <w:rPr>
+                <w:sz w:val="18"/>
+                <w:szCs w:val="18"/>
+                <w:lang w:val="es-CL"/>
+              </w:rPr>
+            </w:pPr>
+            <w:r>
+              <w:rPr>
+                <w:sz w:val="18"/>
+                <w:szCs w:val="18"/>
+                <w:lang w:val="es-CL"/>
+              </w:rPr>
+              <w:t>Dos boxplots guardados en figures/.</w:t>
             </w:r>
           </w:p>
         </w:tc>
@@ -2400,11 +2533,20 @@
             <w:shd w:val="clear" w:color="auto" w:fill="EEF1F7"/>
           </w:tcPr>
           <w:p>
-            <w:r>
-              <w:rPr>
-                <w:sz w:val="18"/>
-              </w:rPr>
-              <w:t>6. Codificación de variables ordinales</w:t>
+            <w:pPr>
+              <w:rPr>
+                <w:sz w:val="18"/>
+                <w:szCs w:val="18"/>
+                <w:lang w:val="es-CL"/>
+              </w:rPr>
+            </w:pPr>
+            <w:r>
+              <w:rPr>
+                <w:sz w:val="18"/>
+                <w:szCs w:val="18"/>
+                <w:lang w:val="es-CL"/>
+              </w:rPr>
+              <w:t>6. Transformación de variables categóricas ordinales</w:t>
             </w:r>
           </w:p>
         </w:tc>
@@ -2414,11 +2556,20 @@
             <w:shd w:val="clear" w:color="auto" w:fill="EEF1F7"/>
           </w:tcPr>
           <w:p>
-            <w:r>
-              <w:rPr>
-                <w:sz w:val="18"/>
-              </w:rPr>
-              <w:t>Crear bbdd2 para análisis numérico de correlación.</w:t>
+            <w:pPr>
+              <w:rPr>
+                <w:sz w:val="18"/>
+                <w:szCs w:val="18"/>
+                <w:lang w:val="es-CL"/>
+              </w:rPr>
+            </w:pPr>
+            <w:r>
+              <w:rPr>
+                <w:sz w:val="18"/>
+                <w:szCs w:val="18"/>
+                <w:lang w:val="es-CL"/>
+              </w:rPr>
+              <w:t>Codificar Risk_Category y Education_Level respetando su orden natural.</w:t>
             </w:r>
           </w:p>
         </w:tc>
@@ -2428,11 +2579,20 @@
             <w:shd w:val="clear" w:color="auto" w:fill="EEF1F7"/>
           </w:tcPr>
           <w:p>
-            <w:r>
-              <w:rPr>
-                <w:sz w:val="18"/>
-              </w:rPr>
-              <w:t>Risk_Category y Education_Level codificadas respetando su orden.</w:t>
+            <w:pPr>
+              <w:rPr>
+                <w:sz w:val="18"/>
+                <w:szCs w:val="18"/>
+                <w:lang w:val="es-CL"/>
+              </w:rPr>
+            </w:pPr>
+            <w:r>
+              <w:rPr>
+                <w:sz w:val="18"/>
+                <w:szCs w:val="18"/>
+                <w:lang w:val="es-CL"/>
+              </w:rPr>
+              <w:t>bbdd2 con Risk_Category_Num y Education_Level_Num (20 columnas).</w:t>
             </w:r>
           </w:p>
         </w:tc>
@@ -2446,11 +2606,20 @@
             <w:tcW w:w="2268" w:type="dxa"/>
           </w:tcPr>
           <w:p>
-            <w:r>
-              <w:rPr>
-                <w:sz w:val="18"/>
-              </w:rPr>
-              <w:t>7. Correlación de Pearson</w:t>
+            <w:pPr>
+              <w:rPr>
+                <w:sz w:val="18"/>
+                <w:szCs w:val="18"/>
+                <w:lang w:val="es-CL"/>
+              </w:rPr>
+            </w:pPr>
+            <w:r>
+              <w:rPr>
+                <w:sz w:val="18"/>
+                <w:szCs w:val="18"/>
+                <w:lang w:val="es-CL"/>
+              </w:rPr>
+              <w:t>7. Matriz de correlación de Pearson</w:t>
             </w:r>
           </w:p>
         </w:tc>
@@ -2459,11 +2628,20 @@
             <w:tcW w:w="3175" w:type="dxa"/>
           </w:tcPr>
           <w:p>
-            <w:r>
-              <w:rPr>
-                <w:sz w:val="18"/>
-              </w:rPr>
-              <w:t>Identificar asociaciones lineales entre variables.</w:t>
+            <w:pPr>
+              <w:rPr>
+                <w:sz w:val="18"/>
+                <w:szCs w:val="18"/>
+                <w:lang w:val="es-CL"/>
+              </w:rPr>
+            </w:pPr>
+            <w:r>
+              <w:rPr>
+                <w:sz w:val="18"/>
+                <w:szCs w:val="18"/>
+                <w:lang w:val="es-CL"/>
+              </w:rPr>
+              <w:t>Identificar asociaciones lineales entre las 17 variables numéricas.</w:t>
             </w:r>
           </w:p>
         </w:tc>
@@ -2472,9 +2650,18 @@
             <w:tcW w:w="3061" w:type="dxa"/>
           </w:tcPr>
           <w:p>
-            <w:r>
-              <w:rPr>
-                <w:sz w:val="18"/>
+            <w:pPr>
+              <w:rPr>
+                <w:sz w:val="18"/>
+                <w:szCs w:val="18"/>
+                <w:lang w:val="es-CL"/>
+              </w:rPr>
+            </w:pPr>
+            <w:r>
+              <w:rPr>
+                <w:sz w:val="18"/>
+                <w:szCs w:val="18"/>
+                <w:lang w:val="es-CL"/>
               </w:rPr>
               <w:t>Matriz de correlación y mapa de calor.</w:t>
             </w:r>
@@ -2491,11 +2678,20 @@
             <w:shd w:val="clear" w:color="auto" w:fill="EEF1F7"/>
           </w:tcPr>
           <w:p>
-            <w:r>
-              <w:rPr>
-                <w:sz w:val="18"/>
-              </w:rPr>
-              <w:t>8. P-valores</w:t>
+            <w:pPr>
+              <w:rPr>
+                <w:sz w:val="18"/>
+                <w:szCs w:val="18"/>
+                <w:lang w:val="es-CL"/>
+              </w:rPr>
+            </w:pPr>
+            <w:r>
+              <w:rPr>
+                <w:sz w:val="18"/>
+                <w:szCs w:val="18"/>
+                <w:lang w:val="es-CL"/>
+              </w:rPr>
+              <w:t>8. Matriz de p-valores</w:t>
             </w:r>
           </w:p>
         </w:tc>
@@ -2505,11 +2701,20 @@
             <w:shd w:val="clear" w:color="auto" w:fill="EEF1F7"/>
           </w:tcPr>
           <w:p>
-            <w:r>
-              <w:rPr>
-                <w:sz w:val="18"/>
-              </w:rPr>
-              <w:t>Evaluar significancia estadística de correlaciones.</w:t>
+            <w:pPr>
+              <w:rPr>
+                <w:sz w:val="18"/>
+                <w:szCs w:val="18"/>
+                <w:lang w:val="es-CL"/>
+              </w:rPr>
+            </w:pPr>
+            <w:r>
+              <w:rPr>
+                <w:sz w:val="18"/>
+                <w:szCs w:val="18"/>
+                <w:lang w:val="es-CL"/>
+              </w:rPr>
+              <w:t>Evaluar la significancia estadística de las correlaciones obtenidas.</w:t>
             </w:r>
           </w:p>
         </w:tc>
@@ -2519,11 +2724,20 @@
             <w:shd w:val="clear" w:color="auto" w:fill="EEF1F7"/>
           </w:tcPr>
           <w:p>
-            <w:r>
-              <w:rPr>
-                <w:sz w:val="18"/>
-              </w:rPr>
-              <w:t>Matriz de p-valores e interpretación.</w:t>
+            <w:pPr>
+              <w:rPr>
+                <w:sz w:val="18"/>
+                <w:szCs w:val="18"/>
+                <w:lang w:val="es-CL"/>
+              </w:rPr>
+            </w:pPr>
+            <w:r>
+              <w:rPr>
+                <w:sz w:val="18"/>
+                <w:szCs w:val="18"/>
+                <w:lang w:val="es-CL"/>
+              </w:rPr>
+              <w:t>Matriz de p-valores y mapa de calor.</w:t>
             </w:r>
           </w:p>
         </w:tc>
@@ -2537,11 +2751,20 @@
             <w:tcW w:w="2268" w:type="dxa"/>
           </w:tcPr>
           <w:p>
-            <w:r>
-              <w:rPr>
-                <w:sz w:val="18"/>
-              </w:rPr>
-              <w:t>9. Normalización</w:t>
+            <w:pPr>
+              <w:rPr>
+                <w:sz w:val="18"/>
+                <w:szCs w:val="18"/>
+                <w:lang w:val="es-CL"/>
+              </w:rPr>
+            </w:pPr>
+            <w:r>
+              <w:rPr>
+                <w:sz w:val="18"/>
+                <w:szCs w:val="18"/>
+                <w:lang w:val="es-CL"/>
+              </w:rPr>
+              <w:t>9. Normalización de datos</w:t>
             </w:r>
           </w:p>
         </w:tc>
@@ -2550,11 +2773,20 @@
             <w:tcW w:w="3175" w:type="dxa"/>
           </w:tcPr>
           <w:p>
-            <w:r>
-              <w:rPr>
-                <w:sz w:val="18"/>
-              </w:rPr>
-              <w:t>Escalar variables de entrada a rango 0-1.</w:t>
+            <w:pPr>
+              <w:rPr>
+                <w:sz w:val="18"/>
+                <w:szCs w:val="18"/>
+                <w:lang w:val="es-CL"/>
+              </w:rPr>
+            </w:pPr>
+            <w:r>
+              <w:rPr>
+                <w:sz w:val="18"/>
+                <w:szCs w:val="18"/>
+                <w:lang w:val="es-CL"/>
+              </w:rPr>
+              <w:t>Escalar las variables de entrada al rango 0-1 mediante MinMaxScaler.</w:t>
             </w:r>
           </w:p>
         </w:tc>
@@ -2563,11 +2795,20 @@
             <w:tcW w:w="3061" w:type="dxa"/>
           </w:tcPr>
           <w:p>
-            <w:r>
-              <w:rPr>
-                <w:sz w:val="18"/>
-              </w:rPr>
-              <w:t>bbdd_norm_completa con variables normalizadas y Risk_Category categórica.</w:t>
+            <w:pPr>
+              <w:rPr>
+                <w:sz w:val="18"/>
+                <w:szCs w:val="18"/>
+                <w:lang w:val="es-CL"/>
+              </w:rPr>
+            </w:pPr>
+            <w:r>
+              <w:rPr>
+                <w:sz w:val="18"/>
+                <w:szCs w:val="18"/>
+                <w:lang w:val="es-CL"/>
+              </w:rPr>
+              <w:t>bbdd_norm con 14 variables normalizadas.</w:t>
             </w:r>
           </w:p>
         </w:tc>
@@ -2582,11 +2823,20 @@
             <w:shd w:val="clear" w:color="auto" w:fill="EEF1F7"/>
           </w:tcPr>
           <w:p>
-            <w:r>
-              <w:rPr>
-                <w:sz w:val="18"/>
-              </w:rPr>
-              <w:t>10. Relación con KDD y síntesis</w:t>
+            <w:pPr>
+              <w:rPr>
+                <w:sz w:val="18"/>
+                <w:szCs w:val="18"/>
+                <w:lang w:val="es-CL"/>
+              </w:rPr>
+            </w:pPr>
+            <w:r>
+              <w:rPr>
+                <w:sz w:val="18"/>
+                <w:szCs w:val="18"/>
+                <w:lang w:val="es-CL"/>
+              </w:rPr>
+              <w:t>10. Base de datos normalizada completa</w:t>
             </w:r>
           </w:p>
         </w:tc>
@@ -2596,11 +2846,20 @@
             <w:shd w:val="clear" w:color="auto" w:fill="EEF1F7"/>
           </w:tcPr>
           <w:p>
-            <w:r>
-              <w:rPr>
-                <w:sz w:val="18"/>
-              </w:rPr>
-              <w:t>Relacionar hallazgos con la selección del enfoque de aprendizaje.</w:t>
+            <w:pPr>
+              <w:rPr>
+                <w:sz w:val="18"/>
+                <w:szCs w:val="18"/>
+                <w:lang w:val="es-CL"/>
+              </w:rPr>
+            </w:pPr>
+            <w:r>
+              <w:rPr>
+                <w:sz w:val="18"/>
+                <w:szCs w:val="18"/>
+                <w:lang w:val="es-CL"/>
+              </w:rPr>
+              <w:t>Reintegrar Job_Title y Risk_Category a las variables normalizadas.</w:t>
             </w:r>
           </w:p>
         </w:tc>
@@ -2610,11 +2869,310 @@
             <w:shd w:val="clear" w:color="auto" w:fill="EEF1F7"/>
           </w:tcPr>
           <w:p>
-            <w:r>
-              <w:rPr>
-                <w:sz w:val="18"/>
-              </w:rPr>
-              <w:t>Conclusión técnica para avanzar a fases posteriores.</w:t>
+            <w:pPr>
+              <w:rPr>
+                <w:sz w:val="18"/>
+                <w:szCs w:val="18"/>
+                <w:lang w:val="es-CL"/>
+              </w:rPr>
+            </w:pPr>
+            <w:r>
+              <w:rPr>
+                <w:sz w:val="18"/>
+                <w:szCs w:val="18"/>
+                <w:lang w:val="es-CL"/>
+              </w:rPr>
+              <w:t>bbdd_norm_completa con primeras filas y resumen estadístico.</w:t>
+            </w:r>
+          </w:p>
+        </w:tc>
+      </w:tr>
+      <w:tr>
+        <w:trPr>
+          <w:jc w:val="center"/>
+        </w:trPr>
+        <w:tc>
+          <w:tcPr>
+            <w:tcW w:w="2268" w:type="dxa"/>
+          </w:tcPr>
+          <w:p>
+            <w:pPr>
+              <w:rPr>
+                <w:sz w:val="18"/>
+                <w:szCs w:val="18"/>
+                <w:lang w:val="es-CL"/>
+              </w:rPr>
+            </w:pPr>
+            <w:r>
+              <w:rPr>
+                <w:sz w:val="18"/>
+                <w:szCs w:val="18"/>
+                <w:lang w:val="es-CL"/>
+              </w:rPr>
+              <w:t>11. Relación con la metodología KDD</w:t>
+            </w:r>
+          </w:p>
+        </w:tc>
+        <w:tc>
+          <w:tcPr>
+            <w:tcW w:w="3175" w:type="dxa"/>
+          </w:tcPr>
+          <w:p>
+            <w:pPr>
+              <w:rPr>
+                <w:sz w:val="18"/>
+                <w:szCs w:val="18"/>
+                <w:lang w:val="es-CL"/>
+              </w:rPr>
+            </w:pPr>
+            <w:r>
+              <w:rPr>
+                <w:sz w:val="18"/>
+                <w:szCs w:val="18"/>
+                <w:lang w:val="es-CL"/>
+              </w:rPr>
+              <w:t>Asociar cada bloque del notebook a una etapa del proceso KDD.</w:t>
+            </w:r>
+          </w:p>
+        </w:tc>
+        <w:tc>
+          <w:tcPr>
+            <w:tcW w:w="3061" w:type="dxa"/>
+          </w:tcPr>
+          <w:p>
+            <w:pPr>
+              <w:rPr>
+                <w:sz w:val="18"/>
+                <w:szCs w:val="18"/>
+                <w:lang w:val="es-CL"/>
+              </w:rPr>
+            </w:pPr>
+            <w:r>
+              <w:rPr>
+                <w:sz w:val="18"/>
+                <w:szCs w:val="18"/>
+                <w:lang w:val="es-CL"/>
+              </w:rPr>
+              <w:t>Esquema de las cinco etapas con su correspondencia.</w:t>
+            </w:r>
+          </w:p>
+        </w:tc>
+      </w:tr>
+      <w:tr>
+        <w:trPr>
+          <w:jc w:val="center"/>
+        </w:trPr>
+        <w:tc>
+          <w:tcPr>
+            <w:tcW w:w="2268" w:type="dxa"/>
+            <w:shd w:val="clear" w:color="auto" w:fill="EEF1F7"/>
+          </w:tcPr>
+          <w:p>
+            <w:pPr>
+              <w:rPr>
+                <w:sz w:val="18"/>
+                <w:szCs w:val="18"/>
+                <w:lang w:val="es-CL"/>
+              </w:rPr>
+            </w:pPr>
+            <w:r>
+              <w:rPr>
+                <w:sz w:val="18"/>
+                <w:szCs w:val="18"/>
+                <w:lang w:val="es-CL"/>
+              </w:rPr>
+              <w:t>12. Clasificación del tipo de aprendizaje</w:t>
+            </w:r>
+          </w:p>
+        </w:tc>
+        <w:tc>
+          <w:tcPr>
+            <w:tcW w:w="3175" w:type="dxa"/>
+            <w:shd w:val="clear" w:color="auto" w:fill="EEF1F7"/>
+          </w:tcPr>
+          <w:p>
+            <w:pPr>
+              <w:rPr>
+                <w:sz w:val="18"/>
+                <w:szCs w:val="18"/>
+                <w:lang w:val="es-CL"/>
+              </w:rPr>
+            </w:pPr>
+            <w:r>
+              <w:rPr>
+                <w:sz w:val="18"/>
+                <w:szCs w:val="18"/>
+                <w:lang w:val="es-CL"/>
+              </w:rPr>
+              <w:t>Justificar el enfoque supervisado de clasificación multiclase.</w:t>
+            </w:r>
+          </w:p>
+        </w:tc>
+        <w:tc>
+          <w:tcPr>
+            <w:tcW w:w="3061" w:type="dxa"/>
+            <w:shd w:val="clear" w:color="auto" w:fill="EEF1F7"/>
+          </w:tcPr>
+          <w:p>
+            <w:pPr>
+              <w:rPr>
+                <w:sz w:val="18"/>
+                <w:szCs w:val="18"/>
+                <w:lang w:val="es-CL"/>
+              </w:rPr>
+            </w:pPr>
+            <w:r>
+              <w:rPr>
+                <w:sz w:val="18"/>
+                <w:szCs w:val="18"/>
+                <w:lang w:val="es-CL"/>
+              </w:rPr>
+              <w:t>Definición de variable objetivo, tipo de datos y descarte de alternativas.</w:t>
+            </w:r>
+          </w:p>
+        </w:tc>
+      </w:tr>
+      <w:tr>
+        <w:trPr>
+          <w:jc w:val="center"/>
+        </w:trPr>
+        <w:tc>
+          <w:tcPr>
+            <w:tcW w:w="2268" w:type="dxa"/>
+          </w:tcPr>
+          <w:p>
+            <w:pPr>
+              <w:rPr>
+                <w:sz w:val="18"/>
+                <w:szCs w:val="18"/>
+                <w:lang w:val="es-CL"/>
+              </w:rPr>
+            </w:pPr>
+            <w:r>
+              <w:rPr>
+                <w:sz w:val="18"/>
+                <w:szCs w:val="18"/>
+                <w:lang w:val="es-CL"/>
+              </w:rPr>
+              <w:t>13. Comparación de enfoques</w:t>
+            </w:r>
+          </w:p>
+        </w:tc>
+        <w:tc>
+          <w:tcPr>
+            <w:tcW w:w="3175" w:type="dxa"/>
+          </w:tcPr>
+          <w:p>
+            <w:pPr>
+              <w:rPr>
+                <w:sz w:val="18"/>
+                <w:szCs w:val="18"/>
+                <w:lang w:val="es-CL"/>
+              </w:rPr>
+            </w:pPr>
+            <w:r>
+              <w:rPr>
+                <w:sz w:val="18"/>
+                <w:szCs w:val="18"/>
+                <w:lang w:val="es-CL"/>
+              </w:rPr>
+              <w:t>Contrastar el enfoque seleccionado con regresión, clustering y aprendizaje por refuerzo.</w:t>
+            </w:r>
+          </w:p>
+        </w:tc>
+        <w:tc>
+          <w:tcPr>
+            <w:tcW w:w="3061" w:type="dxa"/>
+          </w:tcPr>
+          <w:p>
+            <w:pPr>
+              <w:rPr>
+                <w:sz w:val="18"/>
+                <w:szCs w:val="18"/>
+                <w:lang w:val="es-CL"/>
+              </w:rPr>
+            </w:pPr>
+            <w:r>
+              <w:rPr>
+                <w:sz w:val="18"/>
+                <w:szCs w:val="18"/>
+                <w:lang w:val="es-CL"/>
+              </w:rPr>
+              <w:t>Tabla comparativa con justificación del descarte.</w:t>
+            </w:r>
+          </w:p>
+        </w:tc>
+      </w:tr>
+      <w:tr>
+        <w:trPr>
+          <w:jc w:val="center"/>
+        </w:trPr>
+        <w:tc>
+          <w:tcPr>
+            <w:tcW w:w="2268" w:type="dxa"/>
+            <w:shd w:val="clear" w:color="auto" w:fill="EEF1F7"/>
+          </w:tcPr>
+          <w:p>
+            <w:pPr>
+              <w:rPr>
+                <w:sz w:val="18"/>
+                <w:szCs w:val="18"/>
+                <w:lang w:val="es-CL"/>
+              </w:rPr>
+            </w:pPr>
+            <w:r>
+              <w:rPr>
+                <w:sz w:val="18"/>
+                <w:szCs w:val="18"/>
+                <w:lang w:val="es-CL"/>
+              </w:rPr>
+              <w:t>14. Conclusiones</w:t>
+            </w:r>
+          </w:p>
+        </w:tc>
+        <w:tc>
+          <w:tcPr>
+            <w:tcW w:w="3175" w:type="dxa"/>
+            <w:shd w:val="clear" w:color="auto" w:fill="EEF1F7"/>
+          </w:tcPr>
+          <w:p>
+            <w:pPr>
+              <w:rPr>
+                <w:sz w:val="18"/>
+                <w:szCs w:val="18"/>
+                <w:lang w:val="es-CL"/>
+              </w:rPr>
+            </w:pPr>
+            <w:r>
+              <w:rPr>
+                <w:sz w:val="18"/>
+                <w:szCs w:val="18"/>
+                <w:lang w:val="es-CL"/>
+              </w:rPr>
+              <w:t>Sintetizar los hallazgos técnicos y proyectar las fases siguientes.</w:t>
+            </w:r>
+          </w:p>
+        </w:tc>
+        <w:tc>
+          <w:tcPr>
+            <w:tcW w:w="3061" w:type="dxa"/>
+            <w:shd w:val="clear" w:color="auto" w:fill="EEF1F7"/>
+          </w:tcPr>
+          <w:p>
+            <w:pPr>
+              <w:rPr>
+                <w:sz w:val="18"/>
+                <w:szCs w:val="18"/>
+                <w:lang w:val="es-CL"/>
+              </w:rPr>
+            </w:pPr>
+            <w:r>
+              <w:rPr>
+                <w:sz w:val="18"/>
+                <w:szCs w:val="18"/>
+                <w:lang w:val="es-CL"/>
+              </w:rPr>
+              <w:t>Síntesis de resultados y próximos pasos.</w:t>
             </w:r>
           </w:p>
         </w:tc>
@@ -2635,6 +3193,7 @@
           <w:color w:val="1F3864"/>
           <w:sz w:val="26"/>
         </w:rPr>
+        <w:lastRenderedPageBreak/>
         <w:t>6.2 Código base del notebook</w:t>
       </w:r>
     </w:p>
@@ -2643,7 +3202,7 @@
         <w:jc w:val="both"/>
       </w:pPr>
       <w:r>
-        <w:t>El siguiente código consolida los bloques principales utilizados en el notebook. La lógica respeta el apunte de código de la Fase 1: primero se carga y comprende la base, luego se transforma lo necesario, se analizan correlaciones, se normaliza y se interpretan los resultados antes del modelamiento (Ruete, 2026c).</w:t>
+        <w:t>El siguiente código consolida los bloques principales utilizados en el notebook. La lógica respeta el apunte de código de la Fase 1: primero se carga y comprende la base, luego se transforma lo necesario, se analizan correlaciones, se normaliza y se interpretan los resultados antes del modelamiento (Ruete, 2026c). La lectura del archivo CSV y la manipulación tabular se realizan mediante estructuras DataFrame de pandas (pandas development team, s. f.), mientras que el escalamiento de las variables de entrada se implementa con la clase MinMaxScaler de scikit-learn (scikit-learn developers, s. f.).</w:t>
       </w:r>
     </w:p>
     <w:p>
@@ -2656,7 +3215,6 @@
           <w:rFonts w:ascii="Courier New" w:hAnsi="Courier New"/>
           <w:sz w:val="17"/>
         </w:rPr>
-        <w:lastRenderedPageBreak/>
         <w:t># Importacion de librerias</w:t>
       </w:r>
       <w:r>
@@ -2920,7 +3478,7 @@
     </w:p>
     <w:tbl>
       <w:tblPr>
-        <w:tblStyle w:val="TableGrid"/>
+        <w:tblStyle w:val="Tablaconcuadrcula"/>
         <w:tblW w:w="0" w:type="auto"/>
         <w:jc w:val="center"/>
         <w:tblLook w:val="04A0" w:firstRow="1" w:lastRow="0" w:firstColumn="1" w:lastColumn="0" w:noHBand="0" w:noVBand="1"/>
@@ -3131,6 +3689,7 @@
               <w:rPr>
                 <w:sz w:val="18"/>
               </w:rPr>
+              <w:lastRenderedPageBreak/>
               <w:t>Years_Experience (años)</w:t>
             </w:r>
           </w:p>
@@ -3475,7 +4034,6 @@
         <w:rPr>
           <w:noProof/>
         </w:rPr>
-        <w:lastRenderedPageBreak/>
         <w:drawing>
           <wp:inline distT="0" distB="0" distL="0" distR="0" wp14:anchorId="0D0F9333" wp14:editId="298ED170">
             <wp:extent cx="5400000" cy="1924496"/>
@@ -3780,7 +4338,7 @@
     </w:p>
     <w:tbl>
       <w:tblPr>
-        <w:tblStyle w:val="TableGrid"/>
+        <w:tblStyle w:val="Tablaconcuadrcula"/>
         <w:tblW w:w="0" w:type="auto"/>
         <w:jc w:val="center"/>
         <w:tblLook w:val="04A0" w:firstRow="1" w:lastRow="0" w:firstColumn="1" w:lastColumn="0" w:noHBand="0" w:noVBand="1"/>
@@ -4209,7 +4767,7 @@
     </w:p>
     <w:tbl>
       <w:tblPr>
-        <w:tblStyle w:val="TableGrid"/>
+        <w:tblStyle w:val="Tablaconcuadrcula"/>
         <w:tblW w:w="0" w:type="auto"/>
         <w:jc w:val="center"/>
         <w:tblLook w:val="04A0" w:firstRow="1" w:lastRow="0" w:firstColumn="1" w:lastColumn="0" w:noHBand="0" w:noVBand="1"/>
@@ -4605,179 +5163,383 @@
           <w:color w:val="1F3864"/>
           <w:sz w:val="26"/>
         </w:rPr>
-        <w:t>8.1 Estructura propuesta del repositorio</w:t>
+        <w:t>8.1 Estructura del repositorio</w:t>
       </w:r>
     </w:p>
     <w:p>
       <w:pPr>
-        <w:shd w:val="clear" w:color="auto" w:fill="F2F2F2"/>
-        <w:spacing w:before="80" w:after="200"/>
-      </w:pPr>
-      <w:r>
+        <w:shd w:val="clear" w:color="auto" w:fill="F2F2F2" w:themeFill="background1" w:themeFillShade="F2"/>
+        <w:spacing w:after="0"/>
+        <w:jc w:val="both"/>
         <w:rPr>
           <w:rFonts w:ascii="Courier New" w:hAnsi="Courier New"/>
           <w:sz w:val="17"/>
         </w:rPr>
-        <w:t>MCDI504_S1_1_GRUPO5/</w:t>
-      </w:r>
+      </w:pPr>
       <w:r>
         <w:rPr>
           <w:rFonts w:ascii="Courier New" w:hAnsi="Courier New"/>
           <w:sz w:val="17"/>
         </w:rPr>
-        <w:br/>
-        <w:t>|</w:t>
-      </w:r>
-      <w:r>
+        <w:t>MCDI504/</w:t>
+      </w:r>
+    </w:p>
+    <w:p>
+      <w:pPr>
+        <w:shd w:val="clear" w:color="auto" w:fill="F2F2F2" w:themeFill="background1" w:themeFillShade="F2"/>
+        <w:spacing w:after="0"/>
+        <w:jc w:val="both"/>
         <w:rPr>
           <w:rFonts w:ascii="Courier New" w:hAnsi="Courier New"/>
           <w:sz w:val="17"/>
         </w:rPr>
-        <w:br/>
-        <w:t>+-- docs/</w:t>
-      </w:r>
-      <w:r>
+      </w:pPr>
+      <w:r>
+        <w:t>|</w:t>
+      </w:r>
+    </w:p>
+    <w:p>
+      <w:pPr>
+        <w:shd w:val="clear" w:color="auto" w:fill="F2F2F2" w:themeFill="background1" w:themeFillShade="F2"/>
+        <w:spacing w:after="0"/>
+        <w:jc w:val="both"/>
         <w:rPr>
           <w:rFonts w:ascii="Courier New" w:hAnsi="Courier New"/>
           <w:sz w:val="17"/>
         </w:rPr>
-        <w:br/>
-        <w:t>|   +-- MCDI504_S1_1_GRUPO5.pdf</w:t>
-      </w:r>
+      </w:pPr>
       <w:r>
         <w:rPr>
           <w:rFonts w:ascii="Courier New" w:hAnsi="Courier New"/>
           <w:sz w:val="17"/>
         </w:rPr>
-        <w:br/>
-        <w:t>|</w:t>
-      </w:r>
-      <w:r>
+        <w:t>+-- data/</w:t>
+      </w:r>
+    </w:p>
+    <w:p>
+      <w:pPr>
+        <w:shd w:val="clear" w:color="auto" w:fill="F2F2F2" w:themeFill="background1" w:themeFillShade="F2"/>
+        <w:spacing w:after="0"/>
+        <w:jc w:val="both"/>
         <w:rPr>
           <w:rFonts w:ascii="Courier New" w:hAnsi="Courier New"/>
           <w:sz w:val="17"/>
         </w:rPr>
-        <w:br/>
-        <w:t>+-- notebooks/</w:t>
-      </w:r>
+      </w:pPr>
       <w:r>
         <w:rPr>
           <w:rFonts w:ascii="Courier New" w:hAnsi="Courier New"/>
           <w:sz w:val="17"/>
         </w:rPr>
-        <w:br/>
-        <w:t>|   +-- F1_Definicion.ipynb</w:t>
-      </w:r>
-      <w:r>
+        <w:t>|   +-- AI_Impact_on_Jobs_2030.csv</w:t>
+      </w:r>
+    </w:p>
+    <w:p>
+      <w:pPr>
+        <w:shd w:val="clear" w:color="auto" w:fill="F2F2F2" w:themeFill="background1" w:themeFillShade="F2"/>
+        <w:spacing w:after="0"/>
+        <w:jc w:val="both"/>
         <w:rPr>
           <w:rFonts w:ascii="Courier New" w:hAnsi="Courier New"/>
           <w:sz w:val="17"/>
         </w:rPr>
-        <w:br/>
-        <w:t>|</w:t>
-      </w:r>
+      </w:pPr>
       <w:r>
         <w:rPr>
           <w:rFonts w:ascii="Courier New" w:hAnsi="Courier New"/>
           <w:sz w:val="17"/>
         </w:rPr>
-        <w:br/>
-        <w:t>+-- figures/</w:t>
-      </w:r>
-      <w:r>
+        <w:t>|</w:t>
+      </w:r>
+    </w:p>
+    <w:p>
+      <w:pPr>
+        <w:shd w:val="clear" w:color="auto" w:fill="F2F2F2" w:themeFill="background1" w:themeFillShade="F2"/>
+        <w:spacing w:after="0"/>
+        <w:jc w:val="both"/>
         <w:rPr>
           <w:rFonts w:ascii="Courier New" w:hAnsi="Courier New"/>
           <w:sz w:val="17"/>
         </w:rPr>
-        <w:br/>
-        <w:t>|   +-- boxplot_salario_experiencia.png</w:t>
-      </w:r>
+      </w:pPr>
       <w:r>
         <w:rPr>
           <w:rFonts w:ascii="Courier New" w:hAnsi="Courier New"/>
           <w:sz w:val="17"/>
         </w:rPr>
-        <w:br/>
-      </w:r>
+        <w:t>+-- docs/</w:t>
+      </w:r>
+    </w:p>
+    <w:p>
+      <w:pPr>
+        <w:shd w:val="clear" w:color="auto" w:fill="F2F2F2" w:themeFill="background1" w:themeFillShade="F2"/>
+        <w:spacing w:after="0"/>
+        <w:jc w:val="both"/>
+        <w:rPr>
+          <w:rFonts w:ascii="Courier New" w:hAnsi="Courier New"/>
+          <w:sz w:val="17"/>
+        </w:rPr>
+      </w:pPr>
+      <w:r>
+        <w:rPr>
+          <w:rFonts w:ascii="Courier New" w:hAnsi="Courier New"/>
+          <w:sz w:val="17"/>
+        </w:rPr>
+        <w:t>|   +-- MCDI504_S1_1_GRUPO5.pdf</w:t>
+      </w:r>
+    </w:p>
+    <w:p>
+      <w:pPr>
+        <w:shd w:val="clear" w:color="auto" w:fill="F2F2F2" w:themeFill="background1" w:themeFillShade="F2"/>
+        <w:spacing w:after="0"/>
+        <w:jc w:val="both"/>
+        <w:rPr>
+          <w:rFonts w:ascii="Courier New" w:hAnsi="Courier New"/>
+          <w:sz w:val="17"/>
+        </w:rPr>
+      </w:pPr>
+      <w:r>
+        <w:rPr>
+          <w:rFonts w:ascii="Courier New" w:hAnsi="Courier New"/>
+          <w:sz w:val="17"/>
+        </w:rPr>
+        <w:t>|</w:t>
+      </w:r>
+    </w:p>
+    <w:p>
+      <w:pPr>
+        <w:shd w:val="clear" w:color="auto" w:fill="F2F2F2" w:themeFill="background1" w:themeFillShade="F2"/>
+        <w:spacing w:after="0"/>
+        <w:jc w:val="both"/>
+        <w:rPr>
+          <w:rFonts w:ascii="Courier New" w:hAnsi="Courier New"/>
+          <w:sz w:val="17"/>
+        </w:rPr>
+      </w:pPr>
+      <w:r>
+        <w:rPr>
+          <w:rFonts w:ascii="Courier New" w:hAnsi="Courier New"/>
+          <w:sz w:val="17"/>
+        </w:rPr>
+        <w:t>+-- figures/</w:t>
+      </w:r>
+    </w:p>
+    <w:p>
+      <w:pPr>
+        <w:shd w:val="clear" w:color="auto" w:fill="F2F2F2" w:themeFill="background1" w:themeFillShade="F2"/>
+        <w:spacing w:after="0"/>
+        <w:jc w:val="both"/>
+        <w:rPr>
+          <w:rFonts w:ascii="Courier New" w:hAnsi="Courier New"/>
+          <w:sz w:val="17"/>
+        </w:rPr>
+      </w:pPr>
+      <w:r>
+        <w:rPr>
+          <w:rFonts w:ascii="Courier New" w:hAnsi="Courier New"/>
+          <w:sz w:val="17"/>
+        </w:rPr>
+        <w:t>|   +-- boxplot_indices_habilidades.png</w:t>
+      </w:r>
+    </w:p>
+    <w:p>
+      <w:pPr>
+        <w:shd w:val="clear" w:color="auto" w:fill="F2F2F2" w:themeFill="background1" w:themeFillShade="F2"/>
+        <w:spacing w:after="0"/>
+        <w:jc w:val="both"/>
+        <w:rPr>
+          <w:rFonts w:ascii="Courier New" w:hAnsi="Courier New"/>
+          <w:sz w:val="17"/>
+        </w:rPr>
+      </w:pPr>
+      <w:r>
+        <w:rPr>
+          <w:rFonts w:ascii="Courier New" w:hAnsi="Courier New"/>
+          <w:sz w:val="17"/>
+        </w:rPr>
+        <w:t>|   +-- boxplot_salario_experiencia.png</w:t>
+      </w:r>
+    </w:p>
+    <w:p>
+      <w:pPr>
+        <w:shd w:val="clear" w:color="auto" w:fill="F2F2F2" w:themeFill="background1" w:themeFillShade="F2"/>
+        <w:spacing w:after="0"/>
+        <w:jc w:val="both"/>
+        <w:rPr>
+          <w:rFonts w:ascii="Courier New" w:hAnsi="Courier New"/>
+          <w:sz w:val="17"/>
+        </w:rPr>
+      </w:pPr>
+      <w:r>
+        <w:rPr>
+          <w:rFonts w:ascii="Courier New" w:hAnsi="Courier New"/>
+          <w:sz w:val="17"/>
+        </w:rPr>
+        <w:t>|   +-- correlacion_pearson.png</w:t>
+      </w:r>
+    </w:p>
+    <w:p>
+      <w:pPr>
+        <w:shd w:val="clear" w:color="auto" w:fill="F2F2F2" w:themeFill="background1" w:themeFillShade="F2"/>
+        <w:spacing w:after="0"/>
+        <w:jc w:val="both"/>
+        <w:rPr>
+          <w:rFonts w:ascii="Courier New" w:hAnsi="Courier New"/>
+          <w:sz w:val="17"/>
+        </w:rPr>
+      </w:pPr>
+      <w:r>
+        <w:rPr>
+          <w:rFonts w:ascii="Courier New" w:hAnsi="Courier New"/>
+          <w:sz w:val="17"/>
+        </w:rPr>
+        <w:t>|   +-- kdd_proceso.png</w:t>
+      </w:r>
+    </w:p>
+    <w:p>
+      <w:pPr>
+        <w:shd w:val="clear" w:color="auto" w:fill="F2F2F2" w:themeFill="background1" w:themeFillShade="F2"/>
+        <w:spacing w:after="0"/>
+        <w:jc w:val="both"/>
+        <w:rPr>
+          <w:rFonts w:ascii="Courier New" w:hAnsi="Courier New"/>
+          <w:sz w:val="17"/>
+        </w:rPr>
+      </w:pPr>
       <w:r>
         <w:rPr>
           <w:rFonts w:ascii="Courier New" w:hAnsi="Courier New"/>
           <w:sz w:val="17"/>
         </w:rPr>
         <w:lastRenderedPageBreak/>
-        <w:t>|   +-- boxplot_indices_habilidades.png</w:t>
-      </w:r>
-      <w:r>
+        <w:t>|   +-- pvalores_pearson.png</w:t>
+      </w:r>
+    </w:p>
+    <w:p>
+      <w:pPr>
+        <w:shd w:val="clear" w:color="auto" w:fill="F2F2F2" w:themeFill="background1" w:themeFillShade="F2"/>
+        <w:spacing w:after="0"/>
+        <w:jc w:val="both"/>
         <w:rPr>
           <w:rFonts w:ascii="Courier New" w:hAnsi="Courier New"/>
           <w:sz w:val="17"/>
         </w:rPr>
-        <w:br/>
-        <w:t>|   +-- correlacion_pearson.png</w:t>
-      </w:r>
+      </w:pPr>
       <w:r>
         <w:rPr>
           <w:rFonts w:ascii="Courier New" w:hAnsi="Courier New"/>
           <w:sz w:val="17"/>
         </w:rPr>
-        <w:br/>
-        <w:t>|   +-- pvalores_pearson.png</w:t>
-      </w:r>
-      <w:r>
+        <w:t>|</w:t>
+      </w:r>
+    </w:p>
+    <w:p>
+      <w:pPr>
+        <w:shd w:val="clear" w:color="auto" w:fill="F2F2F2" w:themeFill="background1" w:themeFillShade="F2"/>
+        <w:spacing w:after="0"/>
+        <w:jc w:val="both"/>
         <w:rPr>
           <w:rFonts w:ascii="Courier New" w:hAnsi="Courier New"/>
           <w:sz w:val="17"/>
         </w:rPr>
-        <w:br/>
-        <w:t>|   +-- kdd_proceso.png</w:t>
-      </w:r>
+      </w:pPr>
       <w:r>
         <w:rPr>
           <w:rFonts w:ascii="Courier New" w:hAnsi="Courier New"/>
           <w:sz w:val="17"/>
         </w:rPr>
-        <w:br/>
-        <w:t>|</w:t>
-      </w:r>
-      <w:r>
+        <w:t>+-- notebooks/</w:t>
+      </w:r>
+    </w:p>
+    <w:p>
+      <w:pPr>
+        <w:shd w:val="clear" w:color="auto" w:fill="F2F2F2" w:themeFill="background1" w:themeFillShade="F2"/>
+        <w:spacing w:after="0"/>
+        <w:jc w:val="both"/>
         <w:rPr>
           <w:rFonts w:ascii="Courier New" w:hAnsi="Courier New"/>
           <w:sz w:val="17"/>
         </w:rPr>
-        <w:br/>
-        <w:t>+-- data/</w:t>
-      </w:r>
+      </w:pPr>
       <w:r>
         <w:rPr>
           <w:rFonts w:ascii="Courier New" w:hAnsi="Courier New"/>
           <w:sz w:val="17"/>
         </w:rPr>
-        <w:br/>
-        <w:t>|   +-- AI_Impact_on_Jobs_2030.csv</w:t>
-      </w:r>
-      <w:r>
+        <w:t>|   +-- F1_Definicion.ipynb</w:t>
+      </w:r>
+    </w:p>
+    <w:p>
+      <w:pPr>
+        <w:shd w:val="clear" w:color="auto" w:fill="F2F2F2" w:themeFill="background1" w:themeFillShade="F2"/>
+        <w:spacing w:after="0"/>
+        <w:jc w:val="both"/>
         <w:rPr>
           <w:rFonts w:ascii="Courier New" w:hAnsi="Courier New"/>
           <w:sz w:val="17"/>
         </w:rPr>
-        <w:br/>
-        <w:t>|</w:t>
-      </w:r>
+      </w:pPr>
       <w:r>
         <w:rPr>
           <w:rFonts w:ascii="Courier New" w:hAnsi="Courier New"/>
           <w:sz w:val="17"/>
         </w:rPr>
-        <w:br/>
-        <w:t>+-- README.md</w:t>
+        <w:t>|</w:t>
       </w:r>
     </w:p>
     <w:p>
       <w:pPr>
+        <w:shd w:val="clear" w:color="auto" w:fill="F2F2F2" w:themeFill="background1" w:themeFillShade="F2"/>
+        <w:spacing w:after="0"/>
         <w:jc w:val="both"/>
-      </w:pPr>
-      <w:r>
-        <w:t>La estructura propuesta permite verificar la correspondencia entre informe, notebook y repositorio. El informe sintetiza y argumenta; el notebook ejecuta el flujo técnico; el repositorio organiza evidencias, figuras y datos. Esta organización cumple con el criterio de trazabilidad solicitado para la Fase 1.</w:t>
+        <w:rPr>
+          <w:rFonts w:ascii="Courier New" w:hAnsi="Courier New"/>
+          <w:sz w:val="17"/>
+        </w:rPr>
+      </w:pPr>
+      <w:r>
+        <w:rPr>
+          <w:rFonts w:ascii="Courier New" w:hAnsi="Courier New"/>
+          <w:sz w:val="17"/>
+        </w:rPr>
+        <w:t>+-- README.md</w:t>
+      </w:r>
+    </w:p>
+    <w:p>
+      <w:pPr>
+        <w:shd w:val="clear" w:color="auto" w:fill="F2F2F2" w:themeFill="background1" w:themeFillShade="F2"/>
+        <w:spacing w:after="0"/>
+        <w:jc w:val="both"/>
+        <w:rPr>
+          <w:rFonts w:ascii="Courier New" w:hAnsi="Courier New"/>
+          <w:sz w:val="17"/>
+        </w:rPr>
+      </w:pPr>
+      <w:r>
+        <w:rPr>
+          <w:rFonts w:ascii="Courier New" w:hAnsi="Courier New"/>
+          <w:sz w:val="17"/>
+        </w:rPr>
+        <w:t>+-- requirements.txt</w:t>
+      </w:r>
+    </w:p>
+    <w:p>
+      <w:pPr>
+        <w:jc w:val="both"/>
+      </w:pPr>
+    </w:p>
+    <w:p>
+      <w:pPr>
+        <w:jc w:val="both"/>
+      </w:pPr>
+      <w:r>
+        <w:t xml:space="preserve">La estructura </w:t>
+      </w:r>
+      <w:r>
+        <w:t>del repositorio</w:t>
+      </w:r>
+      <w:r>
+        <w:t xml:space="preserve"> permite verificar la correspondencia entre informe, notebook y repositorio. El informe sintetiza y argumenta; el notebook ejecuta el flujo técnico; el repositorio organiza evidencias, figuras y datos. Esta organización cumple con el criterio de trazabilidad solicitado para la Fase 1.</w:t>
       </w:r>
     </w:p>
     <w:p>
@@ -4836,7 +5598,10 @@
         <w:jc w:val="both"/>
       </w:pPr>
       <w:r>
-        <w:t>Como proyección, el siguiente paso del proyecto debería consistir en entrenar y comparar modelos de clasificación supervisada (por ejemplo, árboles de decisión, Random Forest o regresión logística multinomial), utilizando partición de entrenamiento y prueba, métricas de desempeño adecuadas para un problema multiclase y, eventualmente, validación cruzada. La base conceptual y técnica definida en este informe permite avanzar hacia esa fase con una orientación metodológica clara.</w:t>
+        <w:t>Como proyección, el siguiente paso del proyecto debería consistir en entrenar y comparar modelos de clasificación supervisada (por ejemplo, árboles de decisión, Random Forest o regresión logística multinomial), disponibles en scikit-learn bajo una interfaz común de estimadores (Pedregosa et al., 2011), utilizando partición de entrenamiento y prueba, métricas de desempeño adecuadas para un problema multiclase y, eventualmente, validación cruzada.</w:t>
+      </w:r>
+      <w:r>
+        <w:t xml:space="preserve"> La base conceptual y técnica definida en este informe permite avanzar hacia esa fase con una orientación metodológica clara.</w:t>
       </w:r>
     </w:p>
     <w:p>
@@ -4987,23 +5752,17 @@
       </w:r>
     </w:p>
     <w:p>
-      <w:pPr>
-        <w:ind w:left="283" w:hanging="283"/>
-      </w:pPr>
-      <w:r>
-        <w:t xml:space="preserve">scikit-learn developers. (s. f.). </w:t>
-      </w:r>
-      <w:r>
-        <w:rPr>
-          <w:i/>
-        </w:rPr>
-        <w:t>scikit-learn documentation</w:t>
-      </w:r>
-      <w:r>
-        <w:t>. https://scikit-learn.org/stable/documentation.html</w:t>
-      </w:r>
-    </w:p>
-    <w:p>
+      <w:r>
+        <w:t xml:space="preserve">scikit-learn developers. (s. f.). scikit-learn documentation. </w:t>
+      </w:r>
+      <w:hyperlink r:id="rId14" w:history="1">
+        <w:r>
+          <w:rPr>
+            <w:rStyle w:val="Hipervnculo"/>
+          </w:rPr>
+          <w:t>https://scikit-learn.org/stable/</w:t>
+        </w:r>
+      </w:hyperlink>
       <w:r>
         <w:br w:type="page"/>
       </w:r>
@@ -5037,7 +5796,7 @@
     </w:p>
     <w:tbl>
       <w:tblPr>
-        <w:tblStyle w:val="TableGrid"/>
+        <w:tblStyle w:val="Tablaconcuadrcula"/>
         <w:tblW w:w="0" w:type="auto"/>
         <w:jc w:val="center"/>
         <w:tblLook w:val="04A0" w:firstRow="1" w:lastRow="0" w:firstColumn="1" w:lastColumn="0" w:noHBand="0" w:noVBand="1"/>
@@ -5829,7 +6588,7 @@
     </w:p>
     <w:tbl>
       <w:tblPr>
-        <w:tblStyle w:val="TableGrid"/>
+        <w:tblStyle w:val="Tablaconcuadrcula"/>
         <w:tblW w:w="0" w:type="auto"/>
         <w:jc w:val="center"/>
         <w:tblLook w:val="04A0" w:firstRow="1" w:lastRow="0" w:firstColumn="1" w:lastColumn="0" w:noHBand="0" w:noVBand="1"/>
@@ -6392,7 +7151,7 @@
     </w:p>
     <w:tbl>
       <w:tblPr>
-        <w:tblStyle w:val="TableGrid"/>
+        <w:tblStyle w:val="Tablaconcuadrcula"/>
         <w:tblW w:w="0" w:type="auto"/>
         <w:jc w:val="center"/>
         <w:tblLook w:val="04A0" w:firstRow="1" w:lastRow="0" w:firstColumn="1" w:lastColumn="0" w:noHBand="0" w:noVBand="1"/>
@@ -6796,8 +7555,8 @@
       </w:pPr>
     </w:p>
     <w:sectPr>
-      <w:headerReference w:type="default" r:id="rId14"/>
-      <w:footerReference w:type="default" r:id="rId15"/>
+      <w:headerReference w:type="default" r:id="rId15"/>
+      <w:footerReference w:type="default" r:id="rId16"/>
       <w:pgSz w:w="12240" w:h="15840"/>
       <w:pgMar w:top="1247" w:right="1247" w:bottom="1247" w:left="1247" w:header="720" w:footer="720" w:gutter="0"/>
       <w:cols w:space="720"/>
@@ -6808,7 +7567,7 @@
 </file>
 
 <file path=word/endnotes.xml><?xml version="1.0" encoding="utf-8"?>
-<w:endnotes xmlns:wpc="http://schemas.microsoft.com/office/word/2010/wordprocessingCanvas" xmlns:cx="http://schemas.microsoft.com/office/drawing/2014/chartex" xmlns:cx1="http://schemas.microsoft.com/office/drawing/2015/9/8/chartex" xmlns:cx2="http://schemas.microsoft.com/office/drawing/2015/10/21/chartex" xmlns:cx3="http://schemas.microsoft.com/office/drawing/2016/5/9/chartex" xmlns:cx4="http://schemas.microsoft.com/office/drawing/2016/5/10/chartex" xmlns:cx5="http://schemas.microsoft.com/office/drawing/2016/5/11/chartex" xmlns:cx6="http://schemas.microsoft.com/office/drawing/2016/5/12/chartex" xmlns:cx7="http://schemas.microsoft.com/office/drawing/2016/5/13/chartex" xmlns:cx8="http://schemas.microsoft.com/office/drawing/2016/5/14/chartex" xmlns:mc="http://schemas.openxmlformats.org/markup-compatibility/2006" xmlns:m="http://schemas.openxmlformats.org/officeDocument/2006/math" xmlns:aink="http://schemas.microsoft.com/office/drawing/2016/ink" xmlns:am3d="http://schemas.microsoft.com/office/drawing/2017/model3d" xmlns:oel="http://schemas.microsoft.com/office/2019/extlst" xmlns:r="http://schemas.openxmlformats.org/officeDocument/2006/relationships" xmlns:wp14="http://schemas.microsoft.com/office/word/2010/wordprocessingDrawing" xmlns:wp="http://schemas.openxmlformats.org/drawingml/2006/wordprocessingDrawing" xmlns:wpg="http://schemas.microsoft.com/office/word/2010/wordprocessingGroup" xmlns:wpi="http://schemas.microsoft.com/office/word/2010/wordprocessingInk" xmlns:wps="http://schemas.microsoft.com/office/word/2010/wordprocessingShape" xmlns:o="urn:schemas-microsoft-com:office:office" xmlns:v="urn:schemas-microsoft-com:vml" xmlns:w10="urn:schemas-microsoft-com:office:word" xmlns:w="http://schemas.openxmlformats.org/wordprocessingml/2006/main" xmlns:w14="http://schemas.microsoft.com/office/word/2010/wordml" xmlns:w15="http://schemas.microsoft.com/office/word/2012/wordml" xmlns:w16cei="http://schemas.microsoft.com/office/word/2026/wordml/cei" xmlns:w16cex="http://schemas.microsoft.com/office/word/2018/wordml/cex" xmlns:w16cid="http://schemas.microsoft.com/office/word/2016/wordml/cid" xmlns:w16="http://schemas.microsoft.com/office/word/2018/wordml" xmlns:w16sdtdh="http://schemas.microsoft.com/office/word/2020/wordml/sdtdatahash" xmlns:w16sdtfl="http://schemas.microsoft.com/office/word/2024/wordml/sdtformatlock" xmlns:w16se="http://schemas.microsoft.com/office/word/2015/wordml/symex" xmlns:w16du="http://schemas.microsoft.com/office/word/2023/wordml/word16du" xmlns:wne="http://schemas.microsoft.com/office/word/2006/wordml" mc:Ignorable="w14 w15 w16se w16cid w16 w16cex w16sdtdh w16sdtfl w16du wp14">
+<w:endnotes xmlns:wpc="http://schemas.microsoft.com/office/word/2010/wordprocessingCanvas" xmlns:cx="http://schemas.microsoft.com/office/drawing/2014/chartex" xmlns:cx1="http://schemas.microsoft.com/office/drawing/2015/9/8/chartex" xmlns:cx2="http://schemas.microsoft.com/office/drawing/2015/10/21/chartex" xmlns:cx3="http://schemas.microsoft.com/office/drawing/2016/5/9/chartex" xmlns:cx4="http://schemas.microsoft.com/office/drawing/2016/5/10/chartex" xmlns:cx5="http://schemas.microsoft.com/office/drawing/2016/5/11/chartex" xmlns:cx6="http://schemas.microsoft.com/office/drawing/2016/5/12/chartex" xmlns:cx7="http://schemas.microsoft.com/office/drawing/2016/5/13/chartex" xmlns:cx8="http://schemas.microsoft.com/office/drawing/2016/5/14/chartex" xmlns:mc="http://schemas.openxmlformats.org/markup-compatibility/2006" xmlns:aink="http://schemas.microsoft.com/office/drawing/2016/ink" xmlns:am3d="http://schemas.microsoft.com/office/drawing/2017/model3d" xmlns:o="urn:schemas-microsoft-com:office:office" xmlns:oel="http://schemas.microsoft.com/office/2019/extlst" xmlns:r="http://schemas.openxmlformats.org/officeDocument/2006/relationships" xmlns:m="http://schemas.openxmlformats.org/officeDocument/2006/math" xmlns:v="urn:schemas-microsoft-com:vml" xmlns:wp14="http://schemas.microsoft.com/office/word/2010/wordprocessingDrawing" xmlns:wp="http://schemas.openxmlformats.org/drawingml/2006/wordprocessingDrawing" xmlns:w10="urn:schemas-microsoft-com:office:word" xmlns:w="http://schemas.openxmlformats.org/wordprocessingml/2006/main" xmlns:w14="http://schemas.microsoft.com/office/word/2010/wordml" xmlns:w15="http://schemas.microsoft.com/office/word/2012/wordml" xmlns:w16cei="http://schemas.microsoft.com/office/word/2026/wordml/cei" xmlns:w16cex="http://schemas.microsoft.com/office/word/2018/wordml/cex" xmlns:w16cid="http://schemas.microsoft.com/office/word/2016/wordml/cid" xmlns:w16="http://schemas.microsoft.com/office/word/2018/wordml" xmlns:w16du="http://schemas.microsoft.com/office/word/2023/wordml/word16du" xmlns:w16sdtdh="http://schemas.microsoft.com/office/word/2020/wordml/sdtdatahash" xmlns:w16sdtfl="http://schemas.microsoft.com/office/word/2024/wordml/sdtformatlock" xmlns:w16se="http://schemas.microsoft.com/office/word/2015/wordml/symex" xmlns:wpg="http://schemas.microsoft.com/office/word/2010/wordprocessingGroup" xmlns:wpi="http://schemas.microsoft.com/office/word/2010/wordprocessingInk" xmlns:wne="http://schemas.microsoft.com/office/word/2006/wordml" xmlns:wps="http://schemas.microsoft.com/office/word/2010/wordprocessingShape" mc:Ignorable="w14 w15 w16se w16cid w16 w16cex w16sdtdh w16sdtfl w16du wp14">
   <w:endnote w:type="separator" w:id="-1">
     <w:p>
       <w:pPr>
@@ -6833,10 +7592,10 @@
 </file>
 
 <file path=word/footer1.xml><?xml version="1.0" encoding="utf-8"?>
-<w:ftr xmlns:wpc="http://schemas.microsoft.com/office/word/2010/wordprocessingCanvas" xmlns:cx="http://schemas.microsoft.com/office/drawing/2014/chartex" xmlns:cx1="http://schemas.microsoft.com/office/drawing/2015/9/8/chartex" xmlns:cx2="http://schemas.microsoft.com/office/drawing/2015/10/21/chartex" xmlns:cx3="http://schemas.microsoft.com/office/drawing/2016/5/9/chartex" xmlns:cx4="http://schemas.microsoft.com/office/drawing/2016/5/10/chartex" xmlns:cx5="http://schemas.microsoft.com/office/drawing/2016/5/11/chartex" xmlns:cx6="http://schemas.microsoft.com/office/drawing/2016/5/12/chartex" xmlns:cx7="http://schemas.microsoft.com/office/drawing/2016/5/13/chartex" xmlns:cx8="http://schemas.microsoft.com/office/drawing/2016/5/14/chartex" xmlns:mc="http://schemas.openxmlformats.org/markup-compatibility/2006" xmlns:m="http://schemas.openxmlformats.org/officeDocument/2006/math" xmlns:aink="http://schemas.microsoft.com/office/drawing/2016/ink" xmlns:am3d="http://schemas.microsoft.com/office/drawing/2017/model3d" xmlns:oel="http://schemas.microsoft.com/office/2019/extlst" xmlns:r="http://schemas.openxmlformats.org/officeDocument/2006/relationships" xmlns:wp14="http://schemas.microsoft.com/office/word/2010/wordprocessingDrawing" xmlns:wp="http://schemas.openxmlformats.org/drawingml/2006/wordprocessingDrawing" xmlns:wpg="http://schemas.microsoft.com/office/word/2010/wordprocessingGroup" xmlns:wpi="http://schemas.microsoft.com/office/word/2010/wordprocessingInk" xmlns:wps="http://schemas.microsoft.com/office/word/2010/wordprocessingShape" xmlns:o="urn:schemas-microsoft-com:office:office" xmlns:v="urn:schemas-microsoft-com:vml" xmlns:w10="urn:schemas-microsoft-com:office:word" xmlns:w="http://schemas.openxmlformats.org/wordprocessingml/2006/main" xmlns:w14="http://schemas.microsoft.com/office/word/2010/wordml" xmlns:w15="http://schemas.microsoft.com/office/word/2012/wordml" xmlns:w16cei="http://schemas.microsoft.com/office/word/2026/wordml/cei" xmlns:w16cex="http://schemas.microsoft.com/office/word/2018/wordml/cex" xmlns:w16cid="http://schemas.microsoft.com/office/word/2016/wordml/cid" xmlns:w16="http://schemas.microsoft.com/office/word/2018/wordml" xmlns:w16sdtdh="http://schemas.microsoft.com/office/word/2020/wordml/sdtdatahash" xmlns:w16sdtfl="http://schemas.microsoft.com/office/word/2024/wordml/sdtformatlock" xmlns:w16se="http://schemas.microsoft.com/office/word/2015/wordml/symex" xmlns:w16du="http://schemas.microsoft.com/office/word/2023/wordml/word16du" xmlns:wne="http://schemas.microsoft.com/office/word/2006/wordml" mc:Ignorable="w14 w15 w16se w16cid w16 w16cex w16sdtdh w16sdtfl w16du wp14">
+<w:ftr xmlns:wpc="http://schemas.microsoft.com/office/word/2010/wordprocessingCanvas" xmlns:cx="http://schemas.microsoft.com/office/drawing/2014/chartex" xmlns:cx1="http://schemas.microsoft.com/office/drawing/2015/9/8/chartex" xmlns:cx2="http://schemas.microsoft.com/office/drawing/2015/10/21/chartex" xmlns:cx3="http://schemas.microsoft.com/office/drawing/2016/5/9/chartex" xmlns:cx4="http://schemas.microsoft.com/office/drawing/2016/5/10/chartex" xmlns:cx5="http://schemas.microsoft.com/office/drawing/2016/5/11/chartex" xmlns:cx6="http://schemas.microsoft.com/office/drawing/2016/5/12/chartex" xmlns:cx7="http://schemas.microsoft.com/office/drawing/2016/5/13/chartex" xmlns:cx8="http://schemas.microsoft.com/office/drawing/2016/5/14/chartex" xmlns:mc="http://schemas.openxmlformats.org/markup-compatibility/2006" xmlns:aink="http://schemas.microsoft.com/office/drawing/2016/ink" xmlns:am3d="http://schemas.microsoft.com/office/drawing/2017/model3d" xmlns:o="urn:schemas-microsoft-com:office:office" xmlns:oel="http://schemas.microsoft.com/office/2019/extlst" xmlns:r="http://schemas.openxmlformats.org/officeDocument/2006/relationships" xmlns:m="http://schemas.openxmlformats.org/officeDocument/2006/math" xmlns:v="urn:schemas-microsoft-com:vml" xmlns:wp14="http://schemas.microsoft.com/office/word/2010/wordprocessingDrawing" xmlns:wp="http://schemas.openxmlformats.org/drawingml/2006/wordprocessingDrawing" xmlns:w10="urn:schemas-microsoft-com:office:word" xmlns:w="http://schemas.openxmlformats.org/wordprocessingml/2006/main" xmlns:w14="http://schemas.microsoft.com/office/word/2010/wordml" xmlns:w15="http://schemas.microsoft.com/office/word/2012/wordml" xmlns:w16cei="http://schemas.microsoft.com/office/word/2026/wordml/cei" xmlns:w16cex="http://schemas.microsoft.com/office/word/2018/wordml/cex" xmlns:w16cid="http://schemas.microsoft.com/office/word/2016/wordml/cid" xmlns:w16="http://schemas.microsoft.com/office/word/2018/wordml" xmlns:w16du="http://schemas.microsoft.com/office/word/2023/wordml/word16du" xmlns:w16sdtdh="http://schemas.microsoft.com/office/word/2020/wordml/sdtdatahash" xmlns:w16sdtfl="http://schemas.microsoft.com/office/word/2024/wordml/sdtformatlock" xmlns:w16se="http://schemas.microsoft.com/office/word/2015/wordml/symex" xmlns:wpg="http://schemas.microsoft.com/office/word/2010/wordprocessingGroup" xmlns:wpi="http://schemas.microsoft.com/office/word/2010/wordprocessingInk" xmlns:wne="http://schemas.microsoft.com/office/word/2006/wordml" xmlns:wps="http://schemas.microsoft.com/office/word/2010/wordprocessingShape" mc:Ignorable="w14 w15 w16se w16cid w16 w16cex w16sdtdh w16sdtfl w16du wp14">
   <w:p>
     <w:pPr>
-      <w:pStyle w:val="Footer"/>
+      <w:pStyle w:val="Piedepgina"/>
       <w:jc w:val="right"/>
     </w:pPr>
     <w:r>
@@ -6869,7 +7628,7 @@
 </file>
 
 <file path=word/footnotes.xml><?xml version="1.0" encoding="utf-8"?>
-<w:footnotes xmlns:wpc="http://schemas.microsoft.com/office/word/2010/wordprocessingCanvas" xmlns:cx="http://schemas.microsoft.com/office/drawing/2014/chartex" xmlns:cx1="http://schemas.microsoft.com/office/drawing/2015/9/8/chartex" xmlns:cx2="http://schemas.microsoft.com/office/drawing/2015/10/21/chartex" xmlns:cx3="http://schemas.microsoft.com/office/drawing/2016/5/9/chartex" xmlns:cx4="http://schemas.microsoft.com/office/drawing/2016/5/10/chartex" xmlns:cx5="http://schemas.microsoft.com/office/drawing/2016/5/11/chartex" xmlns:cx6="http://schemas.microsoft.com/office/drawing/2016/5/12/chartex" xmlns:cx7="http://schemas.microsoft.com/office/drawing/2016/5/13/chartex" xmlns:cx8="http://schemas.microsoft.com/office/drawing/2016/5/14/chartex" xmlns:mc="http://schemas.openxmlformats.org/markup-compatibility/2006" xmlns:m="http://schemas.openxmlformats.org/officeDocument/2006/math" xmlns:aink="http://schemas.microsoft.com/office/drawing/2016/ink" xmlns:am3d="http://schemas.microsoft.com/office/drawing/2017/model3d" xmlns:oel="http://schemas.microsoft.com/office/2019/extlst" xmlns:r="http://schemas.openxmlformats.org/officeDocument/2006/relationships" xmlns:wp14="http://schemas.microsoft.com/office/word/2010/wordprocessingDrawing" xmlns:wp="http://schemas.openxmlformats.org/drawingml/2006/wordprocessingDrawing" xmlns:wpg="http://schemas.microsoft.com/office/word/2010/wordprocessingGroup" xmlns:wpi="http://schemas.microsoft.com/office/word/2010/wordprocessingInk" xmlns:wps="http://schemas.microsoft.com/office/word/2010/wordprocessingShape" xmlns:o="urn:schemas-microsoft-com:office:office" xmlns:v="urn:schemas-microsoft-com:vml" xmlns:w10="urn:schemas-microsoft-com:office:word" xmlns:w="http://schemas.openxmlformats.org/wordprocessingml/2006/main" xmlns:w14="http://schemas.microsoft.com/office/word/2010/wordml" xmlns:w15="http://schemas.microsoft.com/office/word/2012/wordml" xmlns:w16cei="http://schemas.microsoft.com/office/word/2026/wordml/cei" xmlns:w16cex="http://schemas.microsoft.com/office/word/2018/wordml/cex" xmlns:w16cid="http://schemas.microsoft.com/office/word/2016/wordml/cid" xmlns:w16="http://schemas.microsoft.com/office/word/2018/wordml" xmlns:w16sdtdh="http://schemas.microsoft.com/office/word/2020/wordml/sdtdatahash" xmlns:w16sdtfl="http://schemas.microsoft.com/office/word/2024/wordml/sdtformatlock" xmlns:w16se="http://schemas.microsoft.com/office/word/2015/wordml/symex" xmlns:w16du="http://schemas.microsoft.com/office/word/2023/wordml/word16du" xmlns:wne="http://schemas.microsoft.com/office/word/2006/wordml" mc:Ignorable="w14 w15 w16se w16cid w16 w16cex w16sdtdh w16sdtfl w16du wp14">
+<w:footnotes xmlns:wpc="http://schemas.microsoft.com/office/word/2010/wordprocessingCanvas" xmlns:cx="http://schemas.microsoft.com/office/drawing/2014/chartex" xmlns:cx1="http://schemas.microsoft.com/office/drawing/2015/9/8/chartex" xmlns:cx2="http://schemas.microsoft.com/office/drawing/2015/10/21/chartex" xmlns:cx3="http://schemas.microsoft.com/office/drawing/2016/5/9/chartex" xmlns:cx4="http://schemas.microsoft.com/office/drawing/2016/5/10/chartex" xmlns:cx5="http://schemas.microsoft.com/office/drawing/2016/5/11/chartex" xmlns:cx6="http://schemas.microsoft.com/office/drawing/2016/5/12/chartex" xmlns:cx7="http://schemas.microsoft.com/office/drawing/2016/5/13/chartex" xmlns:cx8="http://schemas.microsoft.com/office/drawing/2016/5/14/chartex" xmlns:mc="http://schemas.openxmlformats.org/markup-compatibility/2006" xmlns:aink="http://schemas.microsoft.com/office/drawing/2016/ink" xmlns:am3d="http://schemas.microsoft.com/office/drawing/2017/model3d" xmlns:o="urn:schemas-microsoft-com:office:office" xmlns:oel="http://schemas.microsoft.com/office/2019/extlst" xmlns:r="http://schemas.openxmlformats.org/officeDocument/2006/relationships" xmlns:m="http://schemas.openxmlformats.org/officeDocument/2006/math" xmlns:v="urn:schemas-microsoft-com:vml" xmlns:wp14="http://schemas.microsoft.com/office/word/2010/wordprocessingDrawing" xmlns:wp="http://schemas.openxmlformats.org/drawingml/2006/wordprocessingDrawing" xmlns:w10="urn:schemas-microsoft-com:office:word" xmlns:w="http://schemas.openxmlformats.org/wordprocessingml/2006/main" xmlns:w14="http://schemas.microsoft.com/office/word/2010/wordml" xmlns:w15="http://schemas.microsoft.com/office/word/2012/wordml" xmlns:w16cei="http://schemas.microsoft.com/office/word/2026/wordml/cei" xmlns:w16cex="http://schemas.microsoft.com/office/word/2018/wordml/cex" xmlns:w16cid="http://schemas.microsoft.com/office/word/2016/wordml/cid" xmlns:w16="http://schemas.microsoft.com/office/word/2018/wordml" xmlns:w16du="http://schemas.microsoft.com/office/word/2023/wordml/word16du" xmlns:w16sdtdh="http://schemas.microsoft.com/office/word/2020/wordml/sdtdatahash" xmlns:w16sdtfl="http://schemas.microsoft.com/office/word/2024/wordml/sdtformatlock" xmlns:w16se="http://schemas.microsoft.com/office/word/2015/wordml/symex" xmlns:wpg="http://schemas.microsoft.com/office/word/2010/wordprocessingGroup" xmlns:wpi="http://schemas.microsoft.com/office/word/2010/wordprocessingInk" xmlns:wne="http://schemas.microsoft.com/office/word/2006/wordml" xmlns:wps="http://schemas.microsoft.com/office/word/2010/wordprocessingShape" mc:Ignorable="w14 w15 w16se w16cid w16 w16cex w16sdtdh w16sdtfl w16du wp14">
   <w:footnote w:type="separator" w:id="-1">
     <w:p>
       <w:pPr>
@@ -6894,33 +7653,24 @@
 </file>
 
 <file path=word/header1.xml><?xml version="1.0" encoding="utf-8"?>
-<w:hdr xmlns:wpc="http://schemas.microsoft.com/office/word/2010/wordprocessingCanvas" xmlns:cx="http://schemas.microsoft.com/office/drawing/2014/chartex" xmlns:cx1="http://schemas.microsoft.com/office/drawing/2015/9/8/chartex" xmlns:cx2="http://schemas.microsoft.com/office/drawing/2015/10/21/chartex" xmlns:cx3="http://schemas.microsoft.com/office/drawing/2016/5/9/chartex" xmlns:cx4="http://schemas.microsoft.com/office/drawing/2016/5/10/chartex" xmlns:cx5="http://schemas.microsoft.com/office/drawing/2016/5/11/chartex" xmlns:cx6="http://schemas.microsoft.com/office/drawing/2016/5/12/chartex" xmlns:cx7="http://schemas.microsoft.com/office/drawing/2016/5/13/chartex" xmlns:cx8="http://schemas.microsoft.com/office/drawing/2016/5/14/chartex" xmlns:mc="http://schemas.openxmlformats.org/markup-compatibility/2006" xmlns:m="http://schemas.openxmlformats.org/officeDocument/2006/math" xmlns:aink="http://schemas.microsoft.com/office/drawing/2016/ink" xmlns:am3d="http://schemas.microsoft.com/office/drawing/2017/model3d" xmlns:oel="http://schemas.microsoft.com/office/2019/extlst" xmlns:r="http://schemas.openxmlformats.org/officeDocument/2006/relationships" xmlns:wp14="http://schemas.microsoft.com/office/word/2010/wordprocessingDrawing" xmlns:wp="http://schemas.openxmlformats.org/drawingml/2006/wordprocessingDrawing" xmlns:wpg="http://schemas.microsoft.com/office/word/2010/wordprocessingGroup" xmlns:wpi="http://schemas.microsoft.com/office/word/2010/wordprocessingInk" xmlns:wps="http://schemas.microsoft.com/office/word/2010/wordprocessingShape" xmlns:o="urn:schemas-microsoft-com:office:office" xmlns:v="urn:schemas-microsoft-com:vml" xmlns:w10="urn:schemas-microsoft-com:office:word" xmlns:w="http://schemas.openxmlformats.org/wordprocessingml/2006/main" xmlns:w14="http://schemas.microsoft.com/office/word/2010/wordml" xmlns:w15="http://schemas.microsoft.com/office/word/2012/wordml" xmlns:w16cei="http://schemas.microsoft.com/office/word/2026/wordml/cei" xmlns:w16cex="http://schemas.microsoft.com/office/word/2018/wordml/cex" xmlns:w16cid="http://schemas.microsoft.com/office/word/2016/wordml/cid" xmlns:w16="http://schemas.microsoft.com/office/word/2018/wordml" xmlns:w16sdtdh="http://schemas.microsoft.com/office/word/2020/wordml/sdtdatahash" xmlns:w16sdtfl="http://schemas.microsoft.com/office/word/2024/wordml/sdtformatlock" xmlns:w16se="http://schemas.microsoft.com/office/word/2015/wordml/symex" xmlns:w16du="http://schemas.microsoft.com/office/word/2023/wordml/word16du" xmlns:wne="http://schemas.microsoft.com/office/word/2006/wordml" mc:Ignorable="w14 w15 w16se w16cid w16 w16cex w16sdtdh w16sdtfl w16du wp14">
+<w:hdr xmlns:wpc="http://schemas.microsoft.com/office/word/2010/wordprocessingCanvas" xmlns:cx="http://schemas.microsoft.com/office/drawing/2014/chartex" xmlns:cx1="http://schemas.microsoft.com/office/drawing/2015/9/8/chartex" xmlns:cx2="http://schemas.microsoft.com/office/drawing/2015/10/21/chartex" xmlns:cx3="http://schemas.microsoft.com/office/drawing/2016/5/9/chartex" xmlns:cx4="http://schemas.microsoft.com/office/drawing/2016/5/10/chartex" xmlns:cx5="http://schemas.microsoft.com/office/drawing/2016/5/11/chartex" xmlns:cx6="http://schemas.microsoft.com/office/drawing/2016/5/12/chartex" xmlns:cx7="http://schemas.microsoft.com/office/drawing/2016/5/13/chartex" xmlns:cx8="http://schemas.microsoft.com/office/drawing/2016/5/14/chartex" xmlns:mc="http://schemas.openxmlformats.org/markup-compatibility/2006" xmlns:aink="http://schemas.microsoft.com/office/drawing/2016/ink" xmlns:am3d="http://schemas.microsoft.com/office/drawing/2017/model3d" xmlns:o="urn:schemas-microsoft-com:office:office" xmlns:oel="http://schemas.microsoft.com/office/2019/extlst" xmlns:r="http://schemas.openxmlformats.org/officeDocument/2006/relationships" xmlns:m="http://schemas.openxmlformats.org/officeDocument/2006/math" xmlns:v="urn:schemas-microsoft-com:vml" xmlns:wp14="http://schemas.microsoft.com/office/word/2010/wordprocessingDrawing" xmlns:wp="http://schemas.openxmlformats.org/drawingml/2006/wordprocessingDrawing" xmlns:w10="urn:schemas-microsoft-com:office:word" xmlns:w="http://schemas.openxmlformats.org/wordprocessingml/2006/main" xmlns:w14="http://schemas.microsoft.com/office/word/2010/wordml" xmlns:w15="http://schemas.microsoft.com/office/word/2012/wordml" xmlns:w16cei="http://schemas.microsoft.com/office/word/2026/wordml/cei" xmlns:w16cex="http://schemas.microsoft.com/office/word/2018/wordml/cex" xmlns:w16cid="http://schemas.microsoft.com/office/word/2016/wordml/cid" xmlns:w16="http://schemas.microsoft.com/office/word/2018/wordml" xmlns:w16du="http://schemas.microsoft.com/office/word/2023/wordml/word16du" xmlns:w16sdtdh="http://schemas.microsoft.com/office/word/2020/wordml/sdtdatahash" xmlns:w16sdtfl="http://schemas.microsoft.com/office/word/2024/wordml/sdtformatlock" xmlns:w16se="http://schemas.microsoft.com/office/word/2015/wordml/symex" xmlns:wpg="http://schemas.microsoft.com/office/word/2010/wordprocessingGroup" xmlns:wpi="http://schemas.microsoft.com/office/word/2010/wordprocessingInk" xmlns:wne="http://schemas.microsoft.com/office/word/2006/wordml" xmlns:wps="http://schemas.microsoft.com/office/word/2010/wordprocessingShape" mc:Ignorable="w14 w15 w16se w16cid w16 w16cex w16sdtdh w16sdtfl w16du wp14">
   <w:p>
     <w:pPr>
-      <w:pStyle w:val="Header"/>
+      <w:pStyle w:val="Encabezado"/>
     </w:pPr>
-    <w:proofErr w:type="spellStart"/>
     <w:r>
       <w:rPr>
         <w:color w:val="595959"/>
         <w:sz w:val="18"/>
       </w:rPr>
-      <w:t>MCDI504</w:t>
-    </w:r>
-    <w:proofErr w:type="spellEnd"/>
-    <w:r>
-      <w:rPr>
-        <w:color w:val="595959"/>
-        <w:sz w:val="18"/>
-      </w:rPr>
-      <w:t xml:space="preserve"> · Machine Learning I · Avance Fase 1 · Grupo 5</w:t>
+      <w:t>MCDI504 · Machine Learning I · Avance Fase 1 · Grupo 5</w:t>
     </w:r>
   </w:p>
 </w:hdr>
 </file>
 
 <file path=word/numbering.xml><?xml version="1.0" encoding="utf-8"?>
-<w:numbering xmlns:wpc="http://schemas.microsoft.com/office/word/2010/wordprocessingCanvas" xmlns:cx="http://schemas.microsoft.com/office/drawing/2014/chartex" xmlns:cx1="http://schemas.microsoft.com/office/drawing/2015/9/8/chartex" xmlns:cx2="http://schemas.microsoft.com/office/drawing/2015/10/21/chartex" xmlns:cx3="http://schemas.microsoft.com/office/drawing/2016/5/9/chartex" xmlns:cx4="http://schemas.microsoft.com/office/drawing/2016/5/10/chartex" xmlns:cx5="http://schemas.microsoft.com/office/drawing/2016/5/11/chartex" xmlns:cx6="http://schemas.microsoft.com/office/drawing/2016/5/12/chartex" xmlns:cx7="http://schemas.microsoft.com/office/drawing/2016/5/13/chartex" xmlns:cx8="http://schemas.microsoft.com/office/drawing/2016/5/14/chartex" xmlns:mc="http://schemas.openxmlformats.org/markup-compatibility/2006" xmlns:m="http://schemas.openxmlformats.org/officeDocument/2006/math" xmlns:aink="http://schemas.microsoft.com/office/drawing/2016/ink" xmlns:am3d="http://schemas.microsoft.com/office/drawing/2017/model3d" xmlns:oel="http://schemas.microsoft.com/office/2019/extlst" xmlns:r="http://schemas.openxmlformats.org/officeDocument/2006/relationships" xmlns:wp14="http://schemas.microsoft.com/office/word/2010/wordprocessingDrawing" xmlns:wp="http://schemas.openxmlformats.org/drawingml/2006/wordprocessingDrawing" xmlns:wpg="http://schemas.microsoft.com/office/word/2010/wordprocessingGroup" xmlns:wpi="http://schemas.microsoft.com/office/word/2010/wordprocessingInk" xmlns:wps="http://schemas.microsoft.com/office/word/2010/wordprocessingShape" xmlns:o="urn:schemas-microsoft-com:office:office" xmlns:v="urn:schemas-microsoft-com:vml" xmlns:w10="urn:schemas-microsoft-com:office:word" xmlns:w="http://schemas.openxmlformats.org/wordprocessingml/2006/main" xmlns:w14="http://schemas.microsoft.com/office/word/2010/wordml" xmlns:w15="http://schemas.microsoft.com/office/word/2012/wordml" xmlns:w16cei="http://schemas.microsoft.com/office/word/2026/wordml/cei" xmlns:w16cex="http://schemas.microsoft.com/office/word/2018/wordml/cex" xmlns:w16cid="http://schemas.microsoft.com/office/word/2016/wordml/cid" xmlns:w16="http://schemas.microsoft.com/office/word/2018/wordml" xmlns:w16sdtdh="http://schemas.microsoft.com/office/word/2020/wordml/sdtdatahash" xmlns:w16sdtfl="http://schemas.microsoft.com/office/word/2024/wordml/sdtformatlock" xmlns:w16se="http://schemas.microsoft.com/office/word/2015/wordml/symex" xmlns:w16du="http://schemas.microsoft.com/office/word/2023/wordml/word16du" xmlns:wne="http://schemas.microsoft.com/office/word/2006/wordml" mc:Ignorable="w14 w15 w16se w16cid w16 w16cex w16sdtdh w16sdtfl w16du wp14">
+<w:numbering xmlns:wpc="http://schemas.microsoft.com/office/word/2010/wordprocessingCanvas" xmlns:cx="http://schemas.microsoft.com/office/drawing/2014/chartex" xmlns:cx1="http://schemas.microsoft.com/office/drawing/2015/9/8/chartex" xmlns:cx2="http://schemas.microsoft.com/office/drawing/2015/10/21/chartex" xmlns:cx3="http://schemas.microsoft.com/office/drawing/2016/5/9/chartex" xmlns:cx4="http://schemas.microsoft.com/office/drawing/2016/5/10/chartex" xmlns:cx5="http://schemas.microsoft.com/office/drawing/2016/5/11/chartex" xmlns:cx6="http://schemas.microsoft.com/office/drawing/2016/5/12/chartex" xmlns:cx7="http://schemas.microsoft.com/office/drawing/2016/5/13/chartex" xmlns:cx8="http://schemas.microsoft.com/office/drawing/2016/5/14/chartex" xmlns:mc="http://schemas.openxmlformats.org/markup-compatibility/2006" xmlns:aink="http://schemas.microsoft.com/office/drawing/2016/ink" xmlns:am3d="http://schemas.microsoft.com/office/drawing/2017/model3d" xmlns:o="urn:schemas-microsoft-com:office:office" xmlns:oel="http://schemas.microsoft.com/office/2019/extlst" xmlns:r="http://schemas.openxmlformats.org/officeDocument/2006/relationships" xmlns:m="http://schemas.openxmlformats.org/officeDocument/2006/math" xmlns:v="urn:schemas-microsoft-com:vml" xmlns:wp14="http://schemas.microsoft.com/office/word/2010/wordprocessingDrawing" xmlns:wp="http://schemas.openxmlformats.org/drawingml/2006/wordprocessingDrawing" xmlns:w10="urn:schemas-microsoft-com:office:word" xmlns:w="http://schemas.openxmlformats.org/wordprocessingml/2006/main" xmlns:w14="http://schemas.microsoft.com/office/word/2010/wordml" xmlns:w15="http://schemas.microsoft.com/office/word/2012/wordml" xmlns:w16cei="http://schemas.microsoft.com/office/word/2026/wordml/cei" xmlns:w16cex="http://schemas.microsoft.com/office/word/2018/wordml/cex" xmlns:w16cid="http://schemas.microsoft.com/office/word/2016/wordml/cid" xmlns:w16="http://schemas.microsoft.com/office/word/2018/wordml" xmlns:w16du="http://schemas.microsoft.com/office/word/2023/wordml/word16du" xmlns:w16sdtdh="http://schemas.microsoft.com/office/word/2020/wordml/sdtdatahash" xmlns:w16sdtfl="http://schemas.microsoft.com/office/word/2024/wordml/sdtformatlock" xmlns:w16se="http://schemas.microsoft.com/office/word/2015/wordml/symex" xmlns:wpg="http://schemas.microsoft.com/office/word/2010/wordprocessingGroup" xmlns:wpi="http://schemas.microsoft.com/office/word/2010/wordprocessingInk" xmlns:wne="http://schemas.microsoft.com/office/word/2006/wordml" xmlns:wps="http://schemas.microsoft.com/office/word/2010/wordprocessingShape" mc:Ignorable="w14 w15 w16se w16cid w16 w16cex w16sdtdh w16sdtfl w16du wp14">
   <w:abstractNum w:abstractNumId="0" w15:restartNumberingAfterBreak="0">
     <w:nsid w:val="FFFFFF7C"/>
     <w:multiLevelType w:val="singleLevel"/>
@@ -6962,7 +7712,7 @@
     <w:lvl w:ilvl="0">
       <w:start w:val="1"/>
       <w:numFmt w:val="decimal"/>
-      <w:pStyle w:val="ListNumber3"/>
+      <w:pStyle w:val="Listaconnmeros3"/>
       <w:lvlText w:val="%1."/>
       <w:lvlJc w:val="left"/>
       <w:pPr>
@@ -6980,7 +7730,7 @@
     <w:lvl w:ilvl="0">
       <w:start w:val="1"/>
       <w:numFmt w:val="decimal"/>
-      <w:pStyle w:val="ListNumber2"/>
+      <w:pStyle w:val="Listaconnmeros2"/>
       <w:lvlText w:val="%1."/>
       <w:lvlJc w:val="left"/>
       <w:pPr>
@@ -7018,7 +7768,7 @@
     <w:lvl w:ilvl="0">
       <w:start w:val="1"/>
       <w:numFmt w:val="bullet"/>
-      <w:pStyle w:val="ListBullet3"/>
+      <w:pStyle w:val="Listaconvietas3"/>
       <w:lvlText w:val=""/>
       <w:lvlJc w:val="left"/>
       <w:pPr>
@@ -7039,7 +7789,7 @@
     <w:lvl w:ilvl="0">
       <w:start w:val="1"/>
       <w:numFmt w:val="bullet"/>
-      <w:pStyle w:val="ListBullet2"/>
+      <w:pStyle w:val="Listaconvietas2"/>
       <w:lvlText w:val=""/>
       <w:lvlJc w:val="left"/>
       <w:pPr>
@@ -7060,7 +7810,7 @@
     <w:lvl w:ilvl="0">
       <w:start w:val="1"/>
       <w:numFmt w:val="decimal"/>
-      <w:pStyle w:val="ListNumber"/>
+      <w:pStyle w:val="Listaconnmeros"/>
       <w:lvlText w:val="%1."/>
       <w:lvlJc w:val="left"/>
       <w:pPr>
@@ -7078,7 +7828,7 @@
     <w:lvl w:ilvl="0">
       <w:start w:val="1"/>
       <w:numFmt w:val="bullet"/>
-      <w:pStyle w:val="ListBullet"/>
+      <w:pStyle w:val="Listaconvietas"/>
       <w:lvlText w:val=""/>
       <w:lvlJc w:val="left"/>
       <w:pPr>
@@ -7123,7 +7873,7 @@
 </file>
 
 <file path=word/styles.xml><?xml version="1.0" encoding="utf-8"?>
-<w:styles xmlns:mc="http://schemas.openxmlformats.org/markup-compatibility/2006" xmlns:r="http://schemas.openxmlformats.org/officeDocument/2006/relationships" xmlns:w="http://schemas.openxmlformats.org/wordprocessingml/2006/main" xmlns:w14="http://schemas.microsoft.com/office/word/2010/wordml" xmlns:w15="http://schemas.microsoft.com/office/word/2012/wordml" xmlns:w16cex="http://schemas.microsoft.com/office/word/2018/wordml/cex" xmlns:w16cid="http://schemas.microsoft.com/office/word/2016/wordml/cid" xmlns:w16="http://schemas.microsoft.com/office/word/2018/wordml" xmlns:w16sdtdh="http://schemas.microsoft.com/office/word/2020/wordml/sdtdatahash" xmlns:w16sdtfl="http://schemas.microsoft.com/office/word/2024/wordml/sdtformatlock" xmlns:w16se="http://schemas.microsoft.com/office/word/2015/wordml/symex" xmlns:w16du="http://schemas.microsoft.com/office/word/2023/wordml/word16du" mc:Ignorable="w14 w15 w16se w16cid w16 w16cex w16sdtdh w16sdtfl w16du">
+<w:styles xmlns:mc="http://schemas.openxmlformats.org/markup-compatibility/2006" xmlns:r="http://schemas.openxmlformats.org/officeDocument/2006/relationships" xmlns:w="http://schemas.openxmlformats.org/wordprocessingml/2006/main" xmlns:w14="http://schemas.microsoft.com/office/word/2010/wordml" xmlns:w15="http://schemas.microsoft.com/office/word/2012/wordml" xmlns:w16cex="http://schemas.microsoft.com/office/word/2018/wordml/cex" xmlns:w16cid="http://schemas.microsoft.com/office/word/2016/wordml/cid" xmlns:w16="http://schemas.microsoft.com/office/word/2018/wordml" xmlns:w16du="http://schemas.microsoft.com/office/word/2023/wordml/word16du" xmlns:w16sdtdh="http://schemas.microsoft.com/office/word/2020/wordml/sdtdatahash" xmlns:w16sdtfl="http://schemas.microsoft.com/office/word/2024/wordml/sdtformatlock" xmlns:w16se="http://schemas.microsoft.com/office/word/2015/wordml/symex" mc:Ignorable="w14 w15 w16se w16cid w16 w16cex w16sdtdh w16sdtfl w16du">
   <w:docDefaults>
     <w:rPrDefault>
       <w:rPr>
@@ -7519,11 +8269,11 @@
       <w:rFonts w:ascii="Arial" w:hAnsi="Arial"/>
     </w:rPr>
   </w:style>
-  <w:style w:type="paragraph" w:styleId="Heading1">
+  <w:style w:type="paragraph" w:styleId="Ttulo1">
     <w:name w:val="heading 1"/>
     <w:basedOn w:val="Normal"/>
     <w:next w:val="Normal"/>
-    <w:link w:val="Heading1Char"/>
+    <w:link w:val="Ttulo1Car"/>
     <w:uiPriority w:val="9"/>
     <w:qFormat/>
     <w:rsid w:val="00FC693F"/>
@@ -7542,11 +8292,11 @@
       <w:szCs w:val="28"/>
     </w:rPr>
   </w:style>
-  <w:style w:type="paragraph" w:styleId="Heading2">
+  <w:style w:type="paragraph" w:styleId="Ttulo2">
     <w:name w:val="heading 2"/>
     <w:basedOn w:val="Normal"/>
     <w:next w:val="Normal"/>
-    <w:link w:val="Heading2Char"/>
+    <w:link w:val="Ttulo2Car"/>
     <w:uiPriority w:val="9"/>
     <w:unhideWhenUsed/>
     <w:qFormat/>
@@ -7566,11 +8316,11 @@
       <w:szCs w:val="26"/>
     </w:rPr>
   </w:style>
-  <w:style w:type="paragraph" w:styleId="Heading3">
+  <w:style w:type="paragraph" w:styleId="Ttulo3">
     <w:name w:val="heading 3"/>
     <w:basedOn w:val="Normal"/>
     <w:next w:val="Normal"/>
-    <w:link w:val="Heading3Char"/>
+    <w:link w:val="Ttulo3Car"/>
     <w:uiPriority w:val="9"/>
     <w:unhideWhenUsed/>
     <w:qFormat/>
@@ -7588,11 +8338,11 @@
       <w:color w:val="4F81BD" w:themeColor="accent1"/>
     </w:rPr>
   </w:style>
-  <w:style w:type="paragraph" w:styleId="Heading4">
+  <w:style w:type="paragraph" w:styleId="Ttulo4">
     <w:name w:val="heading 4"/>
     <w:basedOn w:val="Normal"/>
     <w:next w:val="Normal"/>
-    <w:link w:val="Heading4Char"/>
+    <w:link w:val="Ttulo4Car"/>
     <w:uiPriority w:val="9"/>
     <w:semiHidden/>
     <w:unhideWhenUsed/>
@@ -7613,11 +8363,11 @@
       <w:color w:val="4F81BD" w:themeColor="accent1"/>
     </w:rPr>
   </w:style>
-  <w:style w:type="paragraph" w:styleId="Heading5">
+  <w:style w:type="paragraph" w:styleId="Ttulo5">
     <w:name w:val="heading 5"/>
     <w:basedOn w:val="Normal"/>
     <w:next w:val="Normal"/>
-    <w:link w:val="Heading5Char"/>
+    <w:link w:val="Ttulo5Car"/>
     <w:uiPriority w:val="9"/>
     <w:semiHidden/>
     <w:unhideWhenUsed/>
@@ -7634,11 +8384,11 @@
       <w:color w:val="243F60" w:themeColor="accent1" w:themeShade="7F"/>
     </w:rPr>
   </w:style>
-  <w:style w:type="paragraph" w:styleId="Heading6">
+  <w:style w:type="paragraph" w:styleId="Ttulo6">
     <w:name w:val="heading 6"/>
     <w:basedOn w:val="Normal"/>
     <w:next w:val="Normal"/>
-    <w:link w:val="Heading6Char"/>
+    <w:link w:val="Ttulo6Car"/>
     <w:uiPriority w:val="9"/>
     <w:semiHidden/>
     <w:unhideWhenUsed/>
@@ -7657,11 +8407,11 @@
       <w:color w:val="243F60" w:themeColor="accent1" w:themeShade="7F"/>
     </w:rPr>
   </w:style>
-  <w:style w:type="paragraph" w:styleId="Heading7">
+  <w:style w:type="paragraph" w:styleId="Ttulo7">
     <w:name w:val="heading 7"/>
     <w:basedOn w:val="Normal"/>
     <w:next w:val="Normal"/>
-    <w:link w:val="Heading7Char"/>
+    <w:link w:val="Ttulo7Car"/>
     <w:uiPriority w:val="9"/>
     <w:semiHidden/>
     <w:unhideWhenUsed/>
@@ -7680,11 +8430,11 @@
       <w:color w:val="404040" w:themeColor="text1" w:themeTint="BF"/>
     </w:rPr>
   </w:style>
-  <w:style w:type="paragraph" w:styleId="Heading8">
+  <w:style w:type="paragraph" w:styleId="Ttulo8">
     <w:name w:val="heading 8"/>
     <w:basedOn w:val="Normal"/>
     <w:next w:val="Normal"/>
-    <w:link w:val="Heading8Char"/>
+    <w:link w:val="Ttulo8Car"/>
     <w:uiPriority w:val="9"/>
     <w:semiHidden/>
     <w:unhideWhenUsed/>
@@ -7703,11 +8453,11 @@
       <w:szCs w:val="20"/>
     </w:rPr>
   </w:style>
-  <w:style w:type="paragraph" w:styleId="Heading9">
+  <w:style w:type="paragraph" w:styleId="Ttulo9">
     <w:name w:val="heading 9"/>
     <w:basedOn w:val="Normal"/>
     <w:next w:val="Normal"/>
-    <w:link w:val="Heading9Char"/>
+    <w:link w:val="Ttulo9Car"/>
     <w:uiPriority w:val="9"/>
     <w:semiHidden/>
     <w:unhideWhenUsed/>
@@ -7728,13 +8478,12 @@
       <w:szCs w:val="20"/>
     </w:rPr>
   </w:style>
-  <w:style w:type="character" w:default="1" w:styleId="DefaultParagraphFont">
+  <w:style w:type="character" w:default="1" w:styleId="Fuentedeprrafopredeter">
     <w:name w:val="Default Paragraph Font"/>
     <w:uiPriority w:val="1"/>
-    <w:semiHidden/>
     <w:unhideWhenUsed/>
   </w:style>
-  <w:style w:type="table" w:default="1" w:styleId="TableNormal">
+  <w:style w:type="table" w:default="1" w:styleId="Tablanormal">
     <w:name w:val="Normal Table"/>
     <w:uiPriority w:val="99"/>
     <w:semiHidden/>
@@ -7749,16 +8498,16 @@
       </w:tblCellMar>
     </w:tblPr>
   </w:style>
-  <w:style w:type="numbering" w:default="1" w:styleId="NoList">
+  <w:style w:type="numbering" w:default="1" w:styleId="Sinlista">
     <w:name w:val="No List"/>
     <w:uiPriority w:val="99"/>
     <w:semiHidden/>
     <w:unhideWhenUsed/>
   </w:style>
-  <w:style w:type="paragraph" w:styleId="Header">
+  <w:style w:type="paragraph" w:styleId="Encabezado">
     <w:name w:val="header"/>
     <w:basedOn w:val="Normal"/>
-    <w:link w:val="HeaderChar"/>
+    <w:link w:val="EncabezadoCar"/>
     <w:uiPriority w:val="99"/>
     <w:unhideWhenUsed/>
     <w:rsid w:val="00E618BF"/>
@@ -7770,17 +8519,17 @@
       <w:spacing w:after="0" w:line="240" w:lineRule="auto"/>
     </w:pPr>
   </w:style>
-  <w:style w:type="character" w:customStyle="1" w:styleId="HeaderChar">
-    <w:name w:val="Header Char"/>
-    <w:basedOn w:val="DefaultParagraphFont"/>
-    <w:link w:val="Header"/>
+  <w:style w:type="character" w:customStyle="1" w:styleId="EncabezadoCar">
+    <w:name w:val="Encabezado Car"/>
+    <w:basedOn w:val="Fuentedeprrafopredeter"/>
+    <w:link w:val="Encabezado"/>
     <w:uiPriority w:val="99"/>
     <w:rsid w:val="00E618BF"/>
   </w:style>
-  <w:style w:type="paragraph" w:styleId="Footer">
+  <w:style w:type="paragraph" w:styleId="Piedepgina">
     <w:name w:val="footer"/>
     <w:basedOn w:val="Normal"/>
-    <w:link w:val="FooterChar"/>
+    <w:link w:val="PiedepginaCar"/>
     <w:uiPriority w:val="99"/>
     <w:unhideWhenUsed/>
     <w:rsid w:val="00E618BF"/>
@@ -7792,14 +8541,14 @@
       <w:spacing w:after="0" w:line="240" w:lineRule="auto"/>
     </w:pPr>
   </w:style>
-  <w:style w:type="character" w:customStyle="1" w:styleId="FooterChar">
-    <w:name w:val="Footer Char"/>
-    <w:basedOn w:val="DefaultParagraphFont"/>
-    <w:link w:val="Footer"/>
+  <w:style w:type="character" w:customStyle="1" w:styleId="PiedepginaCar">
+    <w:name w:val="Pie de página Car"/>
+    <w:basedOn w:val="Fuentedeprrafopredeter"/>
+    <w:link w:val="Piedepgina"/>
     <w:uiPriority w:val="99"/>
     <w:rsid w:val="00E618BF"/>
   </w:style>
-  <w:style w:type="paragraph" w:styleId="NoSpacing">
+  <w:style w:type="paragraph" w:styleId="Sinespaciado">
     <w:name w:val="No Spacing"/>
     <w:uiPriority w:val="1"/>
     <w:qFormat/>
@@ -7808,10 +8557,10 @@
       <w:spacing w:after="0" w:line="240" w:lineRule="auto"/>
     </w:pPr>
   </w:style>
-  <w:style w:type="character" w:customStyle="1" w:styleId="Heading1Char">
-    <w:name w:val="Heading 1 Char"/>
-    <w:basedOn w:val="DefaultParagraphFont"/>
-    <w:link w:val="Heading1"/>
+  <w:style w:type="character" w:customStyle="1" w:styleId="Ttulo1Car">
+    <w:name w:val="Título 1 Car"/>
+    <w:basedOn w:val="Fuentedeprrafopredeter"/>
+    <w:link w:val="Ttulo1"/>
     <w:uiPriority w:val="9"/>
     <w:rsid w:val="00FC693F"/>
     <w:rPr>
@@ -7823,10 +8572,10 @@
       <w:szCs w:val="28"/>
     </w:rPr>
   </w:style>
-  <w:style w:type="character" w:customStyle="1" w:styleId="Heading2Char">
-    <w:name w:val="Heading 2 Char"/>
-    <w:basedOn w:val="DefaultParagraphFont"/>
-    <w:link w:val="Heading2"/>
+  <w:style w:type="character" w:customStyle="1" w:styleId="Ttulo2Car">
+    <w:name w:val="Título 2 Car"/>
+    <w:basedOn w:val="Fuentedeprrafopredeter"/>
+    <w:link w:val="Ttulo2"/>
     <w:uiPriority w:val="9"/>
     <w:rsid w:val="00FC693F"/>
     <w:rPr>
@@ -7838,10 +8587,10 @@
       <w:szCs w:val="26"/>
     </w:rPr>
   </w:style>
-  <w:style w:type="character" w:customStyle="1" w:styleId="Heading3Char">
-    <w:name w:val="Heading 3 Char"/>
-    <w:basedOn w:val="DefaultParagraphFont"/>
-    <w:link w:val="Heading3"/>
+  <w:style w:type="character" w:customStyle="1" w:styleId="Ttulo3Car">
+    <w:name w:val="Título 3 Car"/>
+    <w:basedOn w:val="Fuentedeprrafopredeter"/>
+    <w:link w:val="Ttulo3"/>
     <w:uiPriority w:val="9"/>
     <w:rsid w:val="00FC693F"/>
     <w:rPr>
@@ -7851,11 +8600,11 @@
       <w:color w:val="4F81BD" w:themeColor="accent1"/>
     </w:rPr>
   </w:style>
-  <w:style w:type="paragraph" w:styleId="Title">
+  <w:style w:type="paragraph" w:styleId="Ttulo">
     <w:name w:val="Title"/>
     <w:basedOn w:val="Normal"/>
     <w:next w:val="Normal"/>
-    <w:link w:val="TitleChar"/>
+    <w:link w:val="TtuloCar"/>
     <w:uiPriority w:val="10"/>
     <w:qFormat/>
     <w:rsid w:val="00FC693F"/>
@@ -7875,10 +8624,10 @@
       <w:szCs w:val="52"/>
     </w:rPr>
   </w:style>
-  <w:style w:type="character" w:customStyle="1" w:styleId="TitleChar">
-    <w:name w:val="Title Char"/>
-    <w:basedOn w:val="DefaultParagraphFont"/>
-    <w:link w:val="Title"/>
+  <w:style w:type="character" w:customStyle="1" w:styleId="TtuloCar">
+    <w:name w:val="Título Car"/>
+    <w:basedOn w:val="Fuentedeprrafopredeter"/>
+    <w:link w:val="Ttulo"/>
     <w:uiPriority w:val="10"/>
     <w:rsid w:val="00FC693F"/>
     <w:rPr>
@@ -7890,11 +8639,11 @@
       <w:szCs w:val="52"/>
     </w:rPr>
   </w:style>
-  <w:style w:type="paragraph" w:styleId="Subtitle">
+  <w:style w:type="paragraph" w:styleId="Subttulo">
     <w:name w:val="Subtitle"/>
     <w:basedOn w:val="Normal"/>
     <w:next w:val="Normal"/>
-    <w:link w:val="SubtitleChar"/>
+    <w:link w:val="SubttuloCar"/>
     <w:uiPriority w:val="11"/>
     <w:qFormat/>
     <w:rsid w:val="00FC693F"/>
@@ -7913,10 +8662,10 @@
       <w:szCs w:val="24"/>
     </w:rPr>
   </w:style>
-  <w:style w:type="character" w:customStyle="1" w:styleId="SubtitleChar">
-    <w:name w:val="Subtitle Char"/>
-    <w:basedOn w:val="DefaultParagraphFont"/>
-    <w:link w:val="Subtitle"/>
+  <w:style w:type="character" w:customStyle="1" w:styleId="SubttuloCar">
+    <w:name w:val="Subtítulo Car"/>
+    <w:basedOn w:val="Fuentedeprrafopredeter"/>
+    <w:link w:val="Subttulo"/>
     <w:uiPriority w:val="11"/>
     <w:rsid w:val="00FC693F"/>
     <w:rPr>
@@ -7929,7 +8678,7 @@
       <w:szCs w:val="24"/>
     </w:rPr>
   </w:style>
-  <w:style w:type="paragraph" w:styleId="ListParagraph">
+  <w:style w:type="paragraph" w:styleId="Prrafodelista">
     <w:name w:val="List Paragraph"/>
     <w:basedOn w:val="Normal"/>
     <w:uiPriority w:val="34"/>
@@ -7940,10 +8689,10 @@
       <w:contextualSpacing/>
     </w:pPr>
   </w:style>
-  <w:style w:type="paragraph" w:styleId="BodyText">
+  <w:style w:type="paragraph" w:styleId="Textoindependiente">
     <w:name w:val="Body Text"/>
     <w:basedOn w:val="Normal"/>
-    <w:link w:val="BodyTextChar"/>
+    <w:link w:val="TextoindependienteCar"/>
     <w:uiPriority w:val="99"/>
     <w:unhideWhenUsed/>
     <w:rsid w:val="00AA1D8D"/>
@@ -7951,17 +8700,17 @@
       <w:spacing w:after="120"/>
     </w:pPr>
   </w:style>
-  <w:style w:type="character" w:customStyle="1" w:styleId="BodyTextChar">
-    <w:name w:val="Body Text Char"/>
-    <w:basedOn w:val="DefaultParagraphFont"/>
-    <w:link w:val="BodyText"/>
+  <w:style w:type="character" w:customStyle="1" w:styleId="TextoindependienteCar">
+    <w:name w:val="Texto independiente Car"/>
+    <w:basedOn w:val="Fuentedeprrafopredeter"/>
+    <w:link w:val="Textoindependiente"/>
     <w:uiPriority w:val="99"/>
     <w:rsid w:val="00AA1D8D"/>
   </w:style>
-  <w:style w:type="paragraph" w:styleId="BodyText2">
+  <w:style w:type="paragraph" w:styleId="Textoindependiente2">
     <w:name w:val="Body Text 2"/>
     <w:basedOn w:val="Normal"/>
-    <w:link w:val="BodyText2Char"/>
+    <w:link w:val="Textoindependiente2Car"/>
     <w:uiPriority w:val="99"/>
     <w:unhideWhenUsed/>
     <w:rsid w:val="00AA1D8D"/>
@@ -7969,17 +8718,17 @@
       <w:spacing w:after="120" w:line="480" w:lineRule="auto"/>
     </w:pPr>
   </w:style>
-  <w:style w:type="character" w:customStyle="1" w:styleId="BodyText2Char">
-    <w:name w:val="Body Text 2 Char"/>
-    <w:basedOn w:val="DefaultParagraphFont"/>
-    <w:link w:val="BodyText2"/>
+  <w:style w:type="character" w:customStyle="1" w:styleId="Textoindependiente2Car">
+    <w:name w:val="Texto independiente 2 Car"/>
+    <w:basedOn w:val="Fuentedeprrafopredeter"/>
+    <w:link w:val="Textoindependiente2"/>
     <w:uiPriority w:val="99"/>
     <w:rsid w:val="00AA1D8D"/>
   </w:style>
-  <w:style w:type="paragraph" w:styleId="BodyText3">
+  <w:style w:type="paragraph" w:styleId="Textoindependiente3">
     <w:name w:val="Body Text 3"/>
     <w:basedOn w:val="Normal"/>
-    <w:link w:val="BodyText3Char"/>
+    <w:link w:val="Textoindependiente3Car"/>
     <w:uiPriority w:val="99"/>
     <w:unhideWhenUsed/>
     <w:rsid w:val="00AA1D8D"/>
@@ -7991,10 +8740,10 @@
       <w:szCs w:val="16"/>
     </w:rPr>
   </w:style>
-  <w:style w:type="character" w:customStyle="1" w:styleId="BodyText3Char">
-    <w:name w:val="Body Text 3 Char"/>
-    <w:basedOn w:val="DefaultParagraphFont"/>
-    <w:link w:val="BodyText3"/>
+  <w:style w:type="character" w:customStyle="1" w:styleId="Textoindependiente3Car">
+    <w:name w:val="Texto independiente 3 Car"/>
+    <w:basedOn w:val="Fuentedeprrafopredeter"/>
+    <w:link w:val="Textoindependiente3"/>
     <w:uiPriority w:val="99"/>
     <w:rsid w:val="00AA1D8D"/>
     <w:rPr>
@@ -8002,7 +8751,7 @@
       <w:szCs w:val="16"/>
     </w:rPr>
   </w:style>
-  <w:style w:type="paragraph" w:styleId="List">
+  <w:style w:type="paragraph" w:styleId="Lista">
     <w:name w:val="List"/>
     <w:basedOn w:val="Normal"/>
     <w:uiPriority w:val="99"/>
@@ -8013,7 +8762,7 @@
       <w:contextualSpacing/>
     </w:pPr>
   </w:style>
-  <w:style w:type="paragraph" w:styleId="List2">
+  <w:style w:type="paragraph" w:styleId="Lista2">
     <w:name w:val="List 2"/>
     <w:basedOn w:val="Normal"/>
     <w:uiPriority w:val="99"/>
@@ -8024,7 +8773,7 @@
       <w:contextualSpacing/>
     </w:pPr>
   </w:style>
-  <w:style w:type="paragraph" w:styleId="List3">
+  <w:style w:type="paragraph" w:styleId="Lista3">
     <w:name w:val="List 3"/>
     <w:basedOn w:val="Normal"/>
     <w:uiPriority w:val="99"/>
@@ -8035,7 +8784,7 @@
       <w:contextualSpacing/>
     </w:pPr>
   </w:style>
-  <w:style w:type="paragraph" w:styleId="ListBullet">
+  <w:style w:type="paragraph" w:styleId="Listaconvietas">
     <w:name w:val="List Bullet"/>
     <w:basedOn w:val="Normal"/>
     <w:uiPriority w:val="99"/>
@@ -8048,7 +8797,7 @@
       <w:contextualSpacing/>
     </w:pPr>
   </w:style>
-  <w:style w:type="paragraph" w:styleId="ListBullet2">
+  <w:style w:type="paragraph" w:styleId="Listaconvietas2">
     <w:name w:val="List Bullet 2"/>
     <w:basedOn w:val="Normal"/>
     <w:uiPriority w:val="99"/>
@@ -8061,7 +8810,7 @@
       <w:contextualSpacing/>
     </w:pPr>
   </w:style>
-  <w:style w:type="paragraph" w:styleId="ListBullet3">
+  <w:style w:type="paragraph" w:styleId="Listaconvietas3">
     <w:name w:val="List Bullet 3"/>
     <w:basedOn w:val="Normal"/>
     <w:uiPriority w:val="99"/>
@@ -8074,7 +8823,7 @@
       <w:contextualSpacing/>
     </w:pPr>
   </w:style>
-  <w:style w:type="paragraph" w:styleId="ListNumber">
+  <w:style w:type="paragraph" w:styleId="Listaconnmeros">
     <w:name w:val="List Number"/>
     <w:basedOn w:val="Normal"/>
     <w:uiPriority w:val="99"/>
@@ -8087,7 +8836,7 @@
       <w:contextualSpacing/>
     </w:pPr>
   </w:style>
-  <w:style w:type="paragraph" w:styleId="ListNumber2">
+  <w:style w:type="paragraph" w:styleId="Listaconnmeros2">
     <w:name w:val="List Number 2"/>
     <w:basedOn w:val="Normal"/>
     <w:uiPriority w:val="99"/>
@@ -8100,7 +8849,7 @@
       <w:contextualSpacing/>
     </w:pPr>
   </w:style>
-  <w:style w:type="paragraph" w:styleId="ListNumber3">
+  <w:style w:type="paragraph" w:styleId="Listaconnmeros3">
     <w:name w:val="List Number 3"/>
     <w:basedOn w:val="Normal"/>
     <w:uiPriority w:val="99"/>
@@ -8113,7 +8862,7 @@
       <w:contextualSpacing/>
     </w:pPr>
   </w:style>
-  <w:style w:type="paragraph" w:styleId="ListContinue">
+  <w:style w:type="paragraph" w:styleId="Continuarlista">
     <w:name w:val="List Continue"/>
     <w:basedOn w:val="Normal"/>
     <w:uiPriority w:val="99"/>
@@ -8125,7 +8874,7 @@
       <w:contextualSpacing/>
     </w:pPr>
   </w:style>
-  <w:style w:type="paragraph" w:styleId="ListContinue2">
+  <w:style w:type="paragraph" w:styleId="Continuarlista2">
     <w:name w:val="List Continue 2"/>
     <w:basedOn w:val="Normal"/>
     <w:uiPriority w:val="99"/>
@@ -8137,7 +8886,7 @@
       <w:contextualSpacing/>
     </w:pPr>
   </w:style>
-  <w:style w:type="paragraph" w:styleId="ListContinue3">
+  <w:style w:type="paragraph" w:styleId="Continuarlista3">
     <w:name w:val="List Continue 3"/>
     <w:basedOn w:val="Normal"/>
     <w:uiPriority w:val="99"/>
@@ -8149,9 +8898,9 @@
       <w:contextualSpacing/>
     </w:pPr>
   </w:style>
-  <w:style w:type="paragraph" w:styleId="MacroText">
+  <w:style w:type="paragraph" w:styleId="Textomacro">
     <w:name w:val="macro"/>
-    <w:link w:val="MacroTextChar"/>
+    <w:link w:val="TextomacroCar"/>
     <w:uiPriority w:val="99"/>
     <w:unhideWhenUsed/>
     <w:rsid w:val="0029639D"/>
@@ -8172,10 +8921,10 @@
       <w:szCs w:val="20"/>
     </w:rPr>
   </w:style>
-  <w:style w:type="character" w:customStyle="1" w:styleId="MacroTextChar">
-    <w:name w:val="Macro Text Char"/>
-    <w:basedOn w:val="DefaultParagraphFont"/>
-    <w:link w:val="MacroText"/>
+  <w:style w:type="character" w:customStyle="1" w:styleId="TextomacroCar">
+    <w:name w:val="Texto macro Car"/>
+    <w:basedOn w:val="Fuentedeprrafopredeter"/>
+    <w:link w:val="Textomacro"/>
     <w:uiPriority w:val="99"/>
     <w:rsid w:val="0029639D"/>
     <w:rPr>
@@ -8184,11 +8933,11 @@
       <w:szCs w:val="20"/>
     </w:rPr>
   </w:style>
-  <w:style w:type="paragraph" w:styleId="Quote">
+  <w:style w:type="paragraph" w:styleId="Cita">
     <w:name w:val="Quote"/>
     <w:basedOn w:val="Normal"/>
     <w:next w:val="Normal"/>
-    <w:link w:val="QuoteChar"/>
+    <w:link w:val="CitaCar"/>
     <w:uiPriority w:val="29"/>
     <w:qFormat/>
     <w:rsid w:val="00FC693F"/>
@@ -8198,10 +8947,10 @@
       <w:color w:val="000000" w:themeColor="text1"/>
     </w:rPr>
   </w:style>
-  <w:style w:type="character" w:customStyle="1" w:styleId="QuoteChar">
-    <w:name w:val="Quote Char"/>
-    <w:basedOn w:val="DefaultParagraphFont"/>
-    <w:link w:val="Quote"/>
+  <w:style w:type="character" w:customStyle="1" w:styleId="CitaCar">
+    <w:name w:val="Cita Car"/>
+    <w:basedOn w:val="Fuentedeprrafopredeter"/>
+    <w:link w:val="Cita"/>
     <w:uiPriority w:val="29"/>
     <w:rsid w:val="00FC693F"/>
     <w:rPr>
@@ -8210,10 +8959,10 @@
       <w:color w:val="000000" w:themeColor="text1"/>
     </w:rPr>
   </w:style>
-  <w:style w:type="character" w:customStyle="1" w:styleId="Heading4Char">
-    <w:name w:val="Heading 4 Char"/>
-    <w:basedOn w:val="DefaultParagraphFont"/>
-    <w:link w:val="Heading4"/>
+  <w:style w:type="character" w:customStyle="1" w:styleId="Ttulo4Car">
+    <w:name w:val="Título 4 Car"/>
+    <w:basedOn w:val="Fuentedeprrafopredeter"/>
+    <w:link w:val="Ttulo4"/>
     <w:uiPriority w:val="9"/>
     <w:semiHidden/>
     <w:rsid w:val="00FC693F"/>
@@ -8226,10 +8975,10 @@
       <w:color w:val="4F81BD" w:themeColor="accent1"/>
     </w:rPr>
   </w:style>
-  <w:style w:type="character" w:customStyle="1" w:styleId="Heading5Char">
-    <w:name w:val="Heading 5 Char"/>
-    <w:basedOn w:val="DefaultParagraphFont"/>
-    <w:link w:val="Heading5"/>
+  <w:style w:type="character" w:customStyle="1" w:styleId="Ttulo5Car">
+    <w:name w:val="Título 5 Car"/>
+    <w:basedOn w:val="Fuentedeprrafopredeter"/>
+    <w:link w:val="Ttulo5"/>
     <w:uiPriority w:val="9"/>
     <w:semiHidden/>
     <w:rsid w:val="00FC693F"/>
@@ -8238,10 +8987,10 @@
       <w:color w:val="243F60" w:themeColor="accent1" w:themeShade="7F"/>
     </w:rPr>
   </w:style>
-  <w:style w:type="character" w:customStyle="1" w:styleId="Heading6Char">
-    <w:name w:val="Heading 6 Char"/>
-    <w:basedOn w:val="DefaultParagraphFont"/>
-    <w:link w:val="Heading6"/>
+  <w:style w:type="character" w:customStyle="1" w:styleId="Ttulo6Car">
+    <w:name w:val="Título 6 Car"/>
+    <w:basedOn w:val="Fuentedeprrafopredeter"/>
+    <w:link w:val="Ttulo6"/>
     <w:uiPriority w:val="9"/>
     <w:semiHidden/>
     <w:rsid w:val="00FC693F"/>
@@ -8252,10 +9001,10 @@
       <w:color w:val="243F60" w:themeColor="accent1" w:themeShade="7F"/>
     </w:rPr>
   </w:style>
-  <w:style w:type="character" w:customStyle="1" w:styleId="Heading7Char">
-    <w:name w:val="Heading 7 Char"/>
-    <w:basedOn w:val="DefaultParagraphFont"/>
-    <w:link w:val="Heading7"/>
+  <w:style w:type="character" w:customStyle="1" w:styleId="Ttulo7Car">
+    <w:name w:val="Título 7 Car"/>
+    <w:basedOn w:val="Fuentedeprrafopredeter"/>
+    <w:link w:val="Ttulo7"/>
     <w:uiPriority w:val="9"/>
     <w:semiHidden/>
     <w:rsid w:val="00FC693F"/>
@@ -8266,10 +9015,10 @@
       <w:color w:val="404040" w:themeColor="text1" w:themeTint="BF"/>
     </w:rPr>
   </w:style>
-  <w:style w:type="character" w:customStyle="1" w:styleId="Heading8Char">
-    <w:name w:val="Heading 8 Char"/>
-    <w:basedOn w:val="DefaultParagraphFont"/>
-    <w:link w:val="Heading8"/>
+  <w:style w:type="character" w:customStyle="1" w:styleId="Ttulo8Car">
+    <w:name w:val="Título 8 Car"/>
+    <w:basedOn w:val="Fuentedeprrafopredeter"/>
+    <w:link w:val="Ttulo8"/>
     <w:uiPriority w:val="9"/>
     <w:semiHidden/>
     <w:rsid w:val="00FC693F"/>
@@ -8280,10 +9029,10 @@
       <w:szCs w:val="20"/>
     </w:rPr>
   </w:style>
-  <w:style w:type="character" w:customStyle="1" w:styleId="Heading9Char">
-    <w:name w:val="Heading 9 Char"/>
-    <w:basedOn w:val="DefaultParagraphFont"/>
-    <w:link w:val="Heading9"/>
+  <w:style w:type="character" w:customStyle="1" w:styleId="Ttulo9Car">
+    <w:name w:val="Título 9 Car"/>
+    <w:basedOn w:val="Fuentedeprrafopredeter"/>
+    <w:link w:val="Ttulo9"/>
     <w:uiPriority w:val="9"/>
     <w:semiHidden/>
     <w:rsid w:val="00FC693F"/>
@@ -8296,7 +9045,7 @@
       <w:szCs w:val="20"/>
     </w:rPr>
   </w:style>
-  <w:style w:type="paragraph" w:styleId="Caption">
+  <w:style w:type="paragraph" w:styleId="Descripcin">
     <w:name w:val="caption"/>
     <w:basedOn w:val="Normal"/>
     <w:next w:val="Normal"/>
@@ -8316,9 +9065,9 @@
       <w:szCs w:val="18"/>
     </w:rPr>
   </w:style>
-  <w:style w:type="character" w:styleId="Strong">
+  <w:style w:type="character" w:styleId="Fuerte">
     <w:name w:val="Strong"/>
-    <w:basedOn w:val="DefaultParagraphFont"/>
+    <w:basedOn w:val="Fuentedeprrafopredeter"/>
     <w:uiPriority w:val="22"/>
     <w:qFormat/>
     <w:rsid w:val="00FC693F"/>
@@ -8327,9 +9076,9 @@
       <w:bCs/>
     </w:rPr>
   </w:style>
-  <w:style w:type="character" w:styleId="Emphasis">
+  <w:style w:type="character" w:styleId="nfasis">
     <w:name w:val="Emphasis"/>
-    <w:basedOn w:val="DefaultParagraphFont"/>
+    <w:basedOn w:val="Fuentedeprrafopredeter"/>
     <w:uiPriority w:val="20"/>
     <w:qFormat/>
     <w:rsid w:val="00FC693F"/>
@@ -8338,11 +9087,11 @@
       <w:iCs/>
     </w:rPr>
   </w:style>
-  <w:style w:type="paragraph" w:styleId="IntenseQuote">
+  <w:style w:type="paragraph" w:styleId="Citadestacada">
     <w:name w:val="Intense Quote"/>
     <w:basedOn w:val="Normal"/>
     <w:next w:val="Normal"/>
-    <w:link w:val="IntenseQuoteChar"/>
+    <w:link w:val="CitadestacadaCar"/>
     <w:uiPriority w:val="30"/>
     <w:qFormat/>
     <w:rsid w:val="00FC693F"/>
@@ -8361,10 +9110,10 @@
       <w:color w:val="4F81BD" w:themeColor="accent1"/>
     </w:rPr>
   </w:style>
-  <w:style w:type="character" w:customStyle="1" w:styleId="IntenseQuoteChar">
-    <w:name w:val="Intense Quote Char"/>
-    <w:basedOn w:val="DefaultParagraphFont"/>
-    <w:link w:val="IntenseQuote"/>
+  <w:style w:type="character" w:customStyle="1" w:styleId="CitadestacadaCar">
+    <w:name w:val="Cita destacada Car"/>
+    <w:basedOn w:val="Fuentedeprrafopredeter"/>
+    <w:link w:val="Citadestacada"/>
     <w:uiPriority w:val="30"/>
     <w:rsid w:val="00FC693F"/>
     <w:rPr>
@@ -8375,9 +9124,9 @@
       <w:color w:val="4F81BD" w:themeColor="accent1"/>
     </w:rPr>
   </w:style>
-  <w:style w:type="character" w:styleId="SubtleEmphasis">
+  <w:style w:type="character" w:styleId="nfasissutil">
     <w:name w:val="Subtle Emphasis"/>
-    <w:basedOn w:val="DefaultParagraphFont"/>
+    <w:basedOn w:val="Fuentedeprrafopredeter"/>
     <w:uiPriority w:val="19"/>
     <w:qFormat/>
     <w:rsid w:val="00FC693F"/>
@@ -8387,9 +9136,9 @@
       <w:color w:val="808080" w:themeColor="text1" w:themeTint="7F"/>
     </w:rPr>
   </w:style>
-  <w:style w:type="character" w:styleId="IntenseEmphasis">
+  <w:style w:type="character" w:styleId="nfasisintenso">
     <w:name w:val="Intense Emphasis"/>
-    <w:basedOn w:val="DefaultParagraphFont"/>
+    <w:basedOn w:val="Fuentedeprrafopredeter"/>
     <w:uiPriority w:val="21"/>
     <w:qFormat/>
     <w:rsid w:val="00FC693F"/>
@@ -8401,9 +9150,9 @@
       <w:color w:val="4F81BD" w:themeColor="accent1"/>
     </w:rPr>
   </w:style>
-  <w:style w:type="character" w:styleId="SubtleReference">
+  <w:style w:type="character" w:styleId="Referenciasutil">
     <w:name w:val="Subtle Reference"/>
-    <w:basedOn w:val="DefaultParagraphFont"/>
+    <w:basedOn w:val="Fuentedeprrafopredeter"/>
     <w:uiPriority w:val="31"/>
     <w:qFormat/>
     <w:rsid w:val="00FC693F"/>
@@ -8413,9 +9162,9 @@
       <w:u w:val="single"/>
     </w:rPr>
   </w:style>
-  <w:style w:type="character" w:styleId="IntenseReference">
+  <w:style w:type="character" w:styleId="Referenciaintensa">
     <w:name w:val="Intense Reference"/>
-    <w:basedOn w:val="DefaultParagraphFont"/>
+    <w:basedOn w:val="Fuentedeprrafopredeter"/>
     <w:uiPriority w:val="32"/>
     <w:qFormat/>
     <w:rsid w:val="00FC693F"/>
@@ -8428,9 +9177,9 @@
       <w:u w:val="single"/>
     </w:rPr>
   </w:style>
-  <w:style w:type="character" w:styleId="BookTitle">
+  <w:style w:type="character" w:styleId="Ttulodellibro">
     <w:name w:val="Book Title"/>
-    <w:basedOn w:val="DefaultParagraphFont"/>
+    <w:basedOn w:val="Fuentedeprrafopredeter"/>
     <w:uiPriority w:val="33"/>
     <w:qFormat/>
     <w:rsid w:val="00FC693F"/>
@@ -8441,9 +9190,9 @@
       <w:spacing w:val="5"/>
     </w:rPr>
   </w:style>
-  <w:style w:type="paragraph" w:styleId="TOCHeading">
+  <w:style w:type="paragraph" w:styleId="TtuloTDC">
     <w:name w:val="TOC Heading"/>
-    <w:basedOn w:val="Heading1"/>
+    <w:basedOn w:val="Ttulo1"/>
     <w:next w:val="Normal"/>
     <w:uiPriority w:val="39"/>
     <w:semiHidden/>
@@ -8454,9 +9203,9 @@
       <w:outlineLvl w:val="9"/>
     </w:pPr>
   </w:style>
-  <w:style w:type="table" w:styleId="TableGrid">
+  <w:style w:type="table" w:styleId="Tablaconcuadrcula">
     <w:name w:val="Table Grid"/>
-    <w:basedOn w:val="TableNormal"/>
+    <w:basedOn w:val="Tablanormal"/>
     <w:uiPriority w:val="59"/>
     <w:rsid w:val="00FC693F"/>
     <w:pPr>
@@ -8473,9 +9222,9 @@
       </w:tblBorders>
     </w:tblPr>
   </w:style>
-  <w:style w:type="table" w:styleId="LightShading">
+  <w:style w:type="table" w:styleId="Sombreadoclaro">
     <w:name w:val="Light Shading"/>
-    <w:basedOn w:val="TableNormal"/>
+    <w:basedOn w:val="Tablanormal"/>
     <w:uiPriority w:val="60"/>
     <w:rsid w:val="00FC693F"/>
     <w:pPr>
@@ -8569,9 +9318,9 @@
       </w:tcPr>
     </w:tblStylePr>
   </w:style>
-  <w:style w:type="table" w:styleId="LightShading-Accent1">
+  <w:style w:type="table" w:styleId="Sombreadoclaro-nfasis1">
     <w:name w:val="Light Shading Accent 1"/>
-    <w:basedOn w:val="TableNormal"/>
+    <w:basedOn w:val="Tablanormal"/>
     <w:uiPriority w:val="60"/>
     <w:rsid w:val="00FC693F"/>
     <w:pPr>
@@ -8665,9 +9414,9 @@
       </w:tcPr>
     </w:tblStylePr>
   </w:style>
-  <w:style w:type="table" w:styleId="LightShading-Accent2">
+  <w:style w:type="table" w:styleId="Sombreadoclaro-nfasis2">
     <w:name w:val="Light Shading Accent 2"/>
-    <w:basedOn w:val="TableNormal"/>
+    <w:basedOn w:val="Tablanormal"/>
     <w:uiPriority w:val="60"/>
     <w:rsid w:val="00FC693F"/>
     <w:pPr>
@@ -8761,9 +9510,9 @@
       </w:tcPr>
     </w:tblStylePr>
   </w:style>
-  <w:style w:type="table" w:styleId="LightShading-Accent3">
+  <w:style w:type="table" w:styleId="Sombreadoclaro-nfasis3">
     <w:name w:val="Light Shading Accent 3"/>
-    <w:basedOn w:val="TableNormal"/>
+    <w:basedOn w:val="Tablanormal"/>
     <w:uiPriority w:val="60"/>
     <w:rsid w:val="00FC693F"/>
     <w:pPr>
@@ -8857,9 +9606,9 @@
       </w:tcPr>
     </w:tblStylePr>
   </w:style>
-  <w:style w:type="table" w:styleId="LightShading-Accent4">
+  <w:style w:type="table" w:styleId="Sombreadoclaro-nfasis4">
     <w:name w:val="Light Shading Accent 4"/>
-    <w:basedOn w:val="TableNormal"/>
+    <w:basedOn w:val="Tablanormal"/>
     <w:uiPriority w:val="60"/>
     <w:rsid w:val="00FC693F"/>
     <w:pPr>
@@ -8953,9 +9702,9 @@
       </w:tcPr>
     </w:tblStylePr>
   </w:style>
-  <w:style w:type="table" w:styleId="LightShading-Accent5">
+  <w:style w:type="table" w:styleId="Sombreadoclaro-nfasis5">
     <w:name w:val="Light Shading Accent 5"/>
-    <w:basedOn w:val="TableNormal"/>
+    <w:basedOn w:val="Tablanormal"/>
     <w:uiPriority w:val="60"/>
     <w:rsid w:val="00FC693F"/>
     <w:pPr>
@@ -9049,9 +9798,9 @@
       </w:tcPr>
     </w:tblStylePr>
   </w:style>
-  <w:style w:type="table" w:styleId="LightShading-Accent6">
+  <w:style w:type="table" w:styleId="Sombreadoclaro-nfasis6">
     <w:name w:val="Light Shading Accent 6"/>
-    <w:basedOn w:val="TableNormal"/>
+    <w:basedOn w:val="Tablanormal"/>
     <w:uiPriority w:val="60"/>
     <w:rsid w:val="00FC693F"/>
     <w:pPr>
@@ -9145,9 +9894,9 @@
       </w:tcPr>
     </w:tblStylePr>
   </w:style>
-  <w:style w:type="table" w:styleId="LightList">
+  <w:style w:type="table" w:styleId="Listaclara">
     <w:name w:val="Light List"/>
-    <w:basedOn w:val="TableNormal"/>
+    <w:basedOn w:val="Tablanormal"/>
     <w:uiPriority w:val="61"/>
     <w:rsid w:val="00FC693F"/>
     <w:pPr>
@@ -9230,9 +9979,9 @@
       </w:tcPr>
     </w:tblStylePr>
   </w:style>
-  <w:style w:type="table" w:styleId="LightList-Accent1">
+  <w:style w:type="table" w:styleId="Listaclara-nfasis1">
     <w:name w:val="Light List Accent 1"/>
-    <w:basedOn w:val="TableNormal"/>
+    <w:basedOn w:val="Tablanormal"/>
     <w:uiPriority w:val="61"/>
     <w:rsid w:val="00FC693F"/>
     <w:pPr>
@@ -9315,9 +10064,9 @@
       </w:tcPr>
     </w:tblStylePr>
   </w:style>
-  <w:style w:type="table" w:styleId="LightList-Accent2">
+  <w:style w:type="table" w:styleId="Listaclara-nfasis2">
     <w:name w:val="Light List Accent 2"/>
-    <w:basedOn w:val="TableNormal"/>
+    <w:basedOn w:val="Tablanormal"/>
     <w:uiPriority w:val="61"/>
     <w:rsid w:val="00CB0664"/>
     <w:pPr>
@@ -9400,9 +10149,9 @@
       </w:tcPr>
     </w:tblStylePr>
   </w:style>
-  <w:style w:type="table" w:styleId="LightList-Accent3">
+  <w:style w:type="table" w:styleId="Listaclara-nfasis3">
     <w:name w:val="Light List Accent 3"/>
-    <w:basedOn w:val="TableNormal"/>
+    <w:basedOn w:val="Tablanormal"/>
     <w:uiPriority w:val="61"/>
     <w:rsid w:val="00CB0664"/>
     <w:pPr>
@@ -9485,9 +10234,9 @@
       </w:tcPr>
     </w:tblStylePr>
   </w:style>
-  <w:style w:type="table" w:styleId="LightList-Accent4">
+  <w:style w:type="table" w:styleId="Listaclara-nfasis4">
     <w:name w:val="Light List Accent 4"/>
-    <w:basedOn w:val="TableNormal"/>
+    <w:basedOn w:val="Tablanormal"/>
     <w:uiPriority w:val="61"/>
     <w:rsid w:val="00CB0664"/>
     <w:pPr>
@@ -9570,9 +10319,9 @@
       </w:tcPr>
     </w:tblStylePr>
   </w:style>
-  <w:style w:type="table" w:styleId="LightList-Accent5">
+  <w:style w:type="table" w:styleId="Listaclara-nfasis5">
     <w:name w:val="Light List Accent 5"/>
-    <w:basedOn w:val="TableNormal"/>
+    <w:basedOn w:val="Tablanormal"/>
     <w:uiPriority w:val="61"/>
     <w:rsid w:val="00CB0664"/>
     <w:pPr>
@@ -9655,9 +10404,9 @@
       </w:tcPr>
     </w:tblStylePr>
   </w:style>
-  <w:style w:type="table" w:styleId="LightList-Accent6">
+  <w:style w:type="table" w:styleId="Listaclara-nfasis6">
     <w:name w:val="Light List Accent 6"/>
-    <w:basedOn w:val="TableNormal"/>
+    <w:basedOn w:val="Tablanormal"/>
     <w:uiPriority w:val="61"/>
     <w:rsid w:val="00CB0664"/>
     <w:pPr>
@@ -9740,9 +10489,9 @@
       </w:tcPr>
     </w:tblStylePr>
   </w:style>
-  <w:style w:type="table" w:styleId="LightGrid">
+  <w:style w:type="table" w:styleId="Cuadrculaclara">
     <w:name w:val="Light Grid"/>
-    <w:basedOn w:val="TableNormal"/>
+    <w:basedOn w:val="Tablanormal"/>
     <w:uiPriority w:val="62"/>
     <w:rsid w:val="00CB0664"/>
     <w:pPr>
@@ -9863,9 +10612,9 @@
       </w:tcPr>
     </w:tblStylePr>
   </w:style>
-  <w:style w:type="table" w:styleId="LightGrid-Accent1">
+  <w:style w:type="table" w:styleId="Cuadrculaclara-nfasis1">
     <w:name w:val="Light Grid Accent 1"/>
-    <w:basedOn w:val="TableNormal"/>
+    <w:basedOn w:val="Tablanormal"/>
     <w:uiPriority w:val="62"/>
     <w:rsid w:val="00CB0664"/>
     <w:pPr>
@@ -9986,9 +10735,9 @@
       </w:tcPr>
     </w:tblStylePr>
   </w:style>
-  <w:style w:type="table" w:styleId="LightGrid-Accent2">
+  <w:style w:type="table" w:styleId="Cuadrculaclara-nfasis2">
     <w:name w:val="Light Grid Accent 2"/>
-    <w:basedOn w:val="TableNormal"/>
+    <w:basedOn w:val="Tablanormal"/>
     <w:uiPriority w:val="62"/>
     <w:rsid w:val="00CB0664"/>
     <w:pPr>
@@ -10109,9 +10858,9 @@
       </w:tcPr>
     </w:tblStylePr>
   </w:style>
-  <w:style w:type="table" w:styleId="LightGrid-Accent3">
+  <w:style w:type="table" w:styleId="Cuadrculaclara-nfasis3">
     <w:name w:val="Light Grid Accent 3"/>
-    <w:basedOn w:val="TableNormal"/>
+    <w:basedOn w:val="Tablanormal"/>
     <w:uiPriority w:val="62"/>
     <w:rsid w:val="00CB0664"/>
     <w:pPr>
@@ -10232,9 +10981,9 @@
       </w:tcPr>
     </w:tblStylePr>
   </w:style>
-  <w:style w:type="table" w:styleId="LightGrid-Accent4">
+  <w:style w:type="table" w:styleId="Cuadrculaclara-nfasis4">
     <w:name w:val="Light Grid Accent 4"/>
-    <w:basedOn w:val="TableNormal"/>
+    <w:basedOn w:val="Tablanormal"/>
     <w:uiPriority w:val="62"/>
     <w:rsid w:val="00CB0664"/>
     <w:pPr>
@@ -10355,9 +11104,9 @@
       </w:tcPr>
     </w:tblStylePr>
   </w:style>
-  <w:style w:type="table" w:styleId="LightGrid-Accent5">
+  <w:style w:type="table" w:styleId="Cuadrculaclara-nfasis5">
     <w:name w:val="Light Grid Accent 5"/>
-    <w:basedOn w:val="TableNormal"/>
+    <w:basedOn w:val="Tablanormal"/>
     <w:uiPriority w:val="62"/>
     <w:rsid w:val="00CB0664"/>
     <w:pPr>
@@ -10478,9 +11227,9 @@
       </w:tcPr>
     </w:tblStylePr>
   </w:style>
-  <w:style w:type="table" w:styleId="LightGrid-Accent6">
+  <w:style w:type="table" w:styleId="Cuadrculaclara-nfasis6">
     <w:name w:val="Light Grid Accent 6"/>
-    <w:basedOn w:val="TableNormal"/>
+    <w:basedOn w:val="Tablanormal"/>
     <w:uiPriority w:val="62"/>
     <w:rsid w:val="00CB0664"/>
     <w:pPr>
@@ -10601,9 +11350,9 @@
       </w:tcPr>
     </w:tblStylePr>
   </w:style>
-  <w:style w:type="table" w:styleId="MediumShading1">
+  <w:style w:type="table" w:styleId="Sombreadomedio1">
     <w:name w:val="Medium Shading 1"/>
-    <w:basedOn w:val="TableNormal"/>
+    <w:basedOn w:val="Tablanormal"/>
     <w:uiPriority w:val="63"/>
     <w:rsid w:val="00CB0664"/>
     <w:pPr>
@@ -10700,9 +11449,9 @@
       </w:tcPr>
     </w:tblStylePr>
   </w:style>
-  <w:style w:type="table" w:styleId="MediumShading1-Accent1">
+  <w:style w:type="table" w:styleId="Sombreadomedio1-nfasis1">
     <w:name w:val="Medium Shading 1 Accent 1"/>
-    <w:basedOn w:val="TableNormal"/>
+    <w:basedOn w:val="Tablanormal"/>
     <w:uiPriority w:val="63"/>
     <w:rsid w:val="00CB0664"/>
     <w:pPr>
@@ -10799,9 +11548,9 @@
       </w:tcPr>
     </w:tblStylePr>
   </w:style>
-  <w:style w:type="table" w:styleId="MediumShading1-Accent2">
+  <w:style w:type="table" w:styleId="Sombreadomedio1-nfasis2">
     <w:name w:val="Medium Shading 1 Accent 2"/>
-    <w:basedOn w:val="TableNormal"/>
+    <w:basedOn w:val="Tablanormal"/>
     <w:uiPriority w:val="63"/>
     <w:rsid w:val="00CB0664"/>
     <w:pPr>
@@ -10898,9 +11647,9 @@
       </w:tcPr>
     </w:tblStylePr>
   </w:style>
-  <w:style w:type="table" w:styleId="MediumShading1-Accent3">
+  <w:style w:type="table" w:styleId="Sombreadomedio1-nfasis3">
     <w:name w:val="Medium Shading 1 Accent 3"/>
-    <w:basedOn w:val="TableNormal"/>
+    <w:basedOn w:val="Tablanormal"/>
     <w:uiPriority w:val="63"/>
     <w:rsid w:val="00CB0664"/>
     <w:pPr>
@@ -10997,9 +11746,9 @@
       </w:tcPr>
     </w:tblStylePr>
   </w:style>
-  <w:style w:type="table" w:styleId="MediumShading1-Accent4">
+  <w:style w:type="table" w:styleId="Sombreadomedio1-nfasis4">
     <w:name w:val="Medium Shading 1 Accent 4"/>
-    <w:basedOn w:val="TableNormal"/>
+    <w:basedOn w:val="Tablanormal"/>
     <w:uiPriority w:val="63"/>
     <w:rsid w:val="00CB0664"/>
     <w:pPr>
@@ -11096,9 +11845,9 @@
       </w:tcPr>
     </w:tblStylePr>
   </w:style>
-  <w:style w:type="table" w:styleId="MediumShading1-Accent5">
+  <w:style w:type="table" w:styleId="Sombreadomedio1-nfasis5">
     <w:name w:val="Medium Shading 1 Accent 5"/>
-    <w:basedOn w:val="TableNormal"/>
+    <w:basedOn w:val="Tablanormal"/>
     <w:uiPriority w:val="63"/>
     <w:rsid w:val="00CB0664"/>
     <w:pPr>
@@ -11195,9 +11944,9 @@
       </w:tcPr>
     </w:tblStylePr>
   </w:style>
-  <w:style w:type="table" w:styleId="MediumShading1-Accent6">
+  <w:style w:type="table" w:styleId="Sombreadomedio1-nfasis6">
     <w:name w:val="Medium Shading 1 Accent 6"/>
-    <w:basedOn w:val="TableNormal"/>
+    <w:basedOn w:val="Tablanormal"/>
     <w:uiPriority w:val="63"/>
     <w:rsid w:val="00CB0664"/>
     <w:pPr>
@@ -11294,9 +12043,9 @@
       </w:tcPr>
     </w:tblStylePr>
   </w:style>
-  <w:style w:type="table" w:styleId="MediumShading2">
+  <w:style w:type="table" w:styleId="Sombreadomedio2">
     <w:name w:val="Medium Shading 2"/>
-    <w:basedOn w:val="TableNormal"/>
+    <w:basedOn w:val="Tablanormal"/>
     <w:uiPriority w:val="64"/>
     <w:rsid w:val="00CB0664"/>
     <w:pPr>
@@ -11436,9 +12185,9 @@
       </w:tcPr>
     </w:tblStylePr>
   </w:style>
-  <w:style w:type="table" w:styleId="MediumShading2-Accent1">
+  <w:style w:type="table" w:styleId="Sombreadomedio2-nfasis1">
     <w:name w:val="Medium Shading 2 Accent 1"/>
-    <w:basedOn w:val="TableNormal"/>
+    <w:basedOn w:val="Tablanormal"/>
     <w:uiPriority w:val="64"/>
     <w:rsid w:val="00CB0664"/>
     <w:pPr>
@@ -11578,9 +12327,9 @@
       </w:tcPr>
     </w:tblStylePr>
   </w:style>
-  <w:style w:type="table" w:styleId="MediumShading2-Accent2">
+  <w:style w:type="table" w:styleId="Sombreadomedio2-nfasis2">
     <w:name w:val="Medium Shading 2 Accent 2"/>
-    <w:basedOn w:val="TableNormal"/>
+    <w:basedOn w:val="Tablanormal"/>
     <w:uiPriority w:val="64"/>
     <w:rsid w:val="00CB0664"/>
     <w:pPr>
@@ -11720,9 +12469,9 @@
       </w:tcPr>
     </w:tblStylePr>
   </w:style>
-  <w:style w:type="table" w:styleId="MediumShading2-Accent3">
+  <w:style w:type="table" w:styleId="Sombreadomedio2-nfasis3">
     <w:name w:val="Medium Shading 2 Accent 3"/>
-    <w:basedOn w:val="TableNormal"/>
+    <w:basedOn w:val="Tablanormal"/>
     <w:uiPriority w:val="64"/>
     <w:rsid w:val="00CB0664"/>
     <w:pPr>
@@ -11862,9 +12611,9 @@
       </w:tcPr>
     </w:tblStylePr>
   </w:style>
-  <w:style w:type="table" w:styleId="MediumShading2-Accent4">
+  <w:style w:type="table" w:styleId="Sombreadomedio2-nfasis4">
     <w:name w:val="Medium Shading 2 Accent 4"/>
-    <w:basedOn w:val="TableNormal"/>
+    <w:basedOn w:val="Tablanormal"/>
     <w:uiPriority w:val="64"/>
     <w:rsid w:val="00CB0664"/>
     <w:pPr>
@@ -12004,9 +12753,9 @@
       </w:tcPr>
     </w:tblStylePr>
   </w:style>
-  <w:style w:type="table" w:styleId="MediumShading2-Accent5">
+  <w:style w:type="table" w:styleId="Sombreadomedio2-nfasis5">
     <w:name w:val="Medium Shading 2 Accent 5"/>
-    <w:basedOn w:val="TableNormal"/>
+    <w:basedOn w:val="Tablanormal"/>
     <w:uiPriority w:val="64"/>
     <w:rsid w:val="00CB0664"/>
     <w:pPr>
@@ -12146,9 +12895,9 @@
       </w:tcPr>
     </w:tblStylePr>
   </w:style>
-  <w:style w:type="table" w:styleId="MediumShading2-Accent6">
+  <w:style w:type="table" w:styleId="Sombreadomedio2-nfasis6">
     <w:name w:val="Medium Shading 2 Accent 6"/>
-    <w:basedOn w:val="TableNormal"/>
+    <w:basedOn w:val="Tablanormal"/>
     <w:uiPriority w:val="64"/>
     <w:rsid w:val="00CB0664"/>
     <w:pPr>
@@ -12288,9 +13037,9 @@
       </w:tcPr>
     </w:tblStylePr>
   </w:style>
-  <w:style w:type="table" w:styleId="MediumList1">
+  <w:style w:type="table" w:styleId="Listamedia1">
     <w:name w:val="Medium List 1"/>
-    <w:basedOn w:val="TableNormal"/>
+    <w:basedOn w:val="Tablanormal"/>
     <w:uiPriority w:val="65"/>
     <w:rsid w:val="00CB0664"/>
     <w:pPr>
@@ -12365,9 +13114,9 @@
       </w:tcPr>
     </w:tblStylePr>
   </w:style>
-  <w:style w:type="table" w:styleId="MediumList1-Accent1">
+  <w:style w:type="table" w:styleId="Listamedia1-nfasis1">
     <w:name w:val="Medium List 1 Accent 1"/>
-    <w:basedOn w:val="TableNormal"/>
+    <w:basedOn w:val="Tablanormal"/>
     <w:uiPriority w:val="65"/>
     <w:rsid w:val="00CB0664"/>
     <w:pPr>
@@ -12442,9 +13191,9 @@
       </w:tcPr>
     </w:tblStylePr>
   </w:style>
-  <w:style w:type="table" w:styleId="MediumList1-Accent2">
+  <w:style w:type="table" w:styleId="Listamedia1-nfasis2">
     <w:name w:val="Medium List 1 Accent 2"/>
-    <w:basedOn w:val="TableNormal"/>
+    <w:basedOn w:val="Tablanormal"/>
     <w:uiPriority w:val="65"/>
     <w:rsid w:val="00CB0664"/>
     <w:pPr>
@@ -12519,9 +13268,9 @@
       </w:tcPr>
     </w:tblStylePr>
   </w:style>
-  <w:style w:type="table" w:styleId="MediumList1-Accent3">
+  <w:style w:type="table" w:styleId="Listamedia1-nfasis3">
     <w:name w:val="Medium List 1 Accent 3"/>
-    <w:basedOn w:val="TableNormal"/>
+    <w:basedOn w:val="Tablanormal"/>
     <w:uiPriority w:val="65"/>
     <w:rsid w:val="00CB0664"/>
     <w:pPr>
@@ -12596,9 +13345,9 @@
       </w:tcPr>
     </w:tblStylePr>
   </w:style>
-  <w:style w:type="table" w:styleId="MediumList1-Accent4">
+  <w:style w:type="table" w:styleId="Listamedia1-nfasis4">
     <w:name w:val="Medium List 1 Accent 4"/>
-    <w:basedOn w:val="TableNormal"/>
+    <w:basedOn w:val="Tablanormal"/>
     <w:uiPriority w:val="65"/>
     <w:rsid w:val="00CB0664"/>
     <w:pPr>
@@ -12673,9 +13422,9 @@
       </w:tcPr>
     </w:tblStylePr>
   </w:style>
-  <w:style w:type="table" w:styleId="MediumList1-Accent5">
+  <w:style w:type="table" w:styleId="Listamedia1-nfasis5">
     <w:name w:val="Medium List 1 Accent 5"/>
-    <w:basedOn w:val="TableNormal"/>
+    <w:basedOn w:val="Tablanormal"/>
     <w:uiPriority w:val="65"/>
     <w:rsid w:val="00CB0664"/>
     <w:pPr>
@@ -12750,9 +13499,9 @@
       </w:tcPr>
     </w:tblStylePr>
   </w:style>
-  <w:style w:type="table" w:styleId="MediumList1-Accent6">
+  <w:style w:type="table" w:styleId="Listamedia1-nfasis6">
     <w:name w:val="Medium List 1 Accent 6"/>
-    <w:basedOn w:val="TableNormal"/>
+    <w:basedOn w:val="Tablanormal"/>
     <w:uiPriority w:val="65"/>
     <w:rsid w:val="00CB0664"/>
     <w:pPr>
@@ -12827,9 +13576,9 @@
       </w:tcPr>
     </w:tblStylePr>
   </w:style>
-  <w:style w:type="table" w:styleId="MediumList2">
+  <w:style w:type="table" w:styleId="Listamedia2">
     <w:name w:val="Medium List 2"/>
-    <w:basedOn w:val="TableNormal"/>
+    <w:basedOn w:val="Tablanormal"/>
     <w:uiPriority w:val="66"/>
     <w:rsid w:val="00CB0664"/>
     <w:pPr>
@@ -12948,9 +13697,9 @@
       </w:tcPr>
     </w:tblStylePr>
   </w:style>
-  <w:style w:type="table" w:styleId="MediumList2-Accent1">
+  <w:style w:type="table" w:styleId="Listamedia2-nfasis1">
     <w:name w:val="Medium List 2 Accent 1"/>
-    <w:basedOn w:val="TableNormal"/>
+    <w:basedOn w:val="Tablanormal"/>
     <w:uiPriority w:val="66"/>
     <w:rsid w:val="00CB0664"/>
     <w:pPr>
@@ -13069,9 +13818,9 @@
       </w:tcPr>
     </w:tblStylePr>
   </w:style>
-  <w:style w:type="table" w:styleId="MediumList2-Accent2">
+  <w:style w:type="table" w:styleId="Listamedia2-nfasis2">
     <w:name w:val="Medium List 2 Accent 2"/>
-    <w:basedOn w:val="TableNormal"/>
+    <w:basedOn w:val="Tablanormal"/>
     <w:uiPriority w:val="66"/>
     <w:rsid w:val="00CB0664"/>
     <w:pPr>
@@ -13190,9 +13939,9 @@
       </w:tcPr>
     </w:tblStylePr>
   </w:style>
-  <w:style w:type="table" w:styleId="MediumList2-Accent3">
+  <w:style w:type="table" w:styleId="Listamedia2-nfasis3">
     <w:name w:val="Medium List 2 Accent 3"/>
-    <w:basedOn w:val="TableNormal"/>
+    <w:basedOn w:val="Tablanormal"/>
     <w:uiPriority w:val="66"/>
     <w:rsid w:val="00CB0664"/>
     <w:pPr>
@@ -13311,9 +14060,9 @@
       </w:tcPr>
     </w:tblStylePr>
   </w:style>
-  <w:style w:type="table" w:styleId="MediumList2-Accent4">
+  <w:style w:type="table" w:styleId="Listamedia2-nfasis4">
     <w:name w:val="Medium List 2 Accent 4"/>
-    <w:basedOn w:val="TableNormal"/>
+    <w:basedOn w:val="Tablanormal"/>
     <w:uiPriority w:val="66"/>
     <w:rsid w:val="00CB0664"/>
     <w:pPr>
@@ -13432,9 +14181,9 @@
       </w:tcPr>
     </w:tblStylePr>
   </w:style>
-  <w:style w:type="table" w:styleId="MediumList2-Accent5">
+  <w:style w:type="table" w:styleId="Listamedia2-nfasis5">
     <w:name w:val="Medium List 2 Accent 5"/>
-    <w:basedOn w:val="TableNormal"/>
+    <w:basedOn w:val="Tablanormal"/>
     <w:uiPriority w:val="66"/>
     <w:rsid w:val="00CB0664"/>
     <w:pPr>
@@ -13553,9 +14302,9 @@
       </w:tcPr>
     </w:tblStylePr>
   </w:style>
-  <w:style w:type="table" w:styleId="MediumList2-Accent6">
+  <w:style w:type="table" w:styleId="Listamedia2-nfasis6">
     <w:name w:val="Medium List 2 Accent 6"/>
-    <w:basedOn w:val="TableNormal"/>
+    <w:basedOn w:val="Tablanormal"/>
     <w:uiPriority w:val="66"/>
     <w:rsid w:val="00CB0664"/>
     <w:pPr>
@@ -13674,9 +14423,9 @@
       </w:tcPr>
     </w:tblStylePr>
   </w:style>
-  <w:style w:type="table" w:styleId="MediumGrid1">
+  <w:style w:type="table" w:styleId="Cuadrculamedia1">
     <w:name w:val="Medium Grid 1"/>
-    <w:basedOn w:val="TableNormal"/>
+    <w:basedOn w:val="Tablanormal"/>
     <w:uiPriority w:val="67"/>
     <w:rsid w:val="00CB0664"/>
     <w:pPr>
@@ -13740,9 +14489,9 @@
       </w:tcPr>
     </w:tblStylePr>
   </w:style>
-  <w:style w:type="table" w:styleId="MediumGrid1-Accent1">
+  <w:style w:type="table" w:styleId="Cuadrculamedia1-nfasis1">
     <w:name w:val="Medium Grid 1 Accent 1"/>
-    <w:basedOn w:val="TableNormal"/>
+    <w:basedOn w:val="Tablanormal"/>
     <w:uiPriority w:val="67"/>
     <w:rsid w:val="00CB0664"/>
     <w:pPr>
@@ -13806,9 +14555,9 @@
       </w:tcPr>
     </w:tblStylePr>
   </w:style>
-  <w:style w:type="table" w:styleId="MediumGrid1-Accent2">
+  <w:style w:type="table" w:styleId="Cuadrculamedia1-nfasis2">
     <w:name w:val="Medium Grid 1 Accent 2"/>
-    <w:basedOn w:val="TableNormal"/>
+    <w:basedOn w:val="Tablanormal"/>
     <w:uiPriority w:val="67"/>
     <w:rsid w:val="00CB0664"/>
     <w:pPr>
@@ -13872,9 +14621,9 @@
       </w:tcPr>
     </w:tblStylePr>
   </w:style>
-  <w:style w:type="table" w:styleId="MediumGrid1-Accent3">
+  <w:style w:type="table" w:styleId="Cuadrculamedia1-nfasis3">
     <w:name w:val="Medium Grid 1 Accent 3"/>
-    <w:basedOn w:val="TableNormal"/>
+    <w:basedOn w:val="Tablanormal"/>
     <w:uiPriority w:val="67"/>
     <w:rsid w:val="00CB0664"/>
     <w:pPr>
@@ -13938,9 +14687,9 @@
       </w:tcPr>
     </w:tblStylePr>
   </w:style>
-  <w:style w:type="table" w:styleId="MediumGrid1-Accent4">
+  <w:style w:type="table" w:styleId="Cuadrculamedia1-nfasis4">
     <w:name w:val="Medium Grid 1 Accent 4"/>
-    <w:basedOn w:val="TableNormal"/>
+    <w:basedOn w:val="Tablanormal"/>
     <w:uiPriority w:val="67"/>
     <w:rsid w:val="00CB0664"/>
     <w:pPr>
@@ -14004,9 +14753,9 @@
       </w:tcPr>
     </w:tblStylePr>
   </w:style>
-  <w:style w:type="table" w:styleId="MediumGrid1-Accent5">
+  <w:style w:type="table" w:styleId="Cuadrculamedia1-nfasis5">
     <w:name w:val="Medium Grid 1 Accent 5"/>
-    <w:basedOn w:val="TableNormal"/>
+    <w:basedOn w:val="Tablanormal"/>
     <w:uiPriority w:val="67"/>
     <w:rsid w:val="00CB0664"/>
     <w:pPr>
@@ -14070,9 +14819,9 @@
       </w:tcPr>
     </w:tblStylePr>
   </w:style>
-  <w:style w:type="table" w:styleId="MediumGrid1-Accent6">
+  <w:style w:type="table" w:styleId="Cuadrculamedia1-nfasis6">
     <w:name w:val="Medium Grid 1 Accent 6"/>
-    <w:basedOn w:val="TableNormal"/>
+    <w:basedOn w:val="Tablanormal"/>
     <w:uiPriority w:val="67"/>
     <w:rsid w:val="00CB0664"/>
     <w:pPr>
@@ -14136,9 +14885,9 @@
       </w:tcPr>
     </w:tblStylePr>
   </w:style>
-  <w:style w:type="table" w:styleId="MediumGrid2">
+  <w:style w:type="table" w:styleId="Cuadrculamedia2">
     <w:name w:val="Medium Grid 2"/>
-    <w:basedOn w:val="TableNormal"/>
+    <w:basedOn w:val="Tablanormal"/>
     <w:uiPriority w:val="68"/>
     <w:rsid w:val="00CB0664"/>
     <w:pPr>
@@ -14254,9 +15003,9 @@
       </w:tcPr>
     </w:tblStylePr>
   </w:style>
-  <w:style w:type="table" w:styleId="MediumGrid2-Accent1">
+  <w:style w:type="table" w:styleId="Cuadrculamedia2-nfasis1">
     <w:name w:val="Medium Grid 2 Accent 1"/>
-    <w:basedOn w:val="TableNormal"/>
+    <w:basedOn w:val="Tablanormal"/>
     <w:uiPriority w:val="68"/>
     <w:rsid w:val="00CB0664"/>
     <w:pPr>
@@ -14372,9 +15121,9 @@
       </w:tcPr>
     </w:tblStylePr>
   </w:style>
-  <w:style w:type="table" w:styleId="MediumGrid2-Accent2">
+  <w:style w:type="table" w:styleId="Cuadrculamedia2-nfasis2">
     <w:name w:val="Medium Grid 2 Accent 2"/>
-    <w:basedOn w:val="TableNormal"/>
+    <w:basedOn w:val="Tablanormal"/>
     <w:uiPriority w:val="68"/>
     <w:rsid w:val="00CB0664"/>
     <w:pPr>
@@ -14490,9 +15239,9 @@
       </w:tcPr>
     </w:tblStylePr>
   </w:style>
-  <w:style w:type="table" w:styleId="MediumGrid2-Accent3">
+  <w:style w:type="table" w:styleId="Cuadrculamedia2-nfasis3">
     <w:name w:val="Medium Grid 2 Accent 3"/>
-    <w:basedOn w:val="TableNormal"/>
+    <w:basedOn w:val="Tablanormal"/>
     <w:uiPriority w:val="68"/>
     <w:rsid w:val="00CB0664"/>
     <w:pPr>
@@ -14608,9 +15357,9 @@
       </w:tcPr>
     </w:tblStylePr>
   </w:style>
-  <w:style w:type="table" w:styleId="MediumGrid2-Accent4">
+  <w:style w:type="table" w:styleId="Cuadrculamedia2-nfasis4">
     <w:name w:val="Medium Grid 2 Accent 4"/>
-    <w:basedOn w:val="TableNormal"/>
+    <w:basedOn w:val="Tablanormal"/>
     <w:uiPriority w:val="68"/>
     <w:rsid w:val="00CB0664"/>
     <w:pPr>
@@ -14726,9 +15475,9 @@
       </w:tcPr>
     </w:tblStylePr>
   </w:style>
-  <w:style w:type="table" w:styleId="MediumGrid2-Accent5">
+  <w:style w:type="table" w:styleId="Cuadrculamedia2-nfasis5">
     <w:name w:val="Medium Grid 2 Accent 5"/>
-    <w:basedOn w:val="TableNormal"/>
+    <w:basedOn w:val="Tablanormal"/>
     <w:uiPriority w:val="68"/>
     <w:rsid w:val="00CB0664"/>
     <w:pPr>
@@ -14844,9 +15593,9 @@
       </w:tcPr>
     </w:tblStylePr>
   </w:style>
-  <w:style w:type="table" w:styleId="MediumGrid2-Accent6">
+  <w:style w:type="table" w:styleId="Cuadrculamedia2-nfasis6">
     <w:name w:val="Medium Grid 2 Accent 6"/>
-    <w:basedOn w:val="TableNormal"/>
+    <w:basedOn w:val="Tablanormal"/>
     <w:uiPriority w:val="68"/>
     <w:rsid w:val="00CB0664"/>
     <w:pPr>
@@ -14962,9 +15711,9 @@
       </w:tcPr>
     </w:tblStylePr>
   </w:style>
-  <w:style w:type="table" w:styleId="MediumGrid3">
+  <w:style w:type="table" w:styleId="Cuadrculamedia3">
     <w:name w:val="Medium Grid 3"/>
-    <w:basedOn w:val="TableNormal"/>
+    <w:basedOn w:val="Tablanormal"/>
     <w:uiPriority w:val="69"/>
     <w:rsid w:val="00CB0664"/>
     <w:pPr>
@@ -15096,9 +15845,9 @@
       </w:tcPr>
     </w:tblStylePr>
   </w:style>
-  <w:style w:type="table" w:styleId="MediumGrid3-Accent1">
+  <w:style w:type="table" w:styleId="Cuadrculamedia3-nfasis1">
     <w:name w:val="Medium Grid 3 Accent 1"/>
-    <w:basedOn w:val="TableNormal"/>
+    <w:basedOn w:val="Tablanormal"/>
     <w:uiPriority w:val="69"/>
     <w:rsid w:val="00CB0664"/>
     <w:pPr>
@@ -15230,9 +15979,9 @@
       </w:tcPr>
     </w:tblStylePr>
   </w:style>
-  <w:style w:type="table" w:styleId="MediumGrid3-Accent2">
+  <w:style w:type="table" w:styleId="Cuadrculamedia3-nfasis2">
     <w:name w:val="Medium Grid 3 Accent 2"/>
-    <w:basedOn w:val="TableNormal"/>
+    <w:basedOn w:val="Tablanormal"/>
     <w:uiPriority w:val="69"/>
     <w:rsid w:val="00CB0664"/>
     <w:pPr>
@@ -15364,9 +16113,9 @@
       </w:tcPr>
     </w:tblStylePr>
   </w:style>
-  <w:style w:type="table" w:styleId="MediumGrid3-Accent3">
+  <w:style w:type="table" w:styleId="Cuadrculamedia3-nfasis3">
     <w:name w:val="Medium Grid 3 Accent 3"/>
-    <w:basedOn w:val="TableNormal"/>
+    <w:basedOn w:val="Tablanormal"/>
     <w:uiPriority w:val="69"/>
     <w:rsid w:val="00CB0664"/>
     <w:pPr>
@@ -15498,9 +16247,9 @@
       </w:tcPr>
     </w:tblStylePr>
   </w:style>
-  <w:style w:type="table" w:styleId="MediumGrid3-Accent4">
+  <w:style w:type="table" w:styleId="Cuadrculamedia3-nfasis4">
     <w:name w:val="Medium Grid 3 Accent 4"/>
-    <w:basedOn w:val="TableNormal"/>
+    <w:basedOn w:val="Tablanormal"/>
     <w:uiPriority w:val="69"/>
     <w:rsid w:val="00CB0664"/>
     <w:pPr>
@@ -15632,9 +16381,9 @@
       </w:tcPr>
     </w:tblStylePr>
   </w:style>
-  <w:style w:type="table" w:styleId="MediumGrid3-Accent5">
+  <w:style w:type="table" w:styleId="Cuadrculamedia3-nfasis5">
     <w:name w:val="Medium Grid 3 Accent 5"/>
-    <w:basedOn w:val="TableNormal"/>
+    <w:basedOn w:val="Tablanormal"/>
     <w:uiPriority w:val="69"/>
     <w:rsid w:val="00CB0664"/>
     <w:pPr>
@@ -15766,9 +16515,9 @@
       </w:tcPr>
     </w:tblStylePr>
   </w:style>
-  <w:style w:type="table" w:styleId="MediumGrid3-Accent6">
+  <w:style w:type="table" w:styleId="Cuadrculamedia3-nfasis6">
     <w:name w:val="Medium Grid 3 Accent 6"/>
-    <w:basedOn w:val="TableNormal"/>
+    <w:basedOn w:val="Tablanormal"/>
     <w:uiPriority w:val="69"/>
     <w:rsid w:val="00CB0664"/>
     <w:pPr>
@@ -15900,9 +16649,9 @@
       </w:tcPr>
     </w:tblStylePr>
   </w:style>
-  <w:style w:type="table" w:styleId="DarkList">
+  <w:style w:type="table" w:styleId="Listaoscura">
     <w:name w:val="Dark List"/>
-    <w:basedOn w:val="TableNormal"/>
+    <w:basedOn w:val="Tablanormal"/>
     <w:uiPriority w:val="70"/>
     <w:rsid w:val="00CB0664"/>
     <w:pPr>
@@ -16007,9 +16756,9 @@
       </w:tcPr>
     </w:tblStylePr>
   </w:style>
-  <w:style w:type="table" w:styleId="DarkList-Accent1">
+  <w:style w:type="table" w:styleId="Listaoscura-nfasis1">
     <w:name w:val="Dark List Accent 1"/>
-    <w:basedOn w:val="TableNormal"/>
+    <w:basedOn w:val="Tablanormal"/>
     <w:uiPriority w:val="70"/>
     <w:rsid w:val="00CB0664"/>
     <w:pPr>
@@ -16114,9 +16863,9 @@
       </w:tcPr>
     </w:tblStylePr>
   </w:style>
-  <w:style w:type="table" w:styleId="DarkList-Accent2">
+  <w:style w:type="table" w:styleId="Listaoscura-nfasis2">
     <w:name w:val="Dark List Accent 2"/>
-    <w:basedOn w:val="TableNormal"/>
+    <w:basedOn w:val="Tablanormal"/>
     <w:uiPriority w:val="70"/>
     <w:rsid w:val="00CB0664"/>
     <w:pPr>
@@ -16221,9 +16970,9 @@
       </w:tcPr>
     </w:tblStylePr>
   </w:style>
-  <w:style w:type="table" w:styleId="DarkList-Accent3">
+  <w:style w:type="table" w:styleId="Listaoscura-nfasis3">
     <w:name w:val="Dark List Accent 3"/>
-    <w:basedOn w:val="TableNormal"/>
+    <w:basedOn w:val="Tablanormal"/>
     <w:uiPriority w:val="70"/>
     <w:rsid w:val="00CB0664"/>
     <w:pPr>
@@ -16328,9 +17077,9 @@
       </w:tcPr>
     </w:tblStylePr>
   </w:style>
-  <w:style w:type="table" w:styleId="DarkList-Accent4">
+  <w:style w:type="table" w:styleId="Listaoscura-nfasis4">
     <w:name w:val="Dark List Accent 4"/>
-    <w:basedOn w:val="TableNormal"/>
+    <w:basedOn w:val="Tablanormal"/>
     <w:uiPriority w:val="70"/>
     <w:rsid w:val="00CB0664"/>
     <w:pPr>
@@ -16435,9 +17184,9 @@
       </w:tcPr>
     </w:tblStylePr>
   </w:style>
-  <w:style w:type="table" w:styleId="DarkList-Accent5">
+  <w:style w:type="table" w:styleId="Listaoscura-nfasis5">
     <w:name w:val="Dark List Accent 5"/>
-    <w:basedOn w:val="TableNormal"/>
+    <w:basedOn w:val="Tablanormal"/>
     <w:uiPriority w:val="70"/>
     <w:rsid w:val="00CB0664"/>
     <w:pPr>
@@ -16542,9 +17291,9 @@
       </w:tcPr>
     </w:tblStylePr>
   </w:style>
-  <w:style w:type="table" w:styleId="DarkList-Accent6">
+  <w:style w:type="table" w:styleId="Listaoscura-nfasis6">
     <w:name w:val="Dark List Accent 6"/>
-    <w:basedOn w:val="TableNormal"/>
+    <w:basedOn w:val="Tablanormal"/>
     <w:uiPriority w:val="70"/>
     <w:rsid w:val="00CB0664"/>
     <w:pPr>
@@ -16649,9 +17398,9 @@
       </w:tcPr>
     </w:tblStylePr>
   </w:style>
-  <w:style w:type="table" w:styleId="ColorfulShading">
+  <w:style w:type="table" w:styleId="Sombreadovistoso">
     <w:name w:val="Colorful Shading"/>
-    <w:basedOn w:val="TableNormal"/>
+    <w:basedOn w:val="Tablanormal"/>
     <w:uiPriority w:val="71"/>
     <w:rsid w:val="00CB0664"/>
     <w:pPr>
@@ -16764,9 +17513,9 @@
       </w:rPr>
     </w:tblStylePr>
   </w:style>
-  <w:style w:type="table" w:styleId="ColorfulShading-Accent1">
+  <w:style w:type="table" w:styleId="Sombreadovistoso-nfasis1">
     <w:name w:val="Colorful Shading Accent 1"/>
-    <w:basedOn w:val="TableNormal"/>
+    <w:basedOn w:val="Tablanormal"/>
     <w:uiPriority w:val="71"/>
     <w:rsid w:val="00CB0664"/>
     <w:pPr>
@@ -16879,9 +17628,9 @@
       </w:rPr>
     </w:tblStylePr>
   </w:style>
-  <w:style w:type="table" w:styleId="ColorfulShading-Accent2">
+  <w:style w:type="table" w:styleId="Sombreadovistoso-nfasis2">
     <w:name w:val="Colorful Shading Accent 2"/>
-    <w:basedOn w:val="TableNormal"/>
+    <w:basedOn w:val="Tablanormal"/>
     <w:uiPriority w:val="71"/>
     <w:rsid w:val="00CB0664"/>
     <w:pPr>
@@ -16994,9 +17743,9 @@
       </w:rPr>
     </w:tblStylePr>
   </w:style>
-  <w:style w:type="table" w:styleId="ColorfulShading-Accent3">
+  <w:style w:type="table" w:styleId="Sombreadovistoso-nfasis3">
     <w:name w:val="Colorful Shading Accent 3"/>
-    <w:basedOn w:val="TableNormal"/>
+    <w:basedOn w:val="Tablanormal"/>
     <w:uiPriority w:val="71"/>
     <w:rsid w:val="00CB0664"/>
     <w:pPr>
@@ -17099,9 +17848,9 @@
       </w:tcPr>
     </w:tblStylePr>
   </w:style>
-  <w:style w:type="table" w:styleId="ColorfulShading-Accent4">
+  <w:style w:type="table" w:styleId="Sombreadovistoso-nfasis4">
     <w:name w:val="Colorful Shading Accent 4"/>
-    <w:basedOn w:val="TableNormal"/>
+    <w:basedOn w:val="Tablanormal"/>
     <w:uiPriority w:val="71"/>
     <w:rsid w:val="00CB0664"/>
     <w:pPr>
@@ -17214,9 +17963,9 @@
       </w:rPr>
     </w:tblStylePr>
   </w:style>
-  <w:style w:type="table" w:styleId="ColorfulShading-Accent5">
+  <w:style w:type="table" w:styleId="Sombreadovistoso-nfasis5">
     <w:name w:val="Colorful Shading Accent 5"/>
-    <w:basedOn w:val="TableNormal"/>
+    <w:basedOn w:val="Tablanormal"/>
     <w:uiPriority w:val="71"/>
     <w:rsid w:val="00CB0664"/>
     <w:pPr>
@@ -17329,9 +18078,9 @@
       </w:rPr>
     </w:tblStylePr>
   </w:style>
-  <w:style w:type="table" w:styleId="ColorfulShading-Accent6">
+  <w:style w:type="table" w:styleId="Sombreadovistoso-nfasis6">
     <w:name w:val="Colorful Shading Accent 6"/>
-    <w:basedOn w:val="TableNormal"/>
+    <w:basedOn w:val="Tablanormal"/>
     <w:uiPriority w:val="71"/>
     <w:rsid w:val="00CB0664"/>
     <w:pPr>
@@ -17444,9 +18193,9 @@
       </w:rPr>
     </w:tblStylePr>
   </w:style>
-  <w:style w:type="table" w:styleId="ColorfulList">
+  <w:style w:type="table" w:styleId="Listavistosa">
     <w:name w:val="Colorful List"/>
-    <w:basedOn w:val="TableNormal"/>
+    <w:basedOn w:val="Tablanormal"/>
     <w:uiPriority w:val="72"/>
     <w:rsid w:val="00CB0664"/>
     <w:pPr>
@@ -17523,9 +18272,9 @@
       </w:tcPr>
     </w:tblStylePr>
   </w:style>
-  <w:style w:type="table" w:styleId="ColorfulList-Accent1">
+  <w:style w:type="table" w:styleId="Listavistosa-nfasis1">
     <w:name w:val="Colorful List Accent 1"/>
-    <w:basedOn w:val="TableNormal"/>
+    <w:basedOn w:val="Tablanormal"/>
     <w:uiPriority w:val="72"/>
     <w:rsid w:val="00CB0664"/>
     <w:pPr>
@@ -17602,9 +18351,9 @@
       </w:tcPr>
     </w:tblStylePr>
   </w:style>
-  <w:style w:type="table" w:styleId="ColorfulList-Accent2">
+  <w:style w:type="table" w:styleId="Listavistosa-nfasis2">
     <w:name w:val="Colorful List Accent 2"/>
-    <w:basedOn w:val="TableNormal"/>
+    <w:basedOn w:val="Tablanormal"/>
     <w:uiPriority w:val="72"/>
     <w:rsid w:val="00CB0664"/>
     <w:pPr>
@@ -17681,9 +18430,9 @@
       </w:tcPr>
     </w:tblStylePr>
   </w:style>
-  <w:style w:type="table" w:styleId="ColorfulList-Accent3">
+  <w:style w:type="table" w:styleId="Listavistosa-nfasis3">
     <w:name w:val="Colorful List Accent 3"/>
-    <w:basedOn w:val="TableNormal"/>
+    <w:basedOn w:val="Tablanormal"/>
     <w:uiPriority w:val="72"/>
     <w:rsid w:val="00CB0664"/>
     <w:pPr>
@@ -17760,9 +18509,9 @@
       </w:tcPr>
     </w:tblStylePr>
   </w:style>
-  <w:style w:type="table" w:styleId="ColorfulList-Accent4">
+  <w:style w:type="table" w:styleId="Listavistosa-nfasis4">
     <w:name w:val="Colorful List Accent 4"/>
-    <w:basedOn w:val="TableNormal"/>
+    <w:basedOn w:val="Tablanormal"/>
     <w:uiPriority w:val="72"/>
     <w:rsid w:val="00CB0664"/>
     <w:pPr>
@@ -17839,9 +18588,9 @@
       </w:tcPr>
     </w:tblStylePr>
   </w:style>
-  <w:style w:type="table" w:styleId="ColorfulList-Accent5">
+  <w:style w:type="table" w:styleId="Listavistosa-nfasis5">
     <w:name w:val="Colorful List Accent 5"/>
-    <w:basedOn w:val="TableNormal"/>
+    <w:basedOn w:val="Tablanormal"/>
     <w:uiPriority w:val="72"/>
     <w:rsid w:val="00CB0664"/>
     <w:pPr>
@@ -17918,9 +18667,9 @@
       </w:tcPr>
     </w:tblStylePr>
   </w:style>
-  <w:style w:type="table" w:styleId="ColorfulList-Accent6">
+  <w:style w:type="table" w:styleId="Listavistosa-nfasis6">
     <w:name w:val="Colorful List Accent 6"/>
-    <w:basedOn w:val="TableNormal"/>
+    <w:basedOn w:val="Tablanormal"/>
     <w:uiPriority w:val="72"/>
     <w:rsid w:val="00CB0664"/>
     <w:pPr>
@@ -17997,9 +18746,9 @@
       </w:tcPr>
     </w:tblStylePr>
   </w:style>
-  <w:style w:type="table" w:styleId="ColorfulGrid">
+  <w:style w:type="table" w:styleId="Cuadrculavistosa">
     <w:name w:val="Colorful Grid"/>
-    <w:basedOn w:val="TableNormal"/>
+    <w:basedOn w:val="Tablanormal"/>
     <w:uiPriority w:val="73"/>
     <w:rsid w:val="00CB0664"/>
     <w:pPr>
@@ -18070,9 +18819,9 @@
       </w:tcPr>
     </w:tblStylePr>
   </w:style>
-  <w:style w:type="table" w:styleId="ColorfulGrid-Accent1">
+  <w:style w:type="table" w:styleId="Cuadrculavistosa-nfasis1">
     <w:name w:val="Colorful Grid Accent 1"/>
-    <w:basedOn w:val="TableNormal"/>
+    <w:basedOn w:val="Tablanormal"/>
     <w:uiPriority w:val="73"/>
     <w:rsid w:val="00CB0664"/>
     <w:pPr>
@@ -18143,9 +18892,9 @@
       </w:tcPr>
     </w:tblStylePr>
   </w:style>
-  <w:style w:type="table" w:styleId="ColorfulGrid-Accent2">
+  <w:style w:type="table" w:styleId="Cuadrculavistosa-nfasis2">
     <w:name w:val="Colorful Grid Accent 2"/>
-    <w:basedOn w:val="TableNormal"/>
+    <w:basedOn w:val="Tablanormal"/>
     <w:uiPriority w:val="73"/>
     <w:rsid w:val="00CB0664"/>
     <w:pPr>
@@ -18216,9 +18965,9 @@
       </w:tcPr>
     </w:tblStylePr>
   </w:style>
-  <w:style w:type="table" w:styleId="ColorfulGrid-Accent3">
+  <w:style w:type="table" w:styleId="Cuadrculavistosa-nfasis3">
     <w:name w:val="Colorful Grid Accent 3"/>
-    <w:basedOn w:val="TableNormal"/>
+    <w:basedOn w:val="Tablanormal"/>
     <w:uiPriority w:val="73"/>
     <w:rsid w:val="00CB0664"/>
     <w:pPr>
@@ -18289,9 +19038,9 @@
       </w:tcPr>
     </w:tblStylePr>
   </w:style>
-  <w:style w:type="table" w:styleId="ColorfulGrid-Accent4">
+  <w:style w:type="table" w:styleId="Cuadrculavistosa-nfasis4">
     <w:name w:val="Colorful Grid Accent 4"/>
-    <w:basedOn w:val="TableNormal"/>
+    <w:basedOn w:val="Tablanormal"/>
     <w:uiPriority w:val="73"/>
     <w:rsid w:val="00CB0664"/>
     <w:pPr>
@@ -18362,9 +19111,9 @@
       </w:tcPr>
     </w:tblStylePr>
   </w:style>
-  <w:style w:type="table" w:styleId="ColorfulGrid-Accent5">
+  <w:style w:type="table" w:styleId="Cuadrculavistosa-nfasis5">
     <w:name w:val="Colorful Grid Accent 5"/>
-    <w:basedOn w:val="TableNormal"/>
+    <w:basedOn w:val="Tablanormal"/>
     <w:uiPriority w:val="73"/>
     <w:rsid w:val="00CB0664"/>
     <w:pPr>
@@ -18435,9 +19184,9 @@
       </w:tcPr>
     </w:tblStylePr>
   </w:style>
-  <w:style w:type="table" w:styleId="ColorfulGrid-Accent6">
+  <w:style w:type="table" w:styleId="Cuadrculavistosa-nfasis6">
     <w:name w:val="Colorful Grid Accent 6"/>
-    <w:basedOn w:val="TableNormal"/>
+    <w:basedOn w:val="Tablanormal"/>
     <w:uiPriority w:val="73"/>
     <w:rsid w:val="00CB0664"/>
     <w:pPr>
@@ -18507,6 +19256,29 @@
         <w:shd w:val="clear" w:color="auto" w:fill="FBCAA2" w:themeFill="accent6" w:themeFillTint="7F"/>
       </w:tcPr>
     </w:tblStylePr>
+  </w:style>
+  <w:style w:type="character" w:styleId="Hipervnculo">
+    <w:name w:val="Hyperlink"/>
+    <w:basedOn w:val="Fuentedeprrafopredeter"/>
+    <w:uiPriority w:val="99"/>
+    <w:unhideWhenUsed/>
+    <w:rsid w:val="00C359E7"/>
+    <w:rPr>
+      <w:color w:val="0000FF" w:themeColor="hyperlink"/>
+      <w:u w:val="single"/>
+    </w:rPr>
+  </w:style>
+  <w:style w:type="character" w:styleId="Mencinsinresolver">
+    <w:name w:val="Unresolved Mention"/>
+    <w:basedOn w:val="Fuentedeprrafopredeter"/>
+    <w:uiPriority w:val="99"/>
+    <w:semiHidden/>
+    <w:unhideWhenUsed/>
+    <w:rsid w:val="00C359E7"/>
+    <w:rPr>
+      <w:color w:val="605E5C"/>
+      <w:shd w:val="clear" w:color="auto" w:fill="E1DFDD"/>
+    </w:rPr>
   </w:style>
 </w:styles>
 </file>

</xml_diff>